<commit_message>
Rebuild SAGIP entry on official templates in place with added background studies (2,338 words); move prior versions to old_versions
Co-Authored-By: Claude Sonnet 5.5 <noreply@anthropic.com>
Claude-Session: https://claude.ai/code/session_01BeuSv6ZfopDpEFLv7nhPKY
</commit_message>
<xml_diff>
--- a/sft_entry/SAGIP_SFT2026_Proposal.docx
+++ b/sft_entry/SAGIP_SFT2026_Proposal.docx
@@ -2,6 +2,17 @@
 <file path=word/document.xml><?xml version="1.0" encoding="utf-8"?>
 <w:document xmlns:mc="http://schemas.openxmlformats.org/markup-compatibility/2006" xmlns:o="urn:schemas-microsoft-com:office:office" xmlns:r="http://schemas.openxmlformats.org/officeDocument/2006/relationships" xmlns:m="http://schemas.openxmlformats.org/officeDocument/2006/math" xmlns:v="urn:schemas-microsoft-com:vml" xmlns:wp="http://schemas.openxmlformats.org/drawingml/2006/wordprocessingDrawing" xmlns:w10="urn:schemas-microsoft-com:office:word" xmlns:w="http://schemas.openxmlformats.org/wordprocessingml/2006/main" xmlns:wne="http://schemas.microsoft.com/office/word/2006/wordml" xmlns:sl="http://schemas.openxmlformats.org/schemaLibrary/2006/main" xmlns:a="http://schemas.openxmlformats.org/drawingml/2006/main" xmlns:pic="http://schemas.openxmlformats.org/drawingml/2006/picture" xmlns:c="http://schemas.openxmlformats.org/drawingml/2006/chart" xmlns:lc="http://schemas.openxmlformats.org/drawingml/2006/lockedCanvas" xmlns:dgm="http://schemas.openxmlformats.org/drawingml/2006/diagram" xmlns:wps="http://schemas.microsoft.com/office/word/2010/wordprocessingShape" xmlns:wpg="http://schemas.microsoft.com/office/word/2010/wordprocessingGroup" xmlns:w14="http://schemas.microsoft.com/office/word/2010/wordml" xmlns:w15="http://schemas.microsoft.com/office/word/2012/wordml" xmlns:w16="http://schemas.microsoft.com/office/word/2018/wordml" xmlns:w16cex="http://schemas.microsoft.com/office/word/2018/wordml/cex" xmlns:w16cid="http://schemas.microsoft.com/office/word/2016/wordml/cid" xmlns="http://schemas.microsoft.com/office/tasks/2019/documenttasks" xmlns:cr="http://schemas.microsoft.com/office/comments/2020/reactions">
   <w:body>
+    <w:p>
+      <w:pPr>
+        <w:rPr/>
+      </w:pPr>
+      <w:r>
+        <w:rPr>
+          <w:rtl w:val="0"/>
+        </w:rPr>
+        <w:t xml:space="preserve">                                       </w:t>
+      </w:r>
+    </w:p>
     <w:tbl>
       <w:tblPr>
         <w:tblStyle w:val="Table1"/>
@@ -68,18 +79,15 @@
             </w:pPr>
             <w:r>
               <w:rPr>
-                <w:rFonts w:ascii="Arial" w:hAnsi="Arial" w:eastAsia="Arial"/>
-                <w:b/>
+                <w:b w:val="1"/>
                 <w:bCs w:val="1"/>
-                <w:sz w:val="22"/>
                 <w:rtl w:val="0"/>
               </w:rPr>
               <w:t xml:space="preserve">Entrant’s school:</w:t>
             </w:r>
             <w:r>
               <w:rPr>
-                <w:rFonts w:ascii="Arial" w:hAnsi="Arial" w:eastAsia="Arial"/>
-                <w:sz w:val="22"/>
+                <w:b w:val="0"/>
               </w:rPr>
               <w:t xml:space="preserve"> Quezon City Science High School</w:t>
             </w:r>
@@ -107,18 +115,15 @@
             </w:pPr>
             <w:r>
               <w:rPr>
-                <w:rFonts w:ascii="Arial" w:hAnsi="Arial" w:eastAsia="Arial"/>
-                <w:b/>
+                <w:b w:val="1"/>
                 <w:bCs w:val="1"/>
-                <w:sz w:val="22"/>
                 <w:rtl w:val="0"/>
               </w:rPr>
               <w:t xml:space="preserve">Adviser’s Name:</w:t>
             </w:r>
             <w:r>
               <w:rPr>
-                <w:rFonts w:ascii="Arial" w:hAnsi="Arial" w:eastAsia="Arial"/>
-                <w:sz w:val="22"/>
+                <w:b w:val="0"/>
               </w:rPr>
               <w:t xml:space="preserve"> Skjoukje U. Jemoya</w:t>
             </w:r>
@@ -166,20 +171,16 @@
             </w:pPr>
             <w:r>
               <w:rPr>
-                <w:rFonts w:ascii="Arial" w:hAnsi="Arial" w:eastAsia="Arial"/>
-                <w:b/>
+                <w:b w:val="1"/>
                 <w:bCs w:val="1"/>
-                <w:sz w:val="22"/>
                 <w:rtl w:val="0"/>
               </w:rPr>
               <w:t xml:space="preserve">Name of Team Members:</w:t>
             </w:r>
             <w:r>
               <w:rPr>
-                <w:rFonts w:ascii="Arial" w:hAnsi="Arial" w:eastAsia="Arial"/>
-                <w:b/>
+                <w:b w:val="1"/>
                 <w:bCs w:val="1"/>
-                <w:sz w:val="22"/>
                 <w:rtl w:val="0"/>
               </w:rPr>
               <w:br w:type="textWrapping"/>
@@ -187,38 +188,22 @@
           </w:p>
           <w:p>
             <w:r>
-              <w:rPr>
-                <w:rFonts w:ascii="Arial" w:hAnsi="Arial" w:eastAsia="Arial"/>
-                <w:sz w:val="22"/>
-              </w:rPr>
-              <w:t>1. Aaron Jed E. Campo, Grade 10</w:t>
-            </w:r>
-          </w:p>
-          <w:p>
-            <w:r>
-              <w:rPr>
-                <w:rFonts w:ascii="Arial" w:hAnsi="Arial" w:eastAsia="Arial"/>
-                <w:sz w:val="22"/>
-              </w:rPr>
-              <w:t>2. Raya Kalayaan R. Amparo, Grade 10</w:t>
-            </w:r>
-          </w:p>
-          <w:p>
-            <w:r>
-              <w:rPr>
-                <w:rFonts w:ascii="Arial" w:hAnsi="Arial" w:eastAsia="Arial"/>
-                <w:sz w:val="22"/>
-              </w:rPr>
-              <w:t>3. Ayeza Leigh F. Delos Santos, Grade 10</w:t>
-            </w:r>
-          </w:p>
-          <w:p>
-            <w:r>
-              <w:rPr>
-                <w:rFonts w:ascii="Arial" w:hAnsi="Arial" w:eastAsia="Arial"/>
-                <w:sz w:val="22"/>
-              </w:rPr>
-              <w:t>4. Sophia Laureen A. Tado, Grade 10</w:t>
+              <w:t>1. Aaron Jed E. Campo</w:t>
+            </w:r>
+          </w:p>
+          <w:p>
+            <w:r>
+              <w:t>2. Raya Kalayaan R. Amparo</w:t>
+            </w:r>
+          </w:p>
+          <w:p>
+            <w:r>
+              <w:t>3. Ayeza Leigh F. Delos Santos</w:t>
+            </w:r>
+          </w:p>
+          <w:p>
+            <w:r>
+              <w:t>4. Sophia Laureen A. Tado</w:t>
             </w:r>
           </w:p>
         </w:tc>
@@ -257,20 +242,31 @@
             </w:pPr>
             <w:r>
               <w:rPr>
-                <w:rFonts w:ascii="Arial" w:hAnsi="Arial" w:eastAsia="Arial"/>
-                <w:b/>
+                <w:b w:val="1"/>
                 <w:bCs w:val="1"/>
-                <w:sz w:val="22"/>
                 <w:rtl w:val="0"/>
               </w:rPr>
               <w:t xml:space="preserve">Grade Level per member: </w:t>
             </w:r>
-            <w:r>
-              <w:rPr>
-                <w:rFonts w:ascii="Arial" w:hAnsi="Arial" w:eastAsia="Arial"/>
-                <w:sz w:val="22"/>
-              </w:rPr>
-              <w:t xml:space="preserve"> Grade 10 (all members)</w:t>
+          </w:p>
+          <w:p>
+            <w:r>
+              <w:t>1. Grade 10</w:t>
+            </w:r>
+          </w:p>
+          <w:p>
+            <w:r>
+              <w:t>2. Grade 10</w:t>
+            </w:r>
+          </w:p>
+          <w:p>
+            <w:r>
+              <w:t>3. Grade 10</w:t>
+            </w:r>
+          </w:p>
+          <w:p>
+            <w:r>
+              <w:t>4. Grade 10</w:t>
             </w:r>
           </w:p>
         </w:tc>
@@ -353,18 +349,11 @@
             </w:pPr>
             <w:r>
               <w:rPr>
-                <w:b w:val="1"/>
+                <w:b/>
                 <w:bCs w:val="1"/>
                 <w:rtl w:val="0"/>
               </w:rPr>
-            </w:r>
-            <w:r>
-              <w:rPr>
-                <w:rFonts w:ascii="Arial" w:hAnsi="Arial" w:eastAsia="Arial"/>
-                <w:b/>
-                <w:sz w:val="22"/>
-              </w:rPr>
-              <w:t>Environmental Sustainability through Technology  ✔ (chosen)</w:t>
+              <w:t xml:space="preserve">Environmental Sustainability through Technology</w:t>
             </w:r>
           </w:p>
         </w:tc>
@@ -411,10 +400,8 @@
             </w:pPr>
             <w:r>
               <w:rPr>
-                <w:rFonts w:ascii="Arial" w:hAnsi="Arial" w:eastAsia="Arial"/>
-                <w:b/>
+                <w:b w:val="1"/>
                 <w:bCs w:val="1"/>
-                <w:sz w:val="22"/>
                 <w:rtl w:val="0"/>
               </w:rPr>
               <w:t xml:space="preserve">Entry Title:</w:t>
@@ -426,10 +413,9 @@
             </w:r>
             <w:r>
               <w:rPr>
-                <w:rFonts w:ascii="Arial" w:hAnsi="Arial" w:eastAsia="Arial"/>
-                <w:sz w:val="22"/>
+                <w:b w:val="0"/>
               </w:rPr>
-              <w:t xml:space="preserve"> SAGIP: A Low-Cost, Solar-Powered Estero Guardian with On-Chip AI That Lifts Floating Plastic and Counts Every Item as Evidence for Producer Accountability</w:t>
+              <w:t xml:space="preserve"> SAGIP: Solar-Powered Estero Guardian with On-Chip AI</w:t>
             </w:r>
           </w:p>
         </w:tc>
@@ -473,37 +459,27 @@
             </w:pPr>
             <w:r>
               <w:rPr>
-                <w:rFonts w:ascii="Arial" w:hAnsi="Arial" w:eastAsia="Arial"/>
-                <w:b/>
+                <w:b w:val="1"/>
                 <w:bCs w:val="1"/>
-                <w:sz w:val="22"/>
                 <w:rtl w:val="0"/>
               </w:rPr>
               <w:t xml:space="preserve">Project description</w:t>
             </w:r>
             <w:r>
               <w:rPr>
-                <w:rFonts w:ascii="Arial" w:hAnsi="Arial" w:eastAsia="Arial"/>
-                <w:sz w:val="22"/>
                 <w:rtl w:val="0"/>
               </w:rPr>
               <w:t xml:space="preserve">: ONLY THREE (3) SENTENCES which may be used as the entry’s official description for write-ups</w:t>
             </w:r>
             <w:r>
               <w:rPr>
-                <w:rFonts w:ascii="Arial" w:hAnsi="Arial" w:eastAsia="Arial"/>
-                <w:sz w:val="22"/>
                 <w:rtl w:val="0"/>
               </w:rPr>
             </w:r>
           </w:p>
           <w:p>
             <w:r>
-              <w:rPr>
-                <w:rFonts w:ascii="Arial" w:hAnsi="Arial" w:eastAsia="Arial"/>
-                <w:sz w:val="22"/>
-              </w:rPr>
-              <w:t>Our device is a low-cost, solar-powered unit in which a floating boom guides surface plastic toward the bank, a camera-triggered sweeper arm lifts it into a bin, and an ESP32-S3 camera running a tiny on-chip AI model counts each item by plastic type. Barangay officials receive a weekly offline report of what was removed and, where labels are legible, who produced it, with no images of people, plus a secondary water-level alert for impending channel blockage. Built from local and upcycled parts for about PHP 6,000 and tested against a hand-counted baseline, it adds anonymized records to an open dataset that other barangays can copy and extend.</w:t>
+              <w:t>Our device is a low-cost, solar-powered unit that lifts floating plastic out of a creek and counts each item with a tiny on-chip AI model. Barangay officials get a weekly offline report of what was removed, plus a secondary water-level alert for blockages. Built for about PHP 6,000 from local parts, it adds anonymized records to an open dataset that other barangays can copy.</w:t>
             </w:r>
           </w:p>
         </w:tc>
@@ -511,376 +487,433 @@
     </w:tbl>
     <w:p>
       <w:pPr>
-        <w:spacing w:line="240" w:lineRule="auto" w:after="0" w:before="0"/>
-      </w:pPr>
-    </w:p>
-    <w:p>
-      <w:pPr>
-        <w:keepNext/>
-        <w:spacing w:line="360" w:lineRule="auto" w:after="80" w:before="200"/>
-      </w:pPr>
-      <w:r>
-        <w:rPr>
-          <w:rFonts w:ascii="Arial" w:hAnsi="Arial" w:eastAsia="Arial"/>
-          <w:b/>
-          <w:sz w:val="22"/>
-        </w:rPr>
-        <w:t>1. What problem are you trying to solve?</w:t>
-      </w:r>
-    </w:p>
-    <w:p>
-      <w:pPr>
-        <w:spacing w:line="360" w:lineRule="auto" w:after="120" w:before="0"/>
-      </w:pPr>
-      <w:r>
-        <w:rPr>
-          <w:rFonts w:ascii="Arial" w:hAnsi="Arial" w:eastAsia="Arial"/>
-          <w:sz w:val="22"/>
-        </w:rPr>
-        <w:t xml:space="preserve">Plastic reaches the sea through creeks and esteros. River-emission estimates place Philippine rivers among the largest sources of ocean plastic </w:t>
-      </w:r>
-      <w:r>
-        <w:rPr>
-          <w:rFonts w:ascii="Arial" w:hAnsi="Arial" w:eastAsia="Arial"/>
-          <w:sz w:val="22"/>
+        <w:rPr/>
+      </w:pPr>
+      <w:r>
+        <w:rPr>
+          <w:rtl w:val="0"/>
+        </w:rPr>
+      </w:r>
+    </w:p>
+    <w:p>
+      <w:pPr>
+        <w:numPr>
+          <w:ilvl w:val="0"/>
+          <w:numId w:val="6"/>
+        </w:numPr>
+        <w:ind w:left="720" w:hanging="360"/>
+        <w:rPr>
+          <w:b w:val="1"/>
+          <w:bCs w:val="1"/>
+        </w:rPr>
+      </w:pPr>
+      <w:r>
+        <w:rPr>
+          <w:b w:val="1"/>
+          <w:bCs w:val="1"/>
+          <w:rtl w:val="0"/>
+        </w:rPr>
+        <w:t xml:space="preserve">What problem are you trying to solve?</w:t>
+      </w:r>
+      <w:r>
+        <w:rPr>
+          <w:b w:val="1"/>
+          <w:bCs w:val="1"/>
+          <w:rtl w:val="0"/>
+        </w:rPr>
+        <w:t xml:space="preserve"> </w:t>
+      </w:r>
+      <w:r>
+        <w:rPr>
+          <w:rtl w:val="0"/>
+        </w:rPr>
+      </w:r>
+    </w:p>
+    <w:p>
+      <w:pPr>
+        <w:rPr/>
+      </w:pPr>
+      <w:r>
+        <w:rPr>
+          <w:rtl w:val="0"/>
+        </w:rPr>
+      </w:r>
+    </w:p>
+    <w:p>
+      <w:pPr>
+        <w:spacing w:line="360" w:lineRule="auto"/>
+        <w:rPr/>
+      </w:pPr>
+      <w:r>
+        <w:t xml:space="preserve">Plastic reaches the sea through rivers, and the Philippines ranks near the top in every estimate. Global models placed it among the leading sources of mismanaged plastic waste (Jambeck et al., 2015) and of river emissions (Lebreton et al., 2017), and a later model built on measurements from more than 1,000 rivers kept Philippine rivers at the top (Meijer et al., 2021) </w:t>
+      </w:r>
+      <w:r>
+        <w:rPr>
           <w:highlight w:val="yellow"/>
         </w:rPr>
-        <w:t>[VERIFY: Meijer et al., 2021]</w:t>
-      </w:r>
-      <w:r>
-        <w:rPr>
-          <w:rFonts w:ascii="Arial" w:hAnsi="Arial" w:eastAsia="Arial"/>
-          <w:sz w:val="22"/>
-        </w:rPr>
-        <w:t xml:space="preserve">, and Metro Manila's waterways, including the Pasig and Tullahan systems, carry a large share. Single-use sachets, bags and cups dominate cleanup collections </w:t>
-      </w:r>
-      <w:r>
-        <w:rPr>
-          <w:rFonts w:ascii="Arial" w:hAnsi="Arial" w:eastAsia="Arial"/>
-          <w:sz w:val="22"/>
+        <w:t>[VERIFY: figures]</w:t>
+      </w:r>
+      <w:r>
+        <w:t xml:space="preserve">. Small urban waterways such as Metro Manila's esteros feed these rivers. Monthly records from Greater Jakarta tie debris release to rainfall (Cordova &amp; Nurhati, 2019) </w:t>
+      </w:r>
+      <w:r>
+        <w:rPr>
           <w:highlight w:val="yellow"/>
         </w:rPr>
-        <w:t>[VERIFY: local audits]</w:t>
-      </w:r>
-      <w:r>
-        <w:rPr>
-          <w:rFonts w:ascii="Arial" w:hAnsi="Arial" w:eastAsia="Arial"/>
-          <w:sz w:val="22"/>
-        </w:rPr>
+        <w:t>[VERIFY]</w:t>
+      </w:r>
+      <w:r>
+        <w:t xml:space="preserve">, and water hyacinth mats can trap plastic and carry it downstream </w:t>
+      </w:r>
+      <w:r>
+        <w:rPr>
+          <w:highlight w:val="yellow"/>
+        </w:rPr>
+        <w:t>[VERIFY: Schreyers et al., 2021]</w:t>
+      </w:r>
+      <w:r>
         <w:t>.</w:t>
       </w:r>
     </w:p>
     <w:p>
       <w:pPr>
-        <w:spacing w:line="360" w:lineRule="auto" w:after="120" w:before="0"/>
-      </w:pPr>
-      <w:r>
-        <w:rPr>
-          <w:rFonts w:ascii="Arial" w:hAnsi="Arial" w:eastAsia="Arial"/>
-          <w:sz w:val="22"/>
-        </w:rPr>
-        <w:t xml:space="preserve">Two gaps keep the problem going. First, removal is manual and unrecorded. Cleanups are weighed in bulk, nothing is kept about what the waste contained, and the same items return. Second, product-level evidence is scarce. The Extended Producer Responsibility Act of 2022 (RA 11898) obliges large companies to recover plastic packaging </w:t>
-      </w:r>
-      <w:r>
-        <w:rPr>
-          <w:rFonts w:ascii="Arial" w:hAnsi="Arial" w:eastAsia="Arial"/>
-          <w:sz w:val="22"/>
+        <w:spacing w:line="360" w:lineRule="auto"/>
+        <w:rPr/>
+      </w:pPr>
+      <w:r>
+        <w:t xml:space="preserve">Two gaps keep the problem going. Removal is manual and unrecorded, so cleanups weigh bulk waste and learn nothing about its contents. Product-level evidence is also scarce. River plastic research still lacks long-term monitoring data (van Emmerik &amp; Schwarz, 2020), and brand audits, though valuable, are periodic, labor-intensive and mostly land-based (Break Free From Plastic, 2019). The Extended Producer Responsibility Act of 2022 (RA 11898) obliges large companies to recover plastic packaging </w:t>
+      </w:r>
+      <w:r>
+        <w:rPr>
           <w:highlight w:val="yellow"/>
         </w:rPr>
         <w:t>[VERIFY: scope]</w:t>
       </w:r>
       <w:r>
-        <w:rPr>
-          <w:rFonts w:ascii="Arial" w:hAnsi="Arial" w:eastAsia="Arial"/>
-          <w:sz w:val="22"/>
-        </w:rPr>
-        <w:t>, but enforcement needs proof of which packaging reaches waterways. Brand audits exist, yet they are periodic, labor-intensive and mostly land-based (Break Free From Plastic, 2019). The government is expanding estero trash traps and has said recovery audits could be used to check EPR compliance (Manila Bulletin, 2026).</w:t>
-      </w:r>
-    </w:p>
-    <w:p>
-      <w:pPr>
-        <w:spacing w:line="360" w:lineRule="auto" w:after="120" w:before="0"/>
-      </w:pPr>
-      <w:r>
-        <w:rPr>
-          <w:rFonts w:ascii="Arial" w:hAnsi="Arial" w:eastAsia="Arial"/>
-          <w:sz w:val="22"/>
-        </w:rPr>
+        <w:t>, yet enforcement needs proof of which packaging reaches waterways. The government is expanding estero trash traps and has said recovery audits could check EPR compliance (Manila Bulletin, 2026).</w:t>
+      </w:r>
+    </w:p>
+    <w:p>
+      <w:pPr>
+        <w:spacing w:line="360" w:lineRule="auto"/>
+        <w:rPr/>
+      </w:pPr>
+      <w:r>
         <w:t xml:space="preserve">What is missing is a continuous, inexpensive record taken at the creek itself that one barangay can run. A secondary hazard shares the channel. Debris-choked creeks add to flooding in low-lying neighborhoods </w:t>
       </w:r>
       <w:r>
         <w:rPr>
-          <w:rFonts w:ascii="Arial" w:hAnsi="Arial" w:eastAsia="Arial"/>
-          <w:sz w:val="22"/>
           <w:highlight w:val="yellow"/>
         </w:rPr>
         <w:t>[VERIFY: MMDA and DPWH reports]</w:t>
       </w:r>
       <w:r>
-        <w:rPr>
-          <w:rFonts w:ascii="Arial" w:hAnsi="Arial" w:eastAsia="Arial"/>
-          <w:sz w:val="22"/>
-        </w:rPr>
-        <w:t>, and communities learn of a blockage only after the water has risen.</w:t>
-      </w:r>
-    </w:p>
-    <w:p>
-      <w:pPr>
-        <w:keepNext/>
-        <w:spacing w:line="360" w:lineRule="auto" w:after="80" w:before="200"/>
-      </w:pPr>
-      <w:r>
-        <w:rPr>
-          <w:rFonts w:ascii="Arial" w:hAnsi="Arial" w:eastAsia="Arial"/>
-          <w:b/>
-          <w:sz w:val="22"/>
-        </w:rPr>
-        <w:t>2. What do you want to achieve?</w:t>
-      </w:r>
-    </w:p>
-    <w:p>
-      <w:pPr>
-        <w:spacing w:line="360" w:lineRule="auto" w:after="120" w:before="0"/>
-      </w:pPr>
-      <w:r>
-        <w:rPr>
-          <w:rFonts w:ascii="Arial" w:hAnsi="Arial" w:eastAsia="Arial"/>
-          <w:b/>
-          <w:sz w:val="22"/>
-        </w:rPr>
-        <w:t xml:space="preserve">Goal: </w:t>
-      </w:r>
-      <w:r>
-        <w:rPr>
-          <w:rFonts w:ascii="Arial" w:hAnsi="Arial" w:eastAsia="Arial"/>
-          <w:sz w:val="22"/>
-        </w:rPr>
-        <w:t>We want barangays to treat the plastic in their creeks as measurable evidence instead of invisible waste. In the long run, this means cleaner waterways and community-owned data that shifts the burden of proof toward the companies that produce the packaging.</w:t>
-      </w:r>
-    </w:p>
-    <w:p>
-      <w:pPr>
-        <w:keepNext/>
-        <w:spacing w:line="360" w:lineRule="auto" w:after="40" w:before="0"/>
-      </w:pPr>
-      <w:r>
-        <w:rPr>
-          <w:rFonts w:ascii="Arial" w:hAnsi="Arial" w:eastAsia="Arial"/>
-          <w:b/>
-          <w:sz w:val="22"/>
-        </w:rPr>
-        <w:t>Objectives (SMART):</w:t>
-      </w:r>
-    </w:p>
-    <w:p>
-      <w:pPr>
-        <w:spacing w:line="360" w:lineRule="auto" w:after="120" w:before="0"/>
-      </w:pPr>
-      <w:r>
-        <w:rPr>
-          <w:rFonts w:ascii="Arial" w:hAnsi="Arial" w:eastAsia="Arial"/>
-          <w:b/>
-          <w:sz w:val="22"/>
+        <w:t>, and residents learn of a blockage only after the water rises.</w:t>
+      </w:r>
+    </w:p>
+    <w:p>
+      <w:pPr>
+        <w:rPr/>
+      </w:pPr>
+      <w:r>
+        <w:rPr>
+          <w:rtl w:val="0"/>
+        </w:rPr>
+      </w:r>
+    </w:p>
+    <w:p>
+      <w:pPr>
+        <w:numPr>
+          <w:ilvl w:val="0"/>
+          <w:numId w:val="6"/>
+        </w:numPr>
+        <w:ind w:left="720" w:hanging="360"/>
+        <w:rPr>
+          <w:b w:val="1"/>
+          <w:bCs w:val="1"/>
+        </w:rPr>
+      </w:pPr>
+      <w:r>
+        <w:rPr>
+          <w:b w:val="1"/>
+          <w:bCs w:val="1"/>
+          <w:rtl w:val="0"/>
+        </w:rPr>
+        <w:t xml:space="preserve">What do you</w:t>
+      </w:r>
+      <w:r>
+        <w:rPr>
+          <w:b w:val="1"/>
+          <w:bCs w:val="1"/>
+          <w:rtl w:val="0"/>
+        </w:rPr>
+        <w:t xml:space="preserve"> wan</w:t>
+      </w:r>
+      <w:r>
+        <w:rPr>
+          <w:b w:val="1"/>
+          <w:bCs w:val="1"/>
+          <w:rtl w:val="0"/>
+        </w:rPr>
+        <w:t xml:space="preserve">t to achieve?</w:t>
+      </w:r>
+    </w:p>
+    <w:p>
+      <w:pPr>
+        <w:rPr>
+          <w:b w:val="1"/>
+          <w:bCs w:val="1"/>
+        </w:rPr>
+      </w:pPr>
+      <w:r>
+        <w:rPr>
+          <w:rtl w:val="0"/>
+        </w:rPr>
+      </w:r>
+    </w:p>
+    <w:p>
+      <w:pPr>
+        <w:numPr>
+          <w:ilvl w:val="0"/>
+          <w:numId w:val="4"/>
+        </w:numPr>
+        <w:spacing w:line="360" w:lineRule="auto"/>
+        <w:ind w:left="720" w:hanging="360"/>
+        <w:rPr>
+          <w:u w:val="none"/>
+        </w:rPr>
+      </w:pPr>
+      <w:r>
+        <w:rPr>
+          <w:b/>
+        </w:rPr>
+        <w:t>Goal</w:t>
+      </w:r>
+      <w:r>
+        <w:t>: We want barangays to treat the plastic in their creeks as measurable evidence instead of invisible waste. In the long run, this means cleaner waterways and community-owned data that shifts the burden of proof toward the companies that produce the packaging.</w:t>
+      </w:r>
+    </w:p>
+    <w:p>
+      <w:pPr>
+        <w:numPr>
+          <w:ilvl w:val="0"/>
+          <w:numId w:val="1"/>
+        </w:numPr>
+        <w:spacing w:line="360" w:lineRule="auto"/>
+        <w:ind w:left="720" w:hanging="360"/>
+        <w:rPr>
+          <w:u w:val="none"/>
+        </w:rPr>
+      </w:pPr>
+      <w:r>
+        <w:rPr>
+          <w:b/>
+        </w:rPr>
+        <w:t>Objectives</w:t>
+      </w:r>
+      <w:r>
+        <w:t xml:space="preserve"> (SMART):</w:t>
+      </w:r>
+    </w:p>
+    <w:p>
+      <w:pPr>
+        <w:numPr>
+          <w:ilvl w:val="0"/>
+          <w:numId w:val="3"/>
+        </w:numPr>
+        <w:spacing w:line="360" w:lineRule="auto"/>
+        <w:ind w:left="1440" w:hanging="360"/>
+        <w:rPr/>
+      </w:pPr>
+      <w:r>
+        <w:rPr>
+          <w:b/>
         </w:rPr>
         <w:t>1. Remove plastic from the creek.</w:t>
       </w:r>
       <w:r>
-        <w:rPr>
-          <w:rFonts w:ascii="Arial" w:hAnsi="Arial" w:eastAsia="Arial"/>
-          <w:sz w:val="22"/>
-        </w:rPr>
         <w:t xml:space="preserve"> In an 8-week pilot at </w:t>
       </w:r>
       <w:r>
         <w:rPr>
-          <w:rFonts w:ascii="Arial" w:hAnsi="Arial" w:eastAsia="Arial"/>
-          <w:sz w:val="22"/>
           <w:highlight w:val="yellow"/>
         </w:rPr>
         <w:t>[ESTERO SITE]</w:t>
       </w:r>
       <w:r>
-        <w:rPr>
-          <w:rFonts w:ascii="Arial" w:hAnsi="Arial" w:eastAsia="Arial"/>
-          <w:sz w:val="22"/>
-        </w:rPr>
         <w:t xml:space="preserve"> starting in December 2026, lift at least </w:t>
       </w:r>
       <w:r>
         <w:rPr>
-          <w:rFonts w:ascii="Arial" w:hAnsi="Arial" w:eastAsia="Arial"/>
-          <w:sz w:val="22"/>
           <w:highlight w:val="yellow"/>
         </w:rPr>
         <w:t>[TARGET]</w:t>
       </w:r>
       <w:r>
-        <w:rPr>
-          <w:rFonts w:ascii="Arial" w:hAnsi="Arial" w:eastAsia="Arial"/>
-          <w:sz w:val="22"/>
-        </w:rPr>
         <w:t xml:space="preserve"> kg of floating debris out of the water and capture at least </w:t>
       </w:r>
       <w:r>
         <w:rPr>
-          <w:rFonts w:ascii="Arial" w:hAnsi="Arial" w:eastAsia="Arial"/>
-          <w:sz w:val="22"/>
           <w:highlight w:val="yellow"/>
         </w:rPr>
         <w:t>[X]</w:t>
       </w:r>
       <w:r>
-        <w:rPr>
-          <w:rFonts w:ascii="Arial" w:hAnsi="Arial" w:eastAsia="Arial"/>
-          <w:sz w:val="22"/>
-        </w:rPr>
         <w:t>% of the floating debris that reaches the boom, measured against a baseline week recorded before installation.</w:t>
       </w:r>
     </w:p>
     <w:p>
       <w:pPr>
-        <w:spacing w:line="360" w:lineRule="auto" w:after="120" w:before="0"/>
-      </w:pPr>
-      <w:r>
-        <w:rPr>
-          <w:rFonts w:ascii="Arial" w:hAnsi="Arial" w:eastAsia="Arial"/>
-          <w:b/>
-          <w:sz w:val="22"/>
+        <w:numPr>
+          <w:ilvl w:val="0"/>
+          <w:numId w:val="3"/>
+        </w:numPr>
+        <w:spacing w:line="360" w:lineRule="auto"/>
+        <w:ind w:left="1440" w:hanging="360"/>
+        <w:rPr/>
+      </w:pPr>
+      <w:r>
+        <w:rPr>
+          <w:b/>
         </w:rPr>
         <w:t>2. Prove what the plastic is.</w:t>
       </w:r>
       <w:r>
-        <w:rPr>
-          <w:rFonts w:ascii="Arial" w:hAnsi="Arial" w:eastAsia="Arial"/>
-          <w:sz w:val="22"/>
-        </w:rPr>
         <w:t xml:space="preserve"> By November 20, 2026, train an on-device model that reaches at least 85% precision and recall on photographs from places it has not seen. Across the pilot, weekly device counts should stay within 15% of a trained hand audit.</w:t>
       </w:r>
     </w:p>
     <w:p>
       <w:pPr>
-        <w:spacing w:line="360" w:lineRule="auto" w:after="120" w:before="0"/>
-      </w:pPr>
-      <w:r>
-        <w:rPr>
-          <w:rFonts w:ascii="Arial" w:hAnsi="Arial" w:eastAsia="Arial"/>
-          <w:b/>
-          <w:sz w:val="22"/>
+        <w:numPr>
+          <w:ilvl w:val="0"/>
+          <w:numId w:val="3"/>
+        </w:numPr>
+        <w:spacing w:line="360" w:lineRule="auto"/>
+        <w:ind w:left="1440" w:hanging="360"/>
+        <w:rPr/>
+      </w:pPr>
+      <w:r>
+        <w:rPr>
+          <w:b/>
         </w:rPr>
         <w:t>3. Make it copyable.</w:t>
       </w:r>
       <w:r>
-        <w:rPr>
-          <w:rFonts w:ascii="Arial" w:hAnsi="Arial" w:eastAsia="Arial"/>
-          <w:sz w:val="22"/>
-        </w:rPr>
         <w:t xml:space="preserve"> By March 2027, publish a free English and Filipino build guide and an open dataset, and help at least </w:t>
       </w:r>
       <w:r>
         <w:rPr>
-          <w:rFonts w:ascii="Arial" w:hAnsi="Arial" w:eastAsia="Arial"/>
-          <w:sz w:val="22"/>
           <w:highlight w:val="yellow"/>
         </w:rPr>
         <w:t>[2]</w:t>
       </w:r>
       <w:r>
-        <w:rPr>
-          <w:rFonts w:ascii="Arial" w:hAnsi="Arial" w:eastAsia="Arial"/>
-          <w:sz w:val="22"/>
-        </w:rPr>
         <w:t xml:space="preserve"> other barangays or schools build a unit for about PHP 6,000 each.</w:t>
       </w:r>
     </w:p>
     <w:p>
       <w:pPr>
-        <w:keepNext/>
-        <w:spacing w:line="360" w:lineRule="auto" w:after="80" w:before="200"/>
-      </w:pPr>
-      <w:r>
-        <w:rPr>
-          <w:rFonts w:ascii="Arial" w:hAnsi="Arial" w:eastAsia="Arial"/>
-          <w:b/>
-          <w:sz w:val="22"/>
-        </w:rPr>
-        <w:t>3. Who will benefit from this project?</w:t>
-      </w:r>
-    </w:p>
-    <w:p>
-      <w:pPr>
-        <w:spacing w:line="360" w:lineRule="auto" w:after="120" w:before="0"/>
-      </w:pPr>
-      <w:r>
-        <w:rPr>
-          <w:rFonts w:ascii="Arial" w:hAnsi="Arial" w:eastAsia="Arial"/>
-          <w:sz w:val="22"/>
-        </w:rPr>
+        <w:rPr/>
+      </w:pPr>
+      <w:r>
+        <w:rPr>
+          <w:rtl w:val="0"/>
+        </w:rPr>
+      </w:r>
+    </w:p>
+    <w:p>
+      <w:pPr>
+        <w:numPr>
+          <w:ilvl w:val="0"/>
+          <w:numId w:val="6"/>
+        </w:numPr>
+        <w:ind w:left="720" w:hanging="360"/>
+        <w:rPr>
+          <w:b w:val="1"/>
+          <w:bCs w:val="1"/>
+        </w:rPr>
+      </w:pPr>
+      <w:r>
+        <w:rPr>
+          <w:b w:val="1"/>
+          <w:bCs w:val="1"/>
+          <w:rtl w:val="0"/>
+        </w:rPr>
+        <w:t xml:space="preserve">Who will b</w:t>
+      </w:r>
+      <w:r>
+        <w:rPr>
+          <w:b w:val="1"/>
+          <w:bCs w:val="1"/>
+          <w:rtl w:val="0"/>
+        </w:rPr>
+        <w:t xml:space="preserve">enefi</w:t>
+      </w:r>
+      <w:r>
+        <w:rPr>
+          <w:b w:val="1"/>
+          <w:bCs w:val="1"/>
+          <w:rtl w:val="0"/>
+        </w:rPr>
+        <w:t xml:space="preserve">t from this project?</w:t>
+      </w:r>
+    </w:p>
+    <w:p>
+      <w:pPr>
+        <w:rPr/>
+      </w:pPr>
+      <w:r>
+        <w:rPr>
+          <w:rtl w:val="0"/>
+        </w:rPr>
+      </w:r>
+    </w:p>
+    <w:p>
+      <w:pPr>
+        <w:spacing w:line="360" w:lineRule="auto"/>
+        <w:rPr/>
+      </w:pPr>
+      <w:r>
         <w:t xml:space="preserve">Primary beneficiaries are the </w:t>
       </w:r>
       <w:r>
         <w:rPr>
-          <w:rFonts w:ascii="Arial" w:hAnsi="Arial" w:eastAsia="Arial"/>
-          <w:sz w:val="22"/>
           <w:highlight w:val="yellow"/>
         </w:rPr>
         <w:t>[N]</w:t>
       </w:r>
       <w:r>
-        <w:rPr>
-          <w:rFonts w:ascii="Arial" w:hAnsi="Arial" w:eastAsia="Arial"/>
-          <w:sz w:val="22"/>
-        </w:rPr>
         <w:t xml:space="preserve"> households of </w:t>
       </w:r>
       <w:r>
         <w:rPr>
-          <w:rFonts w:ascii="Arial" w:hAnsi="Arial" w:eastAsia="Arial"/>
-          <w:sz w:val="22"/>
           <w:highlight w:val="yellow"/>
         </w:rPr>
         <w:t>[BARANGAY AND PUROK]</w:t>
       </w:r>
       <w:r>
-        <w:rPr>
-          <w:rFonts w:ascii="Arial" w:hAnsi="Arial" w:eastAsia="Arial"/>
-          <w:sz w:val="22"/>
-        </w:rPr>
         <w:t xml:space="preserve"> along </w:t>
       </w:r>
       <w:r>
         <w:rPr>
-          <w:rFonts w:ascii="Arial" w:hAnsi="Arial" w:eastAsia="Arial"/>
-          <w:sz w:val="22"/>
           <w:highlight w:val="yellow"/>
         </w:rPr>
         <w:t>[ESTERO]</w:t>
       </w:r>
       <w:r>
-        <w:rPr>
-          <w:rFonts w:ascii="Arial" w:hAnsi="Arial" w:eastAsia="Arial"/>
-          <w:sz w:val="22"/>
-        </w:rPr>
-        <w:t xml:space="preserve">, who live beside the creek and bear its pollution and flooding, and the barangay's environmental and sanitation officers, who will empty the bin weekly and use the report. Secondary beneficiaries are the city solid-waste office and the DENR, who need item-level evidence for EPR enforcement, at least </w:t>
-      </w:r>
-      <w:r>
-        <w:rPr>
-          <w:rFonts w:ascii="Arial" w:hAnsi="Arial" w:eastAsia="Arial"/>
-          <w:sz w:val="22"/>
+        <w:t xml:space="preserve">, who bear the creek's pollution and flooding, and the barangay sanitation officers, who will empty the bin weekly and use the report. Secondary beneficiaries are the city solid-waste office and the DENR, who need item-level evidence for EPR enforcement, at least </w:t>
+      </w:r>
+      <w:r>
+        <w:rPr>
           <w:highlight w:val="yellow"/>
         </w:rPr>
         <w:t>[2]</w:t>
       </w:r>
       <w:r>
-        <w:rPr>
-          <w:rFonts w:ascii="Arial" w:hAnsi="Arial" w:eastAsia="Arial"/>
-          <w:sz w:val="22"/>
-        </w:rPr>
-        <w:t xml:space="preserve"> neighboring barangays or schools that copy the design by March 2027, and the science students who run the data collection. Communities and fisherfolk downstream benefit indirectly as less plastic reaches Manila Bay. We chose the barangay because it already organizes estero cleanups, so a barangay-owned tool needs no new institution (Manila Bulletin, 2026). </w:t>
-      </w:r>
-      <w:r>
-        <w:rPr>
-          <w:rFonts w:ascii="Arial" w:hAnsi="Arial" w:eastAsia="Arial"/>
-          <w:sz w:val="22"/>
+        <w:t xml:space="preserve"> neighboring barangays or schools that copy the design by March 2027, and downstream fisherfolk as less plastic reaches Manila Bay. We chose the barangay because it already organizes estero cleanups (Manila Bulletin, 2026), and community-based monitoring has a long record of building local ownership of environmental data (Conrad &amp; Hilchey, 2011). </w:t>
+      </w:r>
+      <w:r>
+        <w:rPr>
           <w:highlight w:val="yellow"/>
         </w:rPr>
         <w:t>[Add the barangay's household count and its current cleanup program.]</w:t>
@@ -888,41 +921,78 @@
     </w:p>
     <w:p>
       <w:pPr>
-        <w:keepNext/>
-        <w:spacing w:line="360" w:lineRule="auto" w:after="80" w:before="200"/>
-      </w:pPr>
-      <w:r>
-        <w:rPr>
-          <w:rFonts w:ascii="Arial" w:hAnsi="Arial" w:eastAsia="Arial"/>
-          <w:b/>
-          <w:sz w:val="22"/>
-        </w:rPr>
-        <w:t>4. How did you come up with your proposal?</w:t>
-      </w:r>
-    </w:p>
-    <w:p>
-      <w:pPr>
-        <w:spacing w:line="360" w:lineRule="auto" w:after="120" w:before="0"/>
-      </w:pPr>
-      <w:r>
-        <w:rPr>
-          <w:rFonts w:ascii="Arial" w:hAnsi="Arial" w:eastAsia="Arial"/>
-          <w:b/>
-          <w:sz w:val="22"/>
+        <w:rPr/>
+      </w:pPr>
+      <w:r>
+        <w:rPr>
+          <w:rtl w:val="0"/>
+        </w:rPr>
+      </w:r>
+    </w:p>
+    <w:p>
+      <w:pPr>
+        <w:numPr>
+          <w:ilvl w:val="0"/>
+          <w:numId w:val="6"/>
+        </w:numPr>
+        <w:ind w:left="720" w:hanging="360"/>
+        <w:rPr>
+          <w:b w:val="1"/>
+          <w:bCs w:val="1"/>
+        </w:rPr>
+      </w:pPr>
+      <w:r>
+        <w:rPr>
+          <w:b w:val="1"/>
+          <w:bCs w:val="1"/>
+          <w:rtl w:val="0"/>
+        </w:rPr>
+        <w:t xml:space="preserve">H</w:t>
+      </w:r>
+      <w:r>
+        <w:rPr>
+          <w:b w:val="1"/>
+          <w:bCs w:val="1"/>
+          <w:rtl w:val="0"/>
+        </w:rPr>
+        <w:t xml:space="preserve">o</w:t>
+      </w:r>
+      <w:r>
+        <w:rPr>
+          <w:b w:val="1"/>
+          <w:bCs w:val="1"/>
+          <w:rtl w:val="0"/>
+        </w:rPr>
+        <w:t xml:space="preserve">w did you come up with your proposal?</w:t>
+      </w:r>
+    </w:p>
+    <w:p>
+      <w:pPr>
+        <w:rPr/>
+      </w:pPr>
+      <w:r>
+        <w:rPr>
+          <w:rtl w:val="0"/>
+        </w:rPr>
+        <w:t xml:space="preserve"> </w:t>
+      </w:r>
+    </w:p>
+    <w:p>
+      <w:pPr>
+        <w:spacing w:line="360" w:lineRule="auto"/>
+        <w:rPr/>
+      </w:pPr>
+      <w:r>
+        <w:rPr>
+          <w:b/>
         </w:rPr>
         <w:t xml:space="preserve">Select. </w:t>
       </w:r>
       <w:r>
-        <w:rPr>
-          <w:rFonts w:ascii="Arial" w:hAnsi="Arial" w:eastAsia="Arial"/>
-          <w:sz w:val="22"/>
-        </w:rPr>
         <w:t xml:space="preserve">We listed five community problems and scored each on significance, feasibility, STEM depth, replicability and originality. Creek plastic won. We can reach a creek, we can measure it weekly, and RA 11898 has just made item-level data useful. </w:t>
       </w:r>
       <w:r>
         <w:rPr>
-          <w:rFonts w:ascii="Arial" w:hAnsi="Arial" w:eastAsia="Arial"/>
-          <w:sz w:val="22"/>
           <w:highlight w:val="yellow"/>
         </w:rPr>
         <w:t>[Edit this to match your team's actual brainstorming steps.]</w:t>
@@ -930,34 +1000,29 @@
     </w:p>
     <w:p>
       <w:pPr>
-        <w:spacing w:line="360" w:lineRule="auto" w:after="60" w:before="0"/>
-      </w:pPr>
-      <w:r>
-        <w:rPr>
-          <w:rFonts w:ascii="Arial" w:hAnsi="Arial" w:eastAsia="Arial"/>
-          <w:b/>
-          <w:sz w:val="22"/>
+        <w:spacing w:line="360" w:lineRule="auto"/>
+        <w:rPr/>
+      </w:pPr>
+      <w:r>
+        <w:rPr>
+          <w:b/>
         </w:rPr>
         <w:t xml:space="preserve">What exists. </w:t>
       </w:r>
       <w:r>
-        <w:rPr>
-          <w:rFonts w:ascii="Arial" w:hAnsi="Arial" w:eastAsia="Arial"/>
-          <w:sz w:val="22"/>
-        </w:rPr>
-        <w:t>Four kinds of work address parts of the problem.</w:t>
+        <w:t>Five kinds of work address parts of the problem.</w:t>
       </w:r>
     </w:p>
     <w:tbl>
       <w:tblPr>
         <w:tblW w:type="auto" w:w="0"/>
         <w:tblBorders>
-          <w:top w:val="single" w:sz="4" w:space="0" w:color="808080"/>
-          <w:left w:val="single" w:sz="4" w:space="0" w:color="808080"/>
-          <w:bottom w:val="single" w:sz="4" w:space="0" w:color="808080"/>
-          <w:right w:val="single" w:sz="4" w:space="0" w:color="808080"/>
-          <w:insideH w:val="single" w:sz="4" w:space="0" w:color="808080"/>
-          <w:insideV w:val="single" w:sz="4" w:space="0" w:color="808080"/>
+          <w:top w:val="single" w:sz="8" w:space="0" w:color="000000"/>
+          <w:left w:val="single" w:sz="8" w:space="0" w:color="000000"/>
+          <w:bottom w:val="single" w:sz="8" w:space="0" w:color="000000"/>
+          <w:right w:val="single" w:sz="8" w:space="0" w:color="000000"/>
+          <w:insideH w:val="single" w:sz="8" w:space="0" w:color="000000"/>
+          <w:insideV w:val="single" w:sz="8" w:space="0" w:color="000000"/>
         </w:tblBorders>
         <w:tblLayout w:type="fixed"/>
         <w:tblLook w:firstColumn="1" w:firstRow="1" w:lastColumn="0" w:lastRow="0" w:noHBand="0" w:noVBand="1" w:val="04A0"/>
@@ -971,7 +1036,6 @@
         <w:tc>
           <w:tcPr>
             <w:tcW w:type="dxa" w:w="3024"/>
-            <w:shd w:val="clear" w:color="auto" w:fill="E7EEF4"/>
           </w:tcPr>
           <w:p>
             <w:pPr>
@@ -979,9 +1043,7 @@
             </w:pPr>
             <w:r>
               <w:rPr>
-                <w:rFonts w:ascii="Arial" w:hAnsi="Arial" w:eastAsia="Arial"/>
                 <w:b/>
-                <w:sz w:val="20"/>
               </w:rPr>
               <w:t>Existing work</w:t>
             </w:r>
@@ -990,7 +1052,6 @@
         <w:tc>
           <w:tcPr>
             <w:tcW w:type="dxa" w:w="3312"/>
-            <w:shd w:val="clear" w:color="auto" w:fill="E7EEF4"/>
           </w:tcPr>
           <w:p>
             <w:pPr>
@@ -998,9 +1059,7 @@
             </w:pPr>
             <w:r>
               <w:rPr>
-                <w:rFonts w:ascii="Arial" w:hAnsi="Arial" w:eastAsia="Arial"/>
                 <w:b/>
-                <w:sz w:val="20"/>
               </w:rPr>
               <w:t>What it does</w:t>
             </w:r>
@@ -1009,7 +1068,6 @@
         <w:tc>
           <w:tcPr>
             <w:tcW w:type="dxa" w:w="3024"/>
-            <w:shd w:val="clear" w:color="auto" w:fill="E7EEF4"/>
           </w:tcPr>
           <w:p>
             <w:pPr>
@@ -1017,9 +1075,7 @@
             </w:pPr>
             <w:r>
               <w:rPr>
-                <w:rFonts w:ascii="Arial" w:hAnsi="Arial" w:eastAsia="Arial"/>
                 <w:b/>
-                <w:sz w:val="20"/>
               </w:rPr>
               <w:t>What it leaves open</w:t>
             </w:r>
@@ -1036,10 +1092,6 @@
               <w:spacing w:line="240" w:lineRule="auto" w:after="40" w:before="40"/>
             </w:pPr>
             <w:r>
-              <w:rPr>
-                <w:rFonts w:ascii="Arial" w:hAnsi="Arial" w:eastAsia="Arial"/>
-                <w:sz w:val="20"/>
-              </w:rPr>
               <w:t>Cameras with deep learning (van Lieshout et al., 2020)</w:t>
             </w:r>
           </w:p>
@@ -1053,10 +1105,6 @@
               <w:spacing w:line="240" w:lineRule="auto" w:after="40" w:before="40"/>
             </w:pPr>
             <w:r>
-              <w:rPr>
-                <w:rFonts w:ascii="Arial" w:hAnsi="Arial" w:eastAsia="Arial"/>
-                <w:sz w:val="20"/>
-              </w:rPr>
               <w:t>Count floating plastic from bridge-mounted cameras, tested in Jakarta</w:t>
             </w:r>
           </w:p>
@@ -1070,10 +1118,6 @@
               <w:spacing w:line="240" w:lineRule="auto" w:after="40" w:before="40"/>
             </w:pPr>
             <w:r>
-              <w:rPr>
-                <w:rFonts w:ascii="Arial" w:hAnsi="Arial" w:eastAsia="Arial"/>
-                <w:sz w:val="20"/>
-              </w:rPr>
               <w:t>Monitor only and remove nothing</w:t>
             </w:r>
           </w:p>
@@ -1089,10 +1133,6 @@
               <w:spacing w:line="240" w:lineRule="auto" w:after="40" w:before="40"/>
             </w:pPr>
             <w:r>
-              <w:rPr>
-                <w:rFonts w:ascii="Arial" w:hAnsi="Arial" w:eastAsia="Arial"/>
-                <w:sz w:val="20"/>
-              </w:rPr>
               <w:t>Low-cost robotic boats (HydroSentinel, 2026)</w:t>
             </w:r>
           </w:p>
@@ -1106,10 +1146,6 @@
               <w:spacing w:line="240" w:lineRule="auto" w:after="40" w:before="40"/>
             </w:pPr>
             <w:r>
-              <w:rPr>
-                <w:rFonts w:ascii="Arial" w:hAnsi="Arial" w:eastAsia="Arial"/>
-                <w:sz w:val="20"/>
-              </w:rPr>
               <w:t>Detect and collect plastic with a small onboard model</w:t>
             </w:r>
           </w:p>
@@ -1123,10 +1159,6 @@
               <w:spacing w:line="240" w:lineRule="auto" w:after="40" w:before="40"/>
             </w:pPr>
             <w:r>
-              <w:rPr>
-                <w:rFonts w:ascii="Arial" w:hAnsi="Arial" w:eastAsia="Arial"/>
-                <w:sz w:val="20"/>
-              </w:rPr>
               <w:t>Need radio, charging and an operator</w:t>
             </w:r>
           </w:p>
@@ -1142,10 +1174,6 @@
               <w:spacing w:line="240" w:lineRule="auto" w:after="40" w:before="40"/>
             </w:pPr>
             <w:r>
-              <w:rPr>
-                <w:rFonts w:ascii="Arial" w:hAnsi="Arial" w:eastAsia="Arial"/>
-                <w:sz w:val="20"/>
-              </w:rPr>
               <w:t>Estero trash traps (Manila Bulletin, 2026)</w:t>
             </w:r>
           </w:p>
@@ -1159,10 +1187,6 @@
               <w:spacing w:line="240" w:lineRule="auto" w:after="40" w:before="40"/>
             </w:pPr>
             <w:r>
-              <w:rPr>
-                <w:rFonts w:ascii="Arial" w:hAnsi="Arial" w:eastAsia="Arial"/>
-                <w:sz w:val="20"/>
-              </w:rPr>
               <w:t>Remove plastic at scale</w:t>
             </w:r>
           </w:p>
@@ -1176,10 +1200,6 @@
               <w:spacing w:line="240" w:lineRule="auto" w:after="40" w:before="40"/>
             </w:pPr>
             <w:r>
-              <w:rPr>
-                <w:rFonts w:ascii="Arial" w:hAnsi="Arial" w:eastAsia="Arial"/>
-                <w:sz w:val="20"/>
-              </w:rPr>
               <w:t>Record bulk weight only</w:t>
             </w:r>
           </w:p>
@@ -1195,10 +1215,53 @@
               <w:spacing w:line="240" w:lineRule="auto" w:after="40" w:before="40"/>
             </w:pPr>
             <w:r>
+              <w:t>River interceptors and booms (Schmaltz et al., 2020)</w:t>
+            </w:r>
+          </w:p>
+        </w:tc>
+        <w:tc>
+          <w:tcPr>
+            <w:tcW w:type="dxa" w:w="3312"/>
+          </w:tcPr>
+          <w:p>
+            <w:pPr>
+              <w:spacing w:line="240" w:lineRule="auto" w:after="40" w:before="40"/>
+            </w:pPr>
+            <w:r>
+              <w:t>Review technologies that prevent and collect river and marine plastic</w:t>
+            </w:r>
+          </w:p>
+        </w:tc>
+        <w:tc>
+          <w:tcPr>
+            <w:tcW w:type="dxa" w:w="3024"/>
+          </w:tcPr>
+          <w:p>
+            <w:pPr>
+              <w:spacing w:line="240" w:lineRule="auto" w:after="40" w:before="40"/>
+            </w:pPr>
+            <w:r>
+              <w:t xml:space="preserve">Few designs report item-level data </w:t>
+            </w:r>
+            <w:r>
               <w:rPr>
-                <w:rFonts w:ascii="Arial" w:hAnsi="Arial" w:eastAsia="Arial"/>
-                <w:sz w:val="20"/>
+                <w:highlight w:val="yellow"/>
               </w:rPr>
+              <w:t>[VERIFY]</w:t>
+            </w:r>
+          </w:p>
+        </w:tc>
+      </w:tr>
+      <w:tr>
+        <w:tc>
+          <w:tcPr>
+            <w:tcW w:type="dxa" w:w="3024"/>
+          </w:tcPr>
+          <w:p>
+            <w:pPr>
+              <w:spacing w:line="240" w:lineRule="auto" w:after="40" w:before="40"/>
+            </w:pPr>
+            <w:r>
               <w:t>Brand audits (Break Free From Plastic, 2019)</w:t>
             </w:r>
           </w:p>
@@ -1212,10 +1275,6 @@
               <w:spacing w:line="240" w:lineRule="auto" w:after="40" w:before="40"/>
             </w:pPr>
             <w:r>
-              <w:rPr>
-                <w:rFonts w:ascii="Arial" w:hAnsi="Arial" w:eastAsia="Arial"/>
-                <w:sz w:val="20"/>
-              </w:rPr>
               <w:t>Name the brands behind plastic waste</w:t>
             </w:r>
           </w:p>
@@ -1229,65 +1288,92 @@
               <w:spacing w:line="240" w:lineRule="auto" w:after="40" w:before="40"/>
             </w:pPr>
             <w:r>
-              <w:rPr>
-                <w:rFonts w:ascii="Arial" w:hAnsi="Arial" w:eastAsia="Arial"/>
-                <w:sz w:val="20"/>
-              </w:rPr>
               <w:t>Periodic, manual, mostly land-based</w:t>
             </w:r>
           </w:p>
         </w:tc>
       </w:tr>
     </w:tbl>
-    <w:p>
-      <w:pPr>
-        <w:spacing w:after="0"/>
-      </w:pPr>
-    </w:p>
-    <w:p>
-      <w:pPr>
-        <w:spacing w:line="360" w:lineRule="auto" w:after="120" w:before="0"/>
-      </w:pPr>
-      <w:r>
-        <w:rPr>
-          <w:rFonts w:ascii="Arial" w:hAnsi="Arial" w:eastAsia="Arial"/>
-          <w:b/>
-          <w:sz w:val="22"/>
+    <w:p/>
+    <w:p>
+      <w:pPr>
+        <w:spacing w:line="360" w:lineRule="auto"/>
+        <w:rPr/>
+      </w:pPr>
+      <w:r>
+        <w:rPr>
+          <w:b/>
         </w:rPr>
         <w:t xml:space="preserve">Gap we test. </w:t>
       </w:r>
       <w:r>
-        <w:rPr>
-          <w:rFonts w:ascii="Arial" w:hAnsi="Arial" w:eastAsia="Arial"/>
-          <w:sz w:val="22"/>
-        </w:rPr>
         <w:t>None of these lifts plastic, counts it and shares open data in a unit a barangay can afford. Our search was limited and found no such system. We therefore ask one research question: can a PHP 6,000 on-chip counter match a trained hand audit within 15%, and does continuous counting reveal rain-driven pulses of plastic that weekly audits miss?</w:t>
       </w:r>
     </w:p>
     <w:p>
       <w:pPr>
-        <w:keepNext/>
-        <w:spacing w:line="360" w:lineRule="auto" w:after="80" w:before="200"/>
-      </w:pPr>
-      <w:r>
-        <w:rPr>
-          <w:rFonts w:ascii="Arial" w:hAnsi="Arial" w:eastAsia="Arial"/>
-          <w:b/>
-          <w:sz w:val="22"/>
-        </w:rPr>
-        <w:t>5. How will your tech solution work?</w:t>
-      </w:r>
-    </w:p>
-    <w:p>
-      <w:pPr>
-        <w:spacing w:line="360" w:lineRule="auto" w:after="120" w:before="0"/>
-      </w:pPr>
-      <w:r>
-        <w:rPr>
-          <w:rFonts w:ascii="Arial" w:hAnsi="Arial" w:eastAsia="Arial"/>
-          <w:sz w:val="22"/>
-        </w:rPr>
-        <w:t>STEM is the core of the design. Physics sets the boom angle, the lever and torque of the arm and the solar energy budget. Mathematics and statistics define precision, recall and count error. Computer science supplies the object-detection model, INT8 quantization and fault-tolerant control. Engineering joins them in a floating, weatherproof structure. Our key message is that proof of what plastic reaches a creek can be continuous, cheap and community-owned. Pairing a collector with a counter is the most effective way to deliver it, because one inexpensive chip then yields cleanup and evidence together.</w:t>
+        <w:rPr/>
+      </w:pPr>
+      <w:r>
+        <w:rPr>
+          <w:rtl w:val="0"/>
+        </w:rPr>
+      </w:r>
+    </w:p>
+    <w:p>
+      <w:pPr>
+        <w:numPr>
+          <w:ilvl w:val="0"/>
+          <w:numId w:val="6"/>
+        </w:numPr>
+        <w:ind w:left="720" w:hanging="360"/>
+        <w:rPr>
+          <w:b w:val="1"/>
+          <w:bCs w:val="1"/>
+        </w:rPr>
+      </w:pPr>
+      <w:r>
+        <w:rPr>
+          <w:b w:val="1"/>
+          <w:bCs w:val="1"/>
+          <w:rtl w:val="0"/>
+        </w:rPr>
+        <w:t xml:space="preserve">How will your tech s</w:t>
+      </w:r>
+      <w:r>
+        <w:rPr>
+          <w:b w:val="1"/>
+          <w:bCs w:val="1"/>
+          <w:rtl w:val="0"/>
+        </w:rPr>
+        <w:t xml:space="preserve">olution w</w:t>
+      </w:r>
+      <w:r>
+        <w:rPr>
+          <w:b w:val="1"/>
+          <w:bCs w:val="1"/>
+          <w:rtl w:val="0"/>
+        </w:rPr>
+        <w:t xml:space="preserve">ork?</w:t>
+      </w:r>
+    </w:p>
+    <w:p>
+      <w:pPr>
+        <w:rPr/>
+      </w:pPr>
+      <w:r>
+        <w:rPr>
+          <w:rtl w:val="0"/>
+        </w:rPr>
+      </w:r>
+    </w:p>
+    <w:p>
+      <w:pPr>
+        <w:spacing w:line="360" w:lineRule="auto"/>
+        <w:rPr/>
+      </w:pPr>
+      <w:r>
+        <w:t>STEM is the core of the design. Physics sets the boom angle, the lever and torque of the arm and the solar energy budget. Mathematics and statistics define precision, recall and count error. Computer science supplies the object-detection model, INT8 quantization, which shrinks a model about fourfold with little loss of accuracy (Jacob et al., 2018), and TensorFlow Lite for Microcontrollers, which runs it in kilobytes of memory (David et al., 2021). Engineering joins them in a floating, weatherproof structure. Our key message is that proof of what plastic reaches a creek can be continuous, cheap and community-owned. Pairing a collector with a counter delivers it best, because one inexpensive chip then yields cleanup and evidence together.</w:t>
       </w:r>
     </w:p>
     <w:p>
@@ -1297,7 +1383,7 @@
       <w:r>
         <w:drawing>
           <wp:inline>
-            <wp:extent cx="5669280" cy="2619207"/>
+            <wp:extent cx="5486400" cy="2534717"/>
             <wp:docPr id="1" name="Picture 1"/>
             <wp:cNvGraphicFramePr>
               <a:graphicFrameLocks noChangeAspect="1"/>
@@ -1318,7 +1404,7 @@
                   <pic:spPr>
                     <a:xfrm>
                       <a:off x="0" y="0"/>
-                      <a:ext cx="5669280" cy="2619207"/>
+                      <a:ext cx="5486400" cy="2534717"/>
                     </a:xfrm>
                     <a:prstGeom prst="rect"/>
                   </pic:spPr>
@@ -1331,176 +1417,88 @@
     </w:p>
     <w:p>
       <w:pPr>
-        <w:spacing w:line="240" w:lineRule="auto" w:after="160" w:before="0"/>
         <w:jc w:val="center"/>
       </w:pPr>
       <w:r>
         <w:rPr>
-          <w:rFonts w:ascii="Arial" w:hAnsi="Arial" w:eastAsia="Arial"/>
           <w:i/>
-          <w:sz w:val="20"/>
         </w:rPr>
         <w:t>Figure 1. What the chip decides, from camera to report.</w:t>
       </w:r>
     </w:p>
     <w:p>
       <w:pPr>
-        <w:spacing w:line="360" w:lineRule="auto" w:after="120" w:before="0"/>
-      </w:pPr>
-      <w:r>
-        <w:rPr>
-          <w:rFonts w:ascii="Arial" w:hAnsi="Arial" w:eastAsia="Arial"/>
-          <w:b/>
-          <w:sz w:val="22"/>
-        </w:rPr>
-        <w:t>Trap.</w:t>
-      </w:r>
-      <w:r>
-        <w:rPr>
-          <w:rFonts w:ascii="Arial" w:hAnsi="Arial" w:eastAsia="Arial"/>
-          <w:sz w:val="22"/>
-        </w:rPr>
-        <w:t xml:space="preserve"> A V-shaped boom of reused PET bottles and bamboo guides surface debris to the bank, where a bar screen stops oversized items at the foot of a sloped mesh ramp. A wide-gapped deflector upstream pushes water hyacinth mats past the intake. The creek's own current does the herding, so the boom needs no energy.</w:t>
-      </w:r>
-    </w:p>
-    <w:p>
-      <w:pPr>
-        <w:spacing w:line="360" w:lineRule="auto" w:after="120" w:before="0"/>
-      </w:pPr>
-      <w:r>
-        <w:rPr>
-          <w:rFonts w:ascii="Arial" w:hAnsi="Arial" w:eastAsia="Arial"/>
-          <w:b/>
-          <w:sz w:val="22"/>
-        </w:rPr>
-        <w:t>Lift.</w:t>
-      </w:r>
-      <w:r>
-        <w:rPr>
-          <w:rFonts w:ascii="Arial" w:hAnsi="Arial" w:eastAsia="Arial"/>
-          <w:sz w:val="22"/>
-        </w:rPr>
-        <w:t xml:space="preserve"> A small geared DC motor, mounted above the flood line, turns a rake arm that sweeps debris up the ramp into a covered bin. It runs in short bursts and only when the camera sees plastic rather than vegetation. A sacrificial shear pin protects the gearbox, and a guard, stop switch and lockout protect people. Students never enter the water, and adults empty the bin weekly.</w:t>
-      </w:r>
-    </w:p>
-    <w:p>
-      <w:pPr>
-        <w:spacing w:line="360" w:lineRule="auto" w:after="120" w:before="0"/>
-      </w:pPr>
-      <w:r>
-        <w:rPr>
-          <w:rFonts w:ascii="Arial" w:hAnsi="Arial" w:eastAsia="Arial"/>
-          <w:b/>
-          <w:sz w:val="22"/>
-        </w:rPr>
-        <w:t>Protect.</w:t>
-      </w:r>
-      <w:r>
-        <w:rPr>
-          <w:rFonts w:ascii="Arial" w:hAnsi="Arial" w:eastAsia="Arial"/>
-          <w:sz w:val="22"/>
-        </w:rPr>
-        <w:t xml:space="preserve"> The chip reads motor current, ignores the start-up surge, and trips on sustained high current. A Hall sensor on the arm shaft confirms the arm is moving, which exposes slipping on greasy surfaces. After a jam it stops, reverses briefly, retries at most three times, then locks out and alerts the barangay. The motor driver defaults to off, so a crashed chip cannot leave the motor running.</w:t>
-      </w:r>
-    </w:p>
-    <w:p>
-      <w:pPr>
-        <w:spacing w:line="360" w:lineRule="auto" w:after="120" w:before="0"/>
-      </w:pPr>
-      <w:r>
-        <w:rPr>
-          <w:rFonts w:ascii="Arial" w:hAnsi="Arial" w:eastAsia="Arial"/>
-          <w:b/>
-          <w:sz w:val="22"/>
-        </w:rPr>
-        <w:t>Count.</w:t>
-      </w:r>
-      <w:r>
-        <w:rPr>
-          <w:rFonts w:ascii="Arial" w:hAnsi="Arial" w:eastAsia="Arial"/>
-          <w:sz w:val="22"/>
-        </w:rPr>
-        <w:t xml:space="preserve"> An ESP32-S3 camera on a post looks down at the water surface only, so no faces or houses appear. A compact object-detection model, quantized to INT8 and run with TensorFlow Lite for Microcontrollers, classifies each item. Because the camera views a pocket one to two meters away, items appear large in the frame. Training photographs come from our own collection along the creek bank, labelled by students and checked by the adviser. Every week, students hand-count and weigh the bin, and that count is the accuracy test.</w:t>
-      </w:r>
-    </w:p>
-    <w:p>
-      <w:pPr>
-        <w:spacing w:line="360" w:lineRule="auto" w:after="120" w:before="0"/>
-      </w:pPr>
-      <w:r>
-        <w:rPr>
-          <w:rFonts w:ascii="Arial" w:hAnsi="Arial" w:eastAsia="Arial"/>
-          <w:b/>
-          <w:sz w:val="22"/>
-        </w:rPr>
-        <w:t>Report.</w:t>
-      </w:r>
-      <w:r>
-        <w:rPr>
-          <w:rFonts w:ascii="Arial" w:hAnsi="Arial" w:eastAsia="Arial"/>
-          <w:sz w:val="22"/>
-        </w:rPr>
-        <w:t xml:space="preserve"> A phone reads an offline Wi-Fi page hosted by the chip, and a script builds the weekly report and an anonymized open dataset. Each record stores class, time, water level and an image hash in an append-only log. A student volunteer tallies brand names that are legible in the stored photographs, because automated brand reading is not yet reliable. Plotting counts against rainfall shows whether plastic arrives in rain-driven pulses.</w:t>
-      </w:r>
-    </w:p>
-    <w:p>
-      <w:pPr>
-        <w:spacing w:line="360" w:lineRule="auto" w:after="120" w:before="0"/>
-      </w:pPr>
-      <w:r>
-        <w:rPr>
-          <w:rFonts w:ascii="Arial" w:hAnsi="Arial" w:eastAsia="Arial"/>
-          <w:b/>
-          <w:sz w:val="22"/>
-        </w:rPr>
-        <w:t>Warn (secondary).</w:t>
-      </w:r>
-      <w:r>
-        <w:rPr>
-          <w:rFonts w:ascii="Arial" w:hAnsi="Arial" w:eastAsia="Arial"/>
-          <w:sz w:val="22"/>
-        </w:rPr>
-        <w:t xml:space="preserve"> A waterproof ultrasonic sensor measures the distance to the water surface against a painted staff gauge. It raises an LED and report alert when the level rises quickly or the bin nears capacity, and the arm stops above a set level.</w:t>
-      </w:r>
-    </w:p>
-    <w:p>
-      <w:pPr>
-        <w:spacing w:line="360" w:lineRule="auto" w:after="120" w:before="0"/>
-      </w:pPr>
-      <w:r>
-        <w:rPr>
-          <w:rFonts w:ascii="Arial" w:hAnsi="Arial" w:eastAsia="Arial"/>
-          <w:b/>
-          <w:sz w:val="22"/>
-        </w:rPr>
-        <w:t>Power.</w:t>
-      </w:r>
-      <w:r>
-        <w:rPr>
-          <w:rFonts w:ascii="Arial" w:hAnsi="Arial" w:eastAsia="Arial"/>
-          <w:sz w:val="22"/>
-        </w:rPr>
-        <w:t xml:space="preserve"> These are planning figures to be replaced by bench measurements. Duty-cycled electronics draw about 6 Wh per day and the arm about 0.3 Wh. A 10 W panel yields about 18 Wh per day at 3 effective sun-hours and 60% efficiency, and two 18650 cells store about 18 Wh. The margin is thin on cloudy days, so the chip lengthens its capture interval when the battery is low.</w:t>
-      </w:r>
-    </w:p>
-    <w:p>
-      <w:pPr>
-        <w:spacing w:line="360" w:lineRule="auto" w:after="120" w:before="0"/>
-      </w:pPr>
-      <w:r>
-        <w:rPr>
-          <w:rFonts w:ascii="Arial" w:hAnsi="Arial" w:eastAsia="Arial"/>
-          <w:b/>
-          <w:sz w:val="22"/>
-        </w:rPr>
-        <w:t>Scope.</w:t>
-      </w:r>
-      <w:r>
-        <w:rPr>
-          <w:rFonts w:ascii="Arial" w:hAnsi="Arial" w:eastAsia="Arial"/>
-          <w:sz w:val="22"/>
-        </w:rPr>
-        <w:t xml:space="preserve"> SAGIP lifts light floating debris such as bottles, sachets, bags, foam and cups. Heavy or tangled items, hyacinth mats, sunken waste, sediment, oil and dissolved pollutants fall outside its reach, so we report a measured capture rate instead of claiming a clean creek.</w:t>
+        <w:spacing w:line="360" w:lineRule="auto"/>
+        <w:rPr/>
+      </w:pPr>
+      <w:r>
+        <w:rPr>
+          <w:b/>
+        </w:rPr>
+        <w:t xml:space="preserve">Trap. </w:t>
+      </w:r>
+      <w:r>
+        <w:t>A V-shaped boom of reused PET bottles and bamboo guides surface debris to the bank, where a bar screen stops oversized items at the foot of a sloped mesh ramp. A wide-gapped deflector upstream pushes water hyacinth mats past the intake. The current does the herding, so the boom needs no energy.</w:t>
+      </w:r>
+    </w:p>
+    <w:p>
+      <w:pPr>
+        <w:spacing w:line="360" w:lineRule="auto"/>
+        <w:rPr/>
+      </w:pPr>
+      <w:r>
+        <w:rPr>
+          <w:b/>
+        </w:rPr>
+        <w:t xml:space="preserve">Lift. </w:t>
+      </w:r>
+      <w:r>
+        <w:t>A small geared DC motor, mounted above the flood line, turns a rake arm that sweeps debris up the ramp into a covered bin. It runs in short bursts and only when the camera sees plastic rather than vegetation. A sacrificial shear pin protects the gearbox, and a guard, stop switch and lockout protect people.</w:t>
+      </w:r>
+    </w:p>
+    <w:p>
+      <w:pPr>
+        <w:spacing w:line="360" w:lineRule="auto"/>
+        <w:rPr/>
+      </w:pPr>
+      <w:r>
+        <w:rPr>
+          <w:b/>
+        </w:rPr>
+        <w:t xml:space="preserve">Protect. </w:t>
+      </w:r>
+      <w:r>
+        <w:t>The chip reads motor current, ignores the start-up surge, and trips on sustained high current. A Hall sensor on the arm shaft confirms the arm is moving, which exposes slipping on greasy surfaces. After a jam it stops, reverses briefly, retries at most three times, then locks out and alerts the barangay. The motor driver defaults to off, so a crashed chip cannot leave the motor running.</w:t>
+      </w:r>
+    </w:p>
+    <w:p>
+      <w:pPr>
+        <w:spacing w:line="360" w:lineRule="auto"/>
+        <w:rPr/>
+      </w:pPr>
+      <w:r>
+        <w:rPr>
+          <w:b/>
+        </w:rPr>
+        <w:t xml:space="preserve">Count. </w:t>
+      </w:r>
+      <w:r>
+        <w:t>An ESP32-S3 camera on a post looks down at the water surface only, so no faces or houses appear. A compact object-detection model, quantized to INT8 and run with TensorFlow Lite for Microcontrollers, classifies each item. The camera views a pocket one to two meters away, so items appear large. Training photographs come from our own collection along the creek bank, labelled by students and checked by the adviser. Every week, students hand-count and weigh the bin, and that count is the accuracy test.</w:t>
+      </w:r>
+    </w:p>
+    <w:p>
+      <w:pPr>
+        <w:spacing w:line="360" w:lineRule="auto"/>
+        <w:rPr/>
+      </w:pPr>
+      <w:r>
+        <w:rPr>
+          <w:b/>
+        </w:rPr>
+        <w:t xml:space="preserve">Report. </w:t>
+      </w:r>
+      <w:r>
+        <w:t>A phone reads an offline Wi-Fi page hosted by the chip, and a script builds the weekly report and an anonymized open dataset. Each record stores class, time, water level and an image hash in an append-only log. A student volunteer tallies legible brand names from the stored photographs, since automated brand reading is not yet reliable. Plotting counts against rainfall shows whether plastic arrives in rain-driven pulses.</w:t>
       </w:r>
     </w:p>
     <w:p>
@@ -1510,7 +1508,7 @@
       <w:r>
         <w:drawing>
           <wp:inline>
-            <wp:extent cx="5669280" cy="3208812"/>
+            <wp:extent cx="5486400" cy="3105302"/>
             <wp:docPr id="2" name="Picture 2"/>
             <wp:cNvGraphicFramePr>
               <a:graphicFrameLocks noChangeAspect="1"/>
@@ -1531,7 +1529,7 @@
                   <pic:spPr>
                     <a:xfrm>
                       <a:off x="0" y="0"/>
-                      <a:ext cx="5669280" cy="3208812"/>
+                      <a:ext cx="5486400" cy="3105302"/>
                     </a:xfrm>
                     <a:prstGeom prst="rect"/>
                   </pic:spPr>
@@ -1544,88 +1542,152 @@
     </w:p>
     <w:p>
       <w:pPr>
-        <w:spacing w:line="240" w:lineRule="auto" w:after="160" w:before="0"/>
         <w:jc w:val="center"/>
       </w:pPr>
       <w:r>
         <w:rPr>
-          <w:rFonts w:ascii="Arial" w:hAnsi="Arial" w:eastAsia="Arial"/>
           <w:i/>
-          <w:sz w:val="20"/>
         </w:rPr>
         <w:t>Figure 2. The SAGIP unit at the creek bank (schematic).</w:t>
       </w:r>
     </w:p>
     <w:p>
       <w:pPr>
-        <w:spacing w:line="360" w:lineRule="auto" w:after="120" w:before="0"/>
-      </w:pPr>
-      <w:r>
-        <w:rPr>
-          <w:rFonts w:ascii="Arial" w:hAnsi="Arial" w:eastAsia="Arial"/>
-          <w:b/>
-          <w:sz w:val="22"/>
+        <w:spacing w:line="360" w:lineRule="auto"/>
+        <w:rPr/>
+      </w:pPr>
+      <w:r>
+        <w:rPr>
+          <w:b/>
+        </w:rPr>
+        <w:t xml:space="preserve">Warn (secondary). </w:t>
+      </w:r>
+      <w:r>
+        <w:t>A waterproof ultrasonic sensor measures the distance to the water surface against a painted staff gauge. It raises an LED and report alert when the level rises quickly or the bin nears capacity, and the arm stops above a set level.</w:t>
+      </w:r>
+    </w:p>
+    <w:p>
+      <w:pPr>
+        <w:spacing w:line="360" w:lineRule="auto"/>
+        <w:rPr/>
+      </w:pPr>
+      <w:r>
+        <w:rPr>
+          <w:b/>
+        </w:rPr>
+        <w:t xml:space="preserve">Power. </w:t>
+      </w:r>
+      <w:r>
+        <w:t>Planning figures, to be replaced by bench measurements. Duty-cycled electronics draw about 6 Wh per day and the arm about 0.3 Wh. A 10 W panel yields about 18 Wh per day at 3 effective sun-hours and 60% efficiency, and two 18650 cells store about 18 Wh. On cloudy days the chip lengthens its capture interval when the battery is low.</w:t>
+      </w:r>
+    </w:p>
+    <w:p>
+      <w:pPr>
+        <w:spacing w:line="360" w:lineRule="auto"/>
+        <w:rPr/>
+      </w:pPr>
+      <w:r>
+        <w:rPr>
+          <w:b/>
+        </w:rPr>
+        <w:t xml:space="preserve">Scope. </w:t>
+      </w:r>
+      <w:r>
+        <w:t>SAGIP lifts light floating debris such as bottles, sachets, bags, foam and cups. Heavy or tangled items, hyacinth mats, sunken waste, sediment, oil and dissolved pollutants fall outside its reach, so we report a measured capture rate instead of claiming a clean creek.</w:t>
+      </w:r>
+    </w:p>
+    <w:p>
+      <w:pPr>
+        <w:spacing w:line="360" w:lineRule="auto"/>
+        <w:rPr/>
+      </w:pPr>
+      <w:r>
+        <w:rPr>
+          <w:b/>
         </w:rPr>
         <w:t xml:space="preserve">In plain words. </w:t>
       </w:r>
       <w:r>
-        <w:rPr>
-          <w:rFonts w:ascii="Arial" w:hAnsi="Arial" w:eastAsia="Arial"/>
-          <w:sz w:val="22"/>
-        </w:rPr>
-        <w:t>Picture a sanitation worker who has sorted trash for years and can tell a PET bottle from a sachet at a glance. The model is that skill, saved as a file of numbers. Quantization rounds the numbers to whole 8-bit values, like a gradebook recording 87 and not 87.3416, so the file fits in the chip's flash memory. No internet is needed and nothing leaves the creek.</w:t>
-      </w:r>
-    </w:p>
-    <w:p>
-      <w:pPr>
-        <w:keepNext/>
-        <w:spacing w:line="360" w:lineRule="auto" w:after="80" w:before="200"/>
-      </w:pPr>
-      <w:r>
-        <w:rPr>
-          <w:rFonts w:ascii="Arial" w:hAnsi="Arial" w:eastAsia="Arial"/>
-          <w:b/>
-          <w:sz w:val="22"/>
-        </w:rPr>
-        <w:t>6. How will you implement this?</w:t>
-      </w:r>
-    </w:p>
-    <w:p>
-      <w:pPr>
-        <w:keepNext/>
-        <w:spacing w:line="360" w:lineRule="auto" w:after="40" w:before="0"/>
-      </w:pPr>
-      <w:r>
-        <w:rPr>
-          <w:rFonts w:ascii="Arial" w:hAnsi="Arial" w:eastAsia="Arial"/>
-          <w:b/>
-          <w:sz w:val="22"/>
-        </w:rPr>
-        <w:t>Resources</w:t>
-      </w:r>
-    </w:p>
-    <w:p>
-      <w:pPr>
-        <w:spacing w:line="360" w:lineRule="auto" w:after="60" w:before="0"/>
-      </w:pPr>
-      <w:r>
-        <w:rPr>
-          <w:rFonts w:ascii="Arial" w:hAnsi="Arial" w:eastAsia="Arial"/>
-          <w:sz w:val="22"/>
-        </w:rPr>
+        <w:t>Picture a sanitation worker who can tell a PET bottle from a sachet at a glance. The model is that skill, saved as a file of numbers. Quantization rounds the numbers to whole 8-bit values, like a gradebook recording 87 and not 87.3416, so the file fits in the chip's memory. No internet is needed.</w:t>
+      </w:r>
+    </w:p>
+    <w:p>
+      <w:pPr>
+        <w:rPr/>
+      </w:pPr>
+      <w:r>
+        <w:rPr>
+          <w:rtl w:val="0"/>
+        </w:rPr>
+      </w:r>
+    </w:p>
+    <w:p>
+      <w:pPr>
+        <w:numPr>
+          <w:ilvl w:val="0"/>
+          <w:numId w:val="6"/>
+        </w:numPr>
+        <w:ind w:left="720" w:hanging="360"/>
+        <w:rPr>
+          <w:b w:val="1"/>
+          <w:bCs w:val="1"/>
+        </w:rPr>
+      </w:pPr>
+      <w:r>
+        <w:rPr>
+          <w:b w:val="1"/>
+          <w:bCs w:val="1"/>
+          <w:rtl w:val="0"/>
+        </w:rPr>
+        <w:t xml:space="preserve">How will you implement this? </w:t>
+      </w:r>
+    </w:p>
+    <w:p>
+      <w:pPr>
+        <w:rPr/>
+      </w:pPr>
+      <w:r>
+        <w:rPr>
+          <w:rtl w:val="0"/>
+        </w:rPr>
+      </w:r>
+    </w:p>
+    <w:p>
+      <w:pPr>
+        <w:spacing w:line="360" w:lineRule="auto"/>
+        <w:rPr/>
+      </w:pPr>
+      <w:r>
         <w:t>The pilot unit costs about PHP 6,000 and is built in three stages, each bought only after the previous test passes.</w:t>
+      </w:r>
+    </w:p>
+    <w:p>
+      <w:pPr>
+        <w:numPr>
+          <w:ilvl w:val="0"/>
+          <w:numId w:val="3"/>
+        </w:numPr>
+        <w:spacing w:line="360" w:lineRule="auto"/>
+        <w:ind w:left="1440" w:hanging="360"/>
+        <w:rPr/>
+      </w:pPr>
+      <w:r>
+        <w:rPr>
+          <w:b/>
+        </w:rPr>
+        <w:t xml:space="preserve">Resources: </w:t>
       </w:r>
     </w:p>
     <w:tbl>
       <w:tblPr>
         <w:tblW w:type="auto" w:w="0"/>
         <w:tblBorders>
-          <w:top w:val="single" w:sz="4" w:space="0" w:color="808080"/>
-          <w:left w:val="single" w:sz="4" w:space="0" w:color="808080"/>
-          <w:bottom w:val="single" w:sz="4" w:space="0" w:color="808080"/>
-          <w:right w:val="single" w:sz="4" w:space="0" w:color="808080"/>
-          <w:insideH w:val="single" w:sz="4" w:space="0" w:color="808080"/>
-          <w:insideV w:val="single" w:sz="4" w:space="0" w:color="808080"/>
+          <w:top w:val="single" w:sz="8" w:space="0" w:color="000000"/>
+          <w:left w:val="single" w:sz="8" w:space="0" w:color="000000"/>
+          <w:bottom w:val="single" w:sz="8" w:space="0" w:color="000000"/>
+          <w:right w:val="single" w:sz="8" w:space="0" w:color="000000"/>
+          <w:insideH w:val="single" w:sz="8" w:space="0" w:color="000000"/>
+          <w:insideV w:val="single" w:sz="8" w:space="0" w:color="000000"/>
         </w:tblBorders>
         <w:tblLayout w:type="fixed"/>
         <w:tblLook w:firstColumn="1" w:firstRow="1" w:lastColumn="0" w:lastRow="0" w:noHBand="0" w:noVBand="1" w:val="04A0"/>
@@ -1638,7 +1700,6 @@
         <w:tc>
           <w:tcPr>
             <w:tcW w:type="dxa" w:w="7776"/>
-            <w:shd w:val="clear" w:color="auto" w:fill="E7EEF4"/>
           </w:tcPr>
           <w:p>
             <w:pPr>
@@ -1646,9 +1707,7 @@
             </w:pPr>
             <w:r>
               <w:rPr>
-                <w:rFonts w:ascii="Arial" w:hAnsi="Arial" w:eastAsia="Arial"/>
                 <w:b/>
-                <w:sz w:val="20"/>
               </w:rPr>
               <w:t>Item</w:t>
             </w:r>
@@ -1657,7 +1716,6 @@
         <w:tc>
           <w:tcPr>
             <w:tcW w:type="dxa" w:w="1584"/>
-            <w:shd w:val="clear" w:color="auto" w:fill="E7EEF4"/>
           </w:tcPr>
           <w:p>
             <w:pPr>
@@ -1665,9 +1723,7 @@
             </w:pPr>
             <w:r>
               <w:rPr>
-                <w:rFonts w:ascii="Arial" w:hAnsi="Arial" w:eastAsia="Arial"/>
                 <w:b/>
-                <w:sz w:val="20"/>
               </w:rPr>
               <w:t>PHP</w:t>
             </w:r>
@@ -1684,10 +1740,6 @@
               <w:spacing w:line="240" w:lineRule="auto" w:after="40" w:before="40"/>
             </w:pPr>
             <w:r>
-              <w:rPr>
-                <w:rFonts w:ascii="Arial" w:hAnsi="Arial" w:eastAsia="Arial"/>
-                <w:sz w:val="20"/>
-              </w:rPr>
               <w:t>ESP32-S3 camera board, microSD card, sealed enclosure</w:t>
             </w:r>
           </w:p>
@@ -1702,10 +1754,6 @@
               <w:jc w:val="right"/>
             </w:pPr>
             <w:r>
-              <w:rPr>
-                <w:rFonts w:ascii="Arial" w:hAnsi="Arial" w:eastAsia="Arial"/>
-                <w:sz w:val="20"/>
-              </w:rPr>
               <w:t>1,800</w:t>
             </w:r>
           </w:p>
@@ -1721,10 +1769,6 @@
               <w:spacing w:line="240" w:lineRule="auto" w:after="40" w:before="40"/>
             </w:pPr>
             <w:r>
-              <w:rPr>
-                <w:rFonts w:ascii="Arial" w:hAnsi="Arial" w:eastAsia="Arial"/>
-                <w:sz w:val="20"/>
-              </w:rPr>
               <w:t>Solar panel (6 to 10 W), charge controller, two 18650 cells, converter</w:t>
             </w:r>
           </w:p>
@@ -1739,10 +1783,6 @@
               <w:jc w:val="right"/>
             </w:pPr>
             <w:r>
-              <w:rPr>
-                <w:rFonts w:ascii="Arial" w:hAnsi="Arial" w:eastAsia="Arial"/>
-                <w:sz w:val="20"/>
-              </w:rPr>
               <w:t>1,300</w:t>
             </w:r>
           </w:p>
@@ -1758,10 +1798,6 @@
               <w:spacing w:line="240" w:lineRule="auto" w:after="40" w:before="40"/>
             </w:pPr>
             <w:r>
-              <w:rPr>
-                <w:rFonts w:ascii="Arial" w:hAnsi="Arial" w:eastAsia="Arial"/>
-                <w:sz w:val="20"/>
-              </w:rPr>
               <w:t>Boom rope and net, anchor and post, bin and staff gauge, wiring and fuse</w:t>
             </w:r>
           </w:p>
@@ -1776,10 +1812,6 @@
               <w:jc w:val="right"/>
             </w:pPr>
             <w:r>
-              <w:rPr>
-                <w:rFonts w:ascii="Arial" w:hAnsi="Arial" w:eastAsia="Arial"/>
-                <w:sz w:val="20"/>
-              </w:rPr>
               <w:t>1,200</w:t>
             </w:r>
           </w:p>
@@ -1795,10 +1827,6 @@
               <w:spacing w:line="240" w:lineRule="auto" w:after="40" w:before="40"/>
             </w:pPr>
             <w:r>
-              <w:rPr>
-                <w:rFonts w:ascii="Arial" w:hAnsi="Arial" w:eastAsia="Arial"/>
-                <w:sz w:val="20"/>
-              </w:rPr>
               <w:t>Waterproof ultrasonic level sensor</w:t>
             </w:r>
           </w:p>
@@ -1813,9 +1841,104 @@
               <w:jc w:val="right"/>
             </w:pPr>
             <w:r>
+              <w:t>350</w:t>
+            </w:r>
+          </w:p>
+        </w:tc>
+      </w:tr>
+      <w:tr>
+        <w:tc>
+          <w:tcPr>
+            <w:tcW w:type="dxa" w:w="7776"/>
+          </w:tcPr>
+          <w:p>
+            <w:pPr>
+              <w:spacing w:line="240" w:lineRule="auto" w:after="40" w:before="40"/>
+            </w:pPr>
+            <w:r>
+              <w:t>Geared motor, driver, current and motion sensing, ramp, rake arm, bar screen, spare shear pins</w:t>
+            </w:r>
+          </w:p>
+        </w:tc>
+        <w:tc>
+          <w:tcPr>
+            <w:tcW w:type="dxa" w:w="1584"/>
+          </w:tcPr>
+          <w:p>
+            <w:pPr>
+              <w:spacing w:line="240" w:lineRule="auto" w:after="40" w:before="40"/>
+              <w:jc w:val="right"/>
+            </w:pPr>
+            <w:r>
+              <w:t>1,000</w:t>
+            </w:r>
+          </w:p>
+        </w:tc>
+      </w:tr>
+      <w:tr>
+        <w:tc>
+          <w:tcPr>
+            <w:tcW w:type="dxa" w:w="7776"/>
+          </w:tcPr>
+          <w:p>
+            <w:pPr>
+              <w:spacing w:line="240" w:lineRule="auto" w:after="40" w:before="40"/>
+            </w:pPr>
+            <w:r>
               <w:rPr>
-                <w:rFonts w:ascii="Arial" w:hAnsi="Arial" w:eastAsia="Arial"/>
-                <w:sz w:val="20"/>
+                <w:b/>
+              </w:rPr>
+              <w:t>Subtotal</w:t>
+            </w:r>
+          </w:p>
+        </w:tc>
+        <w:tc>
+          <w:tcPr>
+            <w:tcW w:type="dxa" w:w="1584"/>
+          </w:tcPr>
+          <w:p>
+            <w:pPr>
+              <w:spacing w:line="240" w:lineRule="auto" w:after="40" w:before="40"/>
+              <w:jc w:val="right"/>
+            </w:pPr>
+            <w:r>
+              <w:rPr>
+                <w:b/>
+              </w:rPr>
+              <w:t>5,650</w:t>
+            </w:r>
+          </w:p>
+        </w:tc>
+      </w:tr>
+      <w:tr>
+        <w:tc>
+          <w:tcPr>
+            <w:tcW w:type="dxa" w:w="7776"/>
+          </w:tcPr>
+          <w:p>
+            <w:pPr>
+              <w:spacing w:line="240" w:lineRule="auto" w:after="40" w:before="40"/>
+            </w:pPr>
+            <w:r>
+              <w:rPr>
+                <w:b/>
+              </w:rPr>
+              <w:t>Contingency</w:t>
+            </w:r>
+          </w:p>
+        </w:tc>
+        <w:tc>
+          <w:tcPr>
+            <w:tcW w:type="dxa" w:w="1584"/>
+          </w:tcPr>
+          <w:p>
+            <w:pPr>
+              <w:spacing w:line="240" w:lineRule="auto" w:after="40" w:before="40"/>
+              <w:jc w:val="right"/>
+            </w:pPr>
+            <w:r>
+              <w:rPr>
+                <w:b/>
               </w:rPr>
               <w:t>350</w:t>
             </w:r>
@@ -1833,10 +1956,9 @@
             </w:pPr>
             <w:r>
               <w:rPr>
-                <w:rFonts w:ascii="Arial" w:hAnsi="Arial" w:eastAsia="Arial"/>
-                <w:sz w:val="20"/>
+                <w:b/>
               </w:rPr>
-              <w:t>Geared motor, driver, current and motion sensing, ramp, rake arm, bar screen, spare shear pins</w:t>
+              <w:t>Total</w:t>
             </w:r>
           </w:p>
         </w:tc>
@@ -1851,125 +1973,7 @@
             </w:pPr>
             <w:r>
               <w:rPr>
-                <w:rFonts w:ascii="Arial" w:hAnsi="Arial" w:eastAsia="Arial"/>
-                <w:sz w:val="20"/>
-              </w:rPr>
-              <w:t>1,000</w:t>
-            </w:r>
-          </w:p>
-        </w:tc>
-      </w:tr>
-      <w:tr>
-        <w:tc>
-          <w:tcPr>
-            <w:tcW w:type="dxa" w:w="7776"/>
-          </w:tcPr>
-          <w:p>
-            <w:pPr>
-              <w:spacing w:line="240" w:lineRule="auto" w:after="40" w:before="40"/>
-            </w:pPr>
-            <w:r>
-              <w:rPr>
-                <w:rFonts w:ascii="Arial" w:hAnsi="Arial" w:eastAsia="Arial"/>
                 <w:b/>
-                <w:sz w:val="20"/>
-              </w:rPr>
-              <w:t>Subtotal</w:t>
-            </w:r>
-          </w:p>
-        </w:tc>
-        <w:tc>
-          <w:tcPr>
-            <w:tcW w:type="dxa" w:w="1584"/>
-          </w:tcPr>
-          <w:p>
-            <w:pPr>
-              <w:spacing w:line="240" w:lineRule="auto" w:after="40" w:before="40"/>
-              <w:jc w:val="right"/>
-            </w:pPr>
-            <w:r>
-              <w:rPr>
-                <w:rFonts w:ascii="Arial" w:hAnsi="Arial" w:eastAsia="Arial"/>
-                <w:b/>
-                <w:sz w:val="20"/>
-              </w:rPr>
-              <w:t>5,650</w:t>
-            </w:r>
-          </w:p>
-        </w:tc>
-      </w:tr>
-      <w:tr>
-        <w:tc>
-          <w:tcPr>
-            <w:tcW w:type="dxa" w:w="7776"/>
-          </w:tcPr>
-          <w:p>
-            <w:pPr>
-              <w:spacing w:line="240" w:lineRule="auto" w:after="40" w:before="40"/>
-            </w:pPr>
-            <w:r>
-              <w:rPr>
-                <w:rFonts w:ascii="Arial" w:hAnsi="Arial" w:eastAsia="Arial"/>
-                <w:b/>
-                <w:sz w:val="20"/>
-              </w:rPr>
-              <w:t>Contingency</w:t>
-            </w:r>
-          </w:p>
-        </w:tc>
-        <w:tc>
-          <w:tcPr>
-            <w:tcW w:type="dxa" w:w="1584"/>
-          </w:tcPr>
-          <w:p>
-            <w:pPr>
-              <w:spacing w:line="240" w:lineRule="auto" w:after="40" w:before="40"/>
-              <w:jc w:val="right"/>
-            </w:pPr>
-            <w:r>
-              <w:rPr>
-                <w:rFonts w:ascii="Arial" w:hAnsi="Arial" w:eastAsia="Arial"/>
-                <w:b/>
-                <w:sz w:val="20"/>
-              </w:rPr>
-              <w:t>350</w:t>
-            </w:r>
-          </w:p>
-        </w:tc>
-      </w:tr>
-      <w:tr>
-        <w:tc>
-          <w:tcPr>
-            <w:tcW w:type="dxa" w:w="7776"/>
-          </w:tcPr>
-          <w:p>
-            <w:pPr>
-              <w:spacing w:line="240" w:lineRule="auto" w:after="40" w:before="40"/>
-            </w:pPr>
-            <w:r>
-              <w:rPr>
-                <w:rFonts w:ascii="Arial" w:hAnsi="Arial" w:eastAsia="Arial"/>
-                <w:b/>
-                <w:sz w:val="20"/>
-              </w:rPr>
-              <w:t>Total</w:t>
-            </w:r>
-          </w:p>
-        </w:tc>
-        <w:tc>
-          <w:tcPr>
-            <w:tcW w:type="dxa" w:w="1584"/>
-          </w:tcPr>
-          <w:p>
-            <w:pPr>
-              <w:spacing w:line="240" w:lineRule="auto" w:after="40" w:before="40"/>
-              <w:jc w:val="right"/>
-            </w:pPr>
-            <w:r>
-              <w:rPr>
-                <w:rFonts w:ascii="Arial" w:hAnsi="Arial" w:eastAsia="Arial"/>
-                <w:b/>
-                <w:sz w:val="20"/>
               </w:rPr>
               <w:t>6,000</w:t>
             </w:r>
@@ -1977,615 +1981,576 @@
         </w:tc>
       </w:tr>
     </w:tbl>
-    <w:p>
-      <w:pPr>
-        <w:spacing w:after="0"/>
-      </w:pPr>
-    </w:p>
-    <w:p>
-      <w:pPr>
-        <w:spacing w:line="360" w:lineRule="auto" w:after="120" w:before="0"/>
-      </w:pPr>
-      <w:r>
-        <w:rPr>
-          <w:rFonts w:ascii="Arial" w:hAnsi="Arial" w:eastAsia="Arial"/>
-          <w:b/>
-          <w:sz w:val="22"/>
+    <w:p/>
+    <w:p>
+      <w:pPr>
+        <w:spacing w:line="360" w:lineRule="auto"/>
+        <w:rPr/>
+      </w:pPr>
+      <w:r>
+        <w:rPr>
+          <w:b/>
         </w:rPr>
         <w:t xml:space="preserve">Tools. </w:t>
       </w:r>
       <w:r>
-        <w:rPr>
-          <w:rFonts w:ascii="Arial" w:hAnsi="Arial" w:eastAsia="Arial"/>
-          <w:sz w:val="22"/>
-        </w:rPr>
-        <w:t>Arduino IDE or PlatformIO, Python with TensorFlow Lite for Microcontrollers, a borrowed soldering iron and multimeter, and our phones for photography. All prices are estimates to confirm locally.</w:t>
-      </w:r>
-    </w:p>
-    <w:p>
-      <w:pPr>
-        <w:spacing w:line="360" w:lineRule="auto" w:after="120" w:before="0"/>
-      </w:pPr>
-      <w:r>
-        <w:rPr>
-          <w:rFonts w:ascii="Arial" w:hAnsi="Arial" w:eastAsia="Arial"/>
-          <w:b/>
-          <w:sz w:val="22"/>
+        <w:t>Arduino IDE or PlatformIO, Python with TensorFlow Lite, a borrowed soldering iron and multimeter, and our phones for photography. All prices are estimates to confirm locally.</w:t>
+      </w:r>
+    </w:p>
+    <w:p>
+      <w:pPr>
+        <w:spacing w:line="360" w:lineRule="auto"/>
+        <w:rPr/>
+      </w:pPr>
+      <w:r>
+        <w:rPr>
+          <w:b/>
         </w:rPr>
         <w:t>Stage 1, bench (about PHP 1,800).</w:t>
       </w:r>
       <w:r>
-        <w:rPr>
-          <w:rFonts w:ascii="Arial" w:hAnsi="Arial" w:eastAsia="Arial"/>
-          <w:sz w:val="22"/>
-        </w:rPr>
         <w:t xml:space="preserve"> Train and test the model and measure power draw. Gate: precision and recall on held-out photographs meet the target.</w:t>
       </w:r>
     </w:p>
     <w:p>
       <w:pPr>
-        <w:spacing w:line="360" w:lineRule="auto" w:after="120" w:before="0"/>
-      </w:pPr>
-      <w:r>
-        <w:rPr>
-          <w:rFonts w:ascii="Arial" w:hAnsi="Arial" w:eastAsia="Arial"/>
-          <w:b/>
-          <w:sz w:val="22"/>
+        <w:spacing w:line="360" w:lineRule="auto"/>
+        <w:rPr/>
+      </w:pPr>
+      <w:r>
+        <w:rPr>
+          <w:b/>
         </w:rPr>
         <w:t>Stage 2, passive trap (about PHP 2,500).</w:t>
       </w:r>
       <w:r>
-        <w:rPr>
-          <w:rFonts w:ascii="Arial" w:hAnsi="Arial" w:eastAsia="Arial"/>
-          <w:sz w:val="22"/>
-        </w:rPr>
         <w:t xml:space="preserve"> Install the boom, deflector, screen, ramp, bin, post and solar supply. Gate: the boom survives </w:t>
       </w:r>
       <w:r>
         <w:rPr>
-          <w:rFonts w:ascii="Arial" w:hAnsi="Arial" w:eastAsia="Arial"/>
-          <w:sz w:val="22"/>
           <w:highlight w:val="yellow"/>
         </w:rPr>
         <w:t>[N]</w:t>
       </w:r>
       <w:r>
-        <w:rPr>
-          <w:rFonts w:ascii="Arial" w:hAnsi="Arial" w:eastAsia="Arial"/>
-          <w:sz w:val="22"/>
-        </w:rPr>
         <w:t xml:space="preserve"> rain events and weekly counts fall within 15% of hand counts.</w:t>
       </w:r>
     </w:p>
     <w:p>
       <w:pPr>
-        <w:spacing w:line="360" w:lineRule="auto" w:after="120" w:before="0"/>
-      </w:pPr>
-      <w:r>
-        <w:rPr>
-          <w:rFonts w:ascii="Arial" w:hAnsi="Arial" w:eastAsia="Arial"/>
-          <w:b/>
-          <w:sz w:val="22"/>
+        <w:spacing w:line="360" w:lineRule="auto"/>
+        <w:rPr/>
+      </w:pPr>
+      <w:r>
+        <w:rPr>
+          <w:b/>
         </w:rPr>
         <w:t>Stage 3, arm and sensor (about PHP 1,350).</w:t>
       </w:r>
       <w:r>
-        <w:rPr>
-          <w:rFonts w:ascii="Arial" w:hAnsi="Arial" w:eastAsia="Arial"/>
-          <w:sz w:val="22"/>
-        </w:rPr>
         <w:t xml:space="preserve"> Fit the motor, jam protection and level sensor. Gate: a wet bench test with real hyacinth, estero silt and a little cooking oil, then solar-only lifts at the target jam rate.</w:t>
       </w:r>
     </w:p>
     <w:p>
       <w:pPr>
-        <w:spacing w:line="360" w:lineRule="auto" w:after="120" w:before="0"/>
-      </w:pPr>
-      <w:r>
-        <w:rPr>
-          <w:rFonts w:ascii="Arial" w:hAnsi="Arial" w:eastAsia="Arial"/>
-          <w:b/>
-          <w:sz w:val="22"/>
+        <w:spacing w:line="360" w:lineRule="auto"/>
+        <w:rPr/>
+      </w:pPr>
+      <w:r>
+        <w:rPr>
+          <w:b/>
         </w:rPr>
         <w:t xml:space="preserve">Timeline. </w:t>
       </w:r>
       <w:r>
-        <w:rPr>
-          <w:rFonts w:ascii="Arial" w:hAnsi="Arial" w:eastAsia="Arial"/>
-          <w:sz w:val="22"/>
-        </w:rPr>
         <w:t>Site visit, barangay letter and starter dataset by November 2. Model and a baseline week by November 20. Early results on December 7 if shortlisted. Full pilot from December to February. Build guide and further sites by March 2027.</w:t>
       </w:r>
     </w:p>
     <w:p>
       <w:pPr>
-        <w:keepNext/>
-        <w:spacing w:line="360" w:lineRule="auto" w:after="40" w:before="0"/>
-      </w:pPr>
-      <w:r>
-        <w:rPr>
-          <w:rFonts w:ascii="Arial" w:hAnsi="Arial" w:eastAsia="Arial"/>
-          <w:b/>
-          <w:sz w:val="22"/>
-        </w:rPr>
-        <w:t>Stakeholders</w:t>
-      </w:r>
-    </w:p>
-    <w:p>
-      <w:pPr>
-        <w:spacing w:line="360" w:lineRule="auto" w:after="60" w:before="0"/>
-      </w:pPr>
-      <w:r>
-        <w:rPr>
-          <w:rFonts w:ascii="Arial" w:hAnsi="Arial" w:eastAsia="Arial"/>
-          <w:b/>
-          <w:sz w:val="22"/>
+        <w:numPr>
+          <w:ilvl w:val="0"/>
+          <w:numId w:val="3"/>
+        </w:numPr>
+        <w:spacing w:line="360" w:lineRule="auto"/>
+        <w:ind w:left="1440" w:hanging="360"/>
+        <w:rPr/>
+      </w:pPr>
+      <w:r>
+        <w:rPr>
+          <w:b/>
+        </w:rPr>
+        <w:t xml:space="preserve">Stakeholders: </w:t>
+      </w:r>
+    </w:p>
+    <w:p>
+      <w:pPr>
+        <w:spacing w:line="360" w:lineRule="auto"/>
+        <w:rPr/>
+      </w:pPr>
+      <w:r>
+        <w:rPr>
+          <w:b/>
         </w:rPr>
         <w:t>Barangay captain and sanitation officers:</w:t>
       </w:r>
       <w:r>
-        <w:rPr>
-          <w:rFonts w:ascii="Arial" w:hAnsi="Arial" w:eastAsia="Arial"/>
-          <w:sz w:val="22"/>
-        </w:rPr>
         <w:t xml:space="preserve"> site approval, weekly emptying, and use of the reports under a one-page maintenance agreement.</w:t>
       </w:r>
     </w:p>
     <w:p>
       <w:pPr>
-        <w:spacing w:line="360" w:lineRule="auto" w:after="60" w:before="0"/>
-      </w:pPr>
-      <w:r>
-        <w:rPr>
-          <w:rFonts w:ascii="Arial" w:hAnsi="Arial" w:eastAsia="Arial"/>
-          <w:b/>
-          <w:sz w:val="22"/>
+        <w:spacing w:line="360" w:lineRule="auto"/>
+        <w:rPr/>
+      </w:pPr>
+      <w:r>
+        <w:rPr>
+          <w:b/>
         </w:rPr>
         <w:t>City solid-waste office and DENR:</w:t>
       </w:r>
       <w:r>
-        <w:rPr>
-          <w:rFonts w:ascii="Arial" w:hAnsi="Arial" w:eastAsia="Arial"/>
-          <w:sz w:val="22"/>
-        </w:rPr>
         <w:t xml:space="preserve"> use of the data and fit with existing estero programs </w:t>
       </w:r>
       <w:r>
         <w:rPr>
-          <w:rFonts w:ascii="Arial" w:hAnsi="Arial" w:eastAsia="Arial"/>
-          <w:sz w:val="22"/>
           <w:highlight w:val="yellow"/>
         </w:rPr>
         <w:t>[VERIFY: current programs]</w:t>
       </w:r>
       <w:r>
-        <w:rPr>
-          <w:rFonts w:ascii="Arial" w:hAnsi="Arial" w:eastAsia="Arial"/>
-          <w:sz w:val="22"/>
-        </w:rPr>
         <w:t>.</w:t>
       </w:r>
     </w:p>
     <w:p>
       <w:pPr>
-        <w:spacing w:line="360" w:lineRule="auto" w:after="60" w:before="0"/>
-      </w:pPr>
-      <w:r>
-        <w:rPr>
-          <w:rFonts w:ascii="Arial" w:hAnsi="Arial" w:eastAsia="Arial"/>
-          <w:b/>
-          <w:sz w:val="22"/>
+        <w:spacing w:line="360" w:lineRule="auto"/>
+        <w:rPr/>
+      </w:pPr>
+      <w:r>
+        <w:rPr>
+          <w:b/>
         </w:rPr>
         <w:t>Adviser and school head:</w:t>
       </w:r>
       <w:r>
-        <w:rPr>
-          <w:rFonts w:ascii="Arial" w:hAnsi="Arial" w:eastAsia="Arial"/>
-          <w:sz w:val="22"/>
-        </w:rPr>
         <w:t xml:space="preserve"> supervision and safety sign-off.</w:t>
       </w:r>
     </w:p>
     <w:p>
       <w:pPr>
-        <w:spacing w:line="360" w:lineRule="auto" w:after="60" w:before="0"/>
-      </w:pPr>
-      <w:r>
-        <w:rPr>
-          <w:rFonts w:ascii="Arial" w:hAnsi="Arial" w:eastAsia="Arial"/>
-          <w:b/>
-          <w:sz w:val="22"/>
+        <w:spacing w:line="360" w:lineRule="auto"/>
+        <w:rPr/>
+      </w:pPr>
+      <w:r>
+        <w:rPr>
+          <w:b/>
         </w:rPr>
         <w:t>Students and residents:</w:t>
       </w:r>
       <w:r>
-        <w:rPr>
-          <w:rFonts w:ascii="Arial" w:hAnsi="Arial" w:eastAsia="Arial"/>
-          <w:sz w:val="22"/>
-        </w:rPr>
         <w:t xml:space="preserve"> students build, label, count and report. Residents give consent and help keep the site clear.</w:t>
       </w:r>
     </w:p>
     <w:p>
       <w:pPr>
-        <w:keepNext/>
-        <w:spacing w:line="360" w:lineRule="auto" w:after="40" w:before="0"/>
-      </w:pPr>
-      <w:r>
-        <w:rPr>
-          <w:rFonts w:ascii="Arial" w:hAnsi="Arial" w:eastAsia="Arial"/>
-          <w:b/>
-          <w:sz w:val="22"/>
-        </w:rPr>
-        <w:t>Risks and mitigation</w:t>
-      </w:r>
-    </w:p>
-    <w:p>
-      <w:pPr>
-        <w:spacing w:line="360" w:lineRule="auto" w:after="60" w:before="0"/>
-      </w:pPr>
-      <w:r>
-        <w:rPr>
-          <w:rFonts w:ascii="Arial" w:hAnsi="Arial" w:eastAsia="Arial"/>
-          <w:b/>
-          <w:sz w:val="22"/>
+        <w:numPr>
+          <w:ilvl w:val="0"/>
+          <w:numId w:val="3"/>
+        </w:numPr>
+        <w:spacing w:line="360" w:lineRule="auto"/>
+        <w:ind w:left="1440" w:hanging="360"/>
+        <w:rPr/>
+      </w:pPr>
+      <w:r>
+        <w:rPr>
+          <w:b/>
+        </w:rPr>
+        <w:t xml:space="preserve">Risks &amp; Mitigation: </w:t>
+      </w:r>
+    </w:p>
+    <w:p>
+      <w:pPr>
+        <w:spacing w:line="360" w:lineRule="auto"/>
+        <w:rPr/>
+      </w:pPr>
+      <w:r>
+        <w:rPr>
+          <w:b/>
         </w:rPr>
         <w:t>Hyacinth mats:</w:t>
       </w:r>
       <w:r>
-        <w:rPr>
-          <w:rFonts w:ascii="Arial" w:hAnsi="Arial" w:eastAsia="Arial"/>
-          <w:sz w:val="22"/>
-        </w:rPr>
         <w:t xml:space="preserve"> a deflector, a vegetation class that stops the arm, and daily screen clearing.</w:t>
       </w:r>
     </w:p>
     <w:p>
       <w:pPr>
-        <w:spacing w:line="360" w:lineRule="auto" w:after="60" w:before="0"/>
-      </w:pPr>
-      <w:r>
-        <w:rPr>
-          <w:rFonts w:ascii="Arial" w:hAnsi="Arial" w:eastAsia="Arial"/>
-          <w:b/>
-          <w:sz w:val="22"/>
+        <w:spacing w:line="360" w:lineRule="auto"/>
+        <w:rPr/>
+      </w:pPr>
+      <w:r>
+        <w:rPr>
+          <w:b/>
         </w:rPr>
         <w:t>Jams and burnout:</w:t>
       </w:r>
       <w:r>
-        <w:rPr>
-          <w:rFonts w:ascii="Arial" w:hAnsi="Arial" w:eastAsia="Arial"/>
-          <w:sz w:val="22"/>
-        </w:rPr>
         <w:t xml:space="preserve"> shear pin, current and Hall sensing, three retries, driver off by default.</w:t>
       </w:r>
     </w:p>
     <w:p>
       <w:pPr>
-        <w:spacing w:line="360" w:lineRule="auto" w:after="60" w:before="0"/>
-      </w:pPr>
-      <w:r>
-        <w:rPr>
-          <w:rFonts w:ascii="Arial" w:hAnsi="Arial" w:eastAsia="Arial"/>
-          <w:b/>
-          <w:sz w:val="22"/>
+        <w:spacing w:line="360" w:lineRule="auto"/>
+        <w:rPr/>
+      </w:pPr>
+      <w:r>
+        <w:rPr>
+          <w:b/>
         </w:rPr>
         <w:t>Oil and silt:</w:t>
       </w:r>
       <w:r>
-        <w:rPr>
-          <w:rFonts w:ascii="Arial" w:hAnsi="Arial" w:eastAsia="Arial"/>
-          <w:sz w:val="22"/>
-        </w:rPr>
         <w:t xml:space="preserve"> motor mounted high, sealed bearings with marine grease, hooded lens.</w:t>
       </w:r>
     </w:p>
     <w:p>
       <w:pPr>
-        <w:spacing w:line="360" w:lineRule="auto" w:after="60" w:before="0"/>
-      </w:pPr>
-      <w:r>
-        <w:rPr>
-          <w:rFonts w:ascii="Arial" w:hAnsi="Arial" w:eastAsia="Arial"/>
-          <w:b/>
-          <w:sz w:val="22"/>
+        <w:spacing w:line="360" w:lineRule="auto"/>
+        <w:rPr/>
+      </w:pPr>
+      <w:r>
+        <w:rPr>
+          <w:b/>
         </w:rPr>
         <w:t>Model errors in new light or water:</w:t>
       </w:r>
       <w:r>
-        <w:rPr>
-          <w:rFonts w:ascii="Arial" w:hAnsi="Arial" w:eastAsia="Arial"/>
-          <w:sz w:val="22"/>
-        </w:rPr>
         <w:t xml:space="preserve"> test on unseen places and keep the weekly hand count.</w:t>
       </w:r>
     </w:p>
     <w:p>
       <w:pPr>
-        <w:spacing w:line="360" w:lineRule="auto" w:after="60" w:before="0"/>
-      </w:pPr>
-      <w:r>
-        <w:rPr>
-          <w:rFonts w:ascii="Arial" w:hAnsi="Arial" w:eastAsia="Arial"/>
-          <w:b/>
-          <w:sz w:val="22"/>
+        <w:spacing w:line="360" w:lineRule="auto"/>
+        <w:rPr/>
+      </w:pPr>
+      <w:r>
+        <w:rPr>
+          <w:b/>
         </w:rPr>
         <w:t>Arm failure:</w:t>
       </w:r>
       <w:r>
-        <w:rPr>
-          <w:rFonts w:ascii="Arial" w:hAnsi="Arial" w:eastAsia="Arial"/>
-          <w:sz w:val="22"/>
-        </w:rPr>
         <w:t xml:space="preserve"> the boom, bin and camera still work, so the data pilot survives.</w:t>
       </w:r>
     </w:p>
     <w:p>
       <w:pPr>
-        <w:spacing w:line="360" w:lineRule="auto" w:after="60" w:before="0"/>
-      </w:pPr>
-      <w:r>
-        <w:rPr>
-          <w:rFonts w:ascii="Arial" w:hAnsi="Arial" w:eastAsia="Arial"/>
-          <w:b/>
-          <w:sz w:val="22"/>
+        <w:spacing w:line="360" w:lineRule="auto"/>
+        <w:rPr/>
+      </w:pPr>
+      <w:r>
+        <w:rPr>
+          <w:b/>
         </w:rPr>
         <w:t>Safety and privacy:</w:t>
       </w:r>
       <w:r>
-        <w:rPr>
-          <w:rFonts w:ascii="Arial" w:hAnsi="Arial" w:eastAsia="Arial"/>
-          <w:sz w:val="22"/>
-        </w:rPr>
         <w:t xml:space="preserve"> no student enters the water, the arm is guarded, and the camera sees the water only.</w:t>
       </w:r>
     </w:p>
     <w:p>
       <w:pPr>
-        <w:spacing w:line="360" w:lineRule="auto" w:after="60" w:before="0"/>
-      </w:pPr>
-      <w:r>
-        <w:rPr>
-          <w:rFonts w:ascii="Arial" w:hAnsi="Arial" w:eastAsia="Arial"/>
-          <w:b/>
-          <w:sz w:val="22"/>
+        <w:spacing w:line="360" w:lineRule="auto"/>
+        <w:rPr/>
+      </w:pPr>
+      <w:r>
+        <w:rPr>
+          <w:b/>
         </w:rPr>
         <w:t>Storms and theft:</w:t>
       </w:r>
       <w:r>
-        <w:rPr>
-          <w:rFonts w:ascii="Arial" w:hAnsi="Arial" w:eastAsia="Arial"/>
-          <w:sz w:val="22"/>
-        </w:rPr>
         <w:t xml:space="preserve"> a quick-release line, electronics retrieved before a typhoon, and the camera mounted high.</w:t>
       </w:r>
     </w:p>
     <w:p>
       <w:pPr>
-        <w:keepNext/>
-        <w:spacing w:line="360" w:lineRule="auto" w:after="80" w:before="200"/>
-      </w:pPr>
-      <w:r>
-        <w:rPr>
-          <w:rFonts w:ascii="Arial" w:hAnsi="Arial" w:eastAsia="Arial"/>
-          <w:b/>
-          <w:sz w:val="22"/>
-        </w:rPr>
-        <w:t>7. What kind of impact do you hope to achieve and what is the long-term vision for this proposal?</w:t>
-      </w:r>
-    </w:p>
-    <w:p>
-      <w:pPr>
-        <w:spacing w:line="360" w:lineRule="auto" w:after="120" w:before="0"/>
-      </w:pPr>
-      <w:r>
-        <w:rPr>
-          <w:rFonts w:ascii="Arial" w:hAnsi="Arial" w:eastAsia="Arial"/>
-          <w:sz w:val="22"/>
-        </w:rPr>
+        <w:ind w:left="1440" w:firstLine="0"/>
+        <w:rPr/>
+      </w:pPr>
+      <w:r>
+        <w:rPr>
+          <w:rtl w:val="0"/>
+        </w:rPr>
+      </w:r>
+    </w:p>
+    <w:p>
+      <w:pPr>
+        <w:numPr>
+          <w:ilvl w:val="0"/>
+          <w:numId w:val="6"/>
+        </w:numPr>
+        <w:ind w:left="720" w:hanging="360"/>
+        <w:rPr>
+          <w:b w:val="1"/>
+          <w:bCs w:val="1"/>
+        </w:rPr>
+      </w:pPr>
+      <w:r>
+        <w:rPr>
+          <w:b w:val="1"/>
+          <w:bCs w:val="1"/>
+          <w:rtl w:val="0"/>
+        </w:rPr>
+        <w:t xml:space="preserve">What kind of impact do you hope to achieve and what is the long term vision for this proposal? </w:t>
+      </w:r>
+    </w:p>
+    <w:p>
+      <w:pPr>
+        <w:rPr/>
+      </w:pPr>
+      <w:r>
+        <w:rPr>
+          <w:rtl w:val="0"/>
+        </w:rPr>
+      </w:r>
+    </w:p>
+    <w:p>
+      <w:pPr>
+        <w:spacing w:line="360" w:lineRule="auto"/>
+        <w:rPr/>
+      </w:pPr>
+      <w:r>
         <w:t>Success means floating plastic lifted from a real creek and a trustworthy weekly record of what it was. One unit lifts little mass, so its value lies in a design cheap enough to copy and data open enough to combine.</w:t>
       </w:r>
     </w:p>
     <w:p>
       <w:pPr>
-        <w:keepNext/>
-        <w:spacing w:line="360" w:lineRule="auto" w:after="40" w:before="0"/>
-      </w:pPr>
-      <w:r>
-        <w:rPr>
-          <w:rFonts w:ascii="Arial" w:hAnsi="Arial" w:eastAsia="Arial"/>
-          <w:b/>
-          <w:sz w:val="22"/>
-        </w:rPr>
-        <w:t>Measurable Outcomes</w:t>
-      </w:r>
-    </w:p>
-    <w:p>
-      <w:pPr>
-        <w:spacing w:line="360" w:lineRule="auto" w:after="60" w:before="0"/>
-      </w:pPr>
-      <w:r>
-        <w:rPr>
-          <w:rFonts w:ascii="Arial" w:hAnsi="Arial" w:eastAsia="Arial"/>
-          <w:b/>
-          <w:sz w:val="22"/>
+        <w:rPr>
+          <w:shd w:fill="ff9900" w:val="clear"/>
+        </w:rPr>
+      </w:pPr>
+      <w:r>
+        <w:rPr>
+          <w:rtl w:val="0"/>
+        </w:rPr>
+      </w:r>
+    </w:p>
+    <w:p>
+      <w:pPr>
+        <w:numPr>
+          <w:ilvl w:val="0"/>
+          <w:numId w:val="2"/>
+        </w:numPr>
+        <w:spacing w:line="360" w:lineRule="auto"/>
+        <w:ind w:left="1440" w:hanging="360"/>
+        <w:rPr>
+          <w:u w:val="none"/>
+        </w:rPr>
+      </w:pPr>
+      <w:r>
+        <w:rPr>
+          <w:b/>
+        </w:rPr>
+        <w:t>Measurable Outcomes:</w:t>
+      </w:r>
+    </w:p>
+    <w:p>
+      <w:pPr>
+        <w:spacing w:line="360" w:lineRule="auto"/>
+        <w:rPr/>
+      </w:pPr>
+      <w:r>
+        <w:rPr>
+          <w:b/>
         </w:rPr>
         <w:t>1. Less plastic in the creek:</w:t>
       </w:r>
       <w:r>
-        <w:rPr>
-          <w:rFonts w:ascii="Arial" w:hAnsi="Arial" w:eastAsia="Arial"/>
-          <w:sz w:val="22"/>
-        </w:rPr>
         <w:t xml:space="preserve"> at least </w:t>
       </w:r>
       <w:r>
         <w:rPr>
-          <w:rFonts w:ascii="Arial" w:hAnsi="Arial" w:eastAsia="Arial"/>
-          <w:sz w:val="22"/>
           <w:highlight w:val="yellow"/>
         </w:rPr>
         <w:t>[TARGET]</w:t>
       </w:r>
       <w:r>
-        <w:rPr>
-          <w:rFonts w:ascii="Arial" w:hAnsi="Arial" w:eastAsia="Arial"/>
-          <w:sz w:val="22"/>
-        </w:rPr>
         <w:t xml:space="preserve"> kg lifted in 8 weeks, with a capture rate of at least </w:t>
       </w:r>
       <w:r>
         <w:rPr>
-          <w:rFonts w:ascii="Arial" w:hAnsi="Arial" w:eastAsia="Arial"/>
-          <w:sz w:val="22"/>
           <w:highlight w:val="yellow"/>
         </w:rPr>
         <w:t>[X]</w:t>
       </w:r>
       <w:r>
-        <w:rPr>
-          <w:rFonts w:ascii="Arial" w:hAnsi="Arial" w:eastAsia="Arial"/>
-          <w:sz w:val="22"/>
-        </w:rPr>
         <w:t>% against the baseline week.</w:t>
       </w:r>
     </w:p>
     <w:p>
       <w:pPr>
-        <w:spacing w:line="360" w:lineRule="auto" w:after="60" w:before="0"/>
-      </w:pPr>
-      <w:r>
-        <w:rPr>
-          <w:rFonts w:ascii="Arial" w:hAnsi="Arial" w:eastAsia="Arial"/>
-          <w:b/>
-          <w:sz w:val="22"/>
+        <w:spacing w:line="360" w:lineRule="auto"/>
+        <w:rPr/>
+      </w:pPr>
+      <w:r>
+        <w:rPr>
+          <w:b/>
         </w:rPr>
         <w:t>2. Trustworthy counts:</w:t>
       </w:r>
       <w:r>
-        <w:rPr>
-          <w:rFonts w:ascii="Arial" w:hAnsi="Arial" w:eastAsia="Arial"/>
-          <w:sz w:val="22"/>
-        </w:rPr>
         <w:t xml:space="preserve"> weekly device error of 15% or less against the hand audit, at least 85% precision and recall on unseen places, and the rain-pulse question answered with data.</w:t>
       </w:r>
     </w:p>
     <w:p>
       <w:pPr>
-        <w:spacing w:line="360" w:lineRule="auto" w:after="60" w:before="0"/>
-      </w:pPr>
-      <w:r>
-        <w:rPr>
-          <w:rFonts w:ascii="Arial" w:hAnsi="Arial" w:eastAsia="Arial"/>
-          <w:b/>
-          <w:sz w:val="22"/>
+        <w:spacing w:line="360" w:lineRule="auto"/>
+        <w:rPr/>
+      </w:pPr>
+      <w:r>
+        <w:rPr>
+          <w:b/>
         </w:rPr>
         <w:t>3. Replication:</w:t>
       </w:r>
       <w:r>
-        <w:rPr>
-          <w:rFonts w:ascii="Arial" w:hAnsi="Arial" w:eastAsia="Arial"/>
-          <w:sz w:val="22"/>
-        </w:rPr>
         <w:t xml:space="preserve"> at least </w:t>
       </w:r>
       <w:r>
         <w:rPr>
-          <w:rFonts w:ascii="Arial" w:hAnsi="Arial" w:eastAsia="Arial"/>
-          <w:sz w:val="22"/>
           <w:highlight w:val="yellow"/>
         </w:rPr>
         <w:t>[2]</w:t>
       </w:r>
       <w:r>
-        <w:rPr>
-          <w:rFonts w:ascii="Arial" w:hAnsi="Arial" w:eastAsia="Arial"/>
-          <w:sz w:val="22"/>
-        </w:rPr>
         <w:t xml:space="preserve"> more sites by March 2027 at about PHP 6,000 each, sharing one open data format. Until a second barangay builds a unit, we treat wider reach as a plan.</w:t>
       </w:r>
     </w:p>
     <w:p>
       <w:pPr>
-        <w:spacing w:line="360" w:lineRule="auto" w:after="120" w:before="0"/>
-      </w:pPr>
-      <w:r>
-        <w:rPr>
-          <w:rFonts w:ascii="Arial" w:hAnsi="Arial" w:eastAsia="Arial"/>
-          <w:b/>
-          <w:sz w:val="22"/>
+        <w:numPr>
+          <w:ilvl w:val="0"/>
+          <w:numId w:val="2"/>
+        </w:numPr>
+        <w:spacing w:line="360" w:lineRule="auto"/>
+        <w:ind w:left="1440" w:hanging="360"/>
+        <w:rPr>
+          <w:u w:val="none"/>
+        </w:rPr>
+      </w:pPr>
+      <w:r>
+        <w:rPr>
+          <w:b/>
         </w:rPr>
         <w:t xml:space="preserve">Long-Term Vision: </w:t>
       </w:r>
       <w:r>
-        <w:rPr>
-          <w:rFonts w:ascii="Arial" w:hAnsi="Arial" w:eastAsia="Arial"/>
-          <w:sz w:val="22"/>
-        </w:rPr>
         <w:t>We see a student-built, barangay-owned network of units along connected creeks that feeds one open dataset showing where plastic enters, which products dominate, and whether EPR commitments change what the water carries. Planned upgrades are a belt conveyor for higher volumes and a second camera angle. Each barangay added raises the value of every other unit's data. The pilot proves the method at one creek and claims no more.</w:t>
       </w:r>
     </w:p>
     <w:p>
       <w:pPr>
-        <w:spacing w:line="360" w:lineRule="auto" w:after="120" w:before="0"/>
-      </w:pPr>
-      <w:r>
-        <w:rPr>
-          <w:rFonts w:ascii="Arial" w:hAnsi="Arial" w:eastAsia="Arial"/>
-          <w:b/>
-          <w:sz w:val="22"/>
+        <w:numPr>
+          <w:ilvl w:val="0"/>
+          <w:numId w:val="2"/>
+        </w:numPr>
+        <w:spacing w:line="360" w:lineRule="auto"/>
+        <w:ind w:left="1440" w:hanging="360"/>
+        <w:rPr>
+          <w:u w:val="none"/>
+        </w:rPr>
+      </w:pPr>
+      <w:r>
+        <w:rPr>
+          <w:b/>
         </w:rPr>
         <w:t xml:space="preserve">Key Takeaway: </w:t>
       </w:r>
       <w:r>
-        <w:rPr>
-          <w:rFonts w:ascii="Arial" w:hAnsi="Arial" w:eastAsia="Arial"/>
-          <w:sz w:val="22"/>
-        </w:rPr>
         <w:t>The Philippines already knows who makes much of its plastic. SAGIP makes the proof continuous, cheap and community-owned, and it lifts some of the plastic out along the way.</w:t>
       </w:r>
     </w:p>
     <w:p>
       <w:pPr>
-        <w:keepNext/>
-        <w:spacing w:line="360" w:lineRule="auto" w:after="80" w:before="200"/>
-      </w:pPr>
-      <w:r>
-        <w:rPr>
-          <w:rFonts w:ascii="Arial" w:hAnsi="Arial" w:eastAsia="Arial"/>
-          <w:b/>
-          <w:sz w:val="22"/>
+        <w:spacing w:line="360" w:lineRule="auto"/>
+        <w:rPr>
+          <w:b w:val="1"/>
+          <w:bCs w:val="1"/>
+        </w:rPr>
+      </w:pPr>
+      <w:r>
+        <w:rPr>
+          <w:b/>
         </w:rPr>
         <w:t>References</w:t>
       </w:r>
     </w:p>
     <w:p>
       <w:pPr>
-        <w:spacing w:line="276" w:lineRule="auto" w:after="60" w:before="0"/>
-      </w:pPr>
-      <w:r>
-        <w:rPr>
-          <w:rFonts w:ascii="Arial" w:hAnsi="Arial" w:eastAsia="Arial"/>
-          <w:sz w:val="20"/>
-        </w:rPr>
+        <w:spacing w:line="276" w:lineRule="auto" w:after="60"/>
+        <w:rPr/>
+      </w:pPr>
+      <w:r>
         <w:t>Break Free From Plastic and GAIA (2019). Plastics Exposed: How Waste Assessments and Brand Audits Are Helping Philippine Cities Fight Plastic Pollution.</w:t>
       </w:r>
     </w:p>
     <w:p>
       <w:pPr>
-        <w:spacing w:line="276" w:lineRule="auto" w:after="60" w:before="0"/>
-      </w:pPr>
-      <w:r>
-        <w:rPr>
-          <w:rFonts w:ascii="Arial" w:hAnsi="Arial" w:eastAsia="Arial"/>
-          <w:sz w:val="20"/>
-        </w:rPr>
+        <w:spacing w:line="276" w:lineRule="auto" w:after="60"/>
+        <w:rPr/>
+      </w:pPr>
+      <w:r>
+        <w:t xml:space="preserve">Conrad, C. C., &amp; Hilchey, K. G. (2011). A review of citizen science and community-based environmental monitoring. Environmental Monitoring and Assessment, 176, 273-291. </w:t>
+      </w:r>
+      <w:r>
+        <w:rPr>
+          <w:highlight w:val="yellow"/>
+        </w:rPr>
+        <w:t>[VERIFY]</w:t>
+      </w:r>
+    </w:p>
+    <w:p>
+      <w:pPr>
+        <w:spacing w:line="276" w:lineRule="auto" w:after="60"/>
+        <w:rPr/>
+      </w:pPr>
+      <w:r>
+        <w:t xml:space="preserve">Cordova, M. R., &amp; Nurhati, I. S. (2019). Major sources and monthly variations in the release of land-derived marine debris from the Greater Jakarta area, Indonesia. Scientific Reports, 9, 18730. </w:t>
+      </w:r>
+      <w:r>
+        <w:rPr>
+          <w:highlight w:val="yellow"/>
+        </w:rPr>
+        <w:t>[VERIFY]</w:t>
+      </w:r>
+    </w:p>
+    <w:p>
+      <w:pPr>
+        <w:spacing w:line="276" w:lineRule="auto" w:after="60"/>
+        <w:rPr/>
+      </w:pPr>
+      <w:r>
+        <w:t xml:space="preserve">David, R., et al. (2021). TensorFlow Lite Micro: Embedded machine learning for TinyML systems. Proceedings of Machine Learning and Systems, 3. </w:t>
+      </w:r>
+      <w:r>
+        <w:rPr>
+          <w:highlight w:val="yellow"/>
+        </w:rPr>
+        <w:t>[VERIFY]</w:t>
+      </w:r>
+    </w:p>
+    <w:p>
+      <w:pPr>
+        <w:spacing w:line="276" w:lineRule="auto" w:after="60"/>
+        <w:rPr/>
+      </w:pPr>
+      <w:r>
         <w:t xml:space="preserve">HydroSentinel (2026). An IoT-enabled autonomous surface vehicle for dual-scale riverine plastic detection and remediation. ScienceDirect. </w:t>
       </w:r>
       <w:r>
         <w:rPr>
-          <w:rFonts w:ascii="Arial" w:hAnsi="Arial" w:eastAsia="Arial"/>
-          <w:sz w:val="20"/>
           <w:highlight w:val="yellow"/>
         </w:rPr>
         <w:t>[add authors]</w:t>
@@ -2593,19 +2558,47 @@
     </w:p>
     <w:p>
       <w:pPr>
-        <w:spacing w:line="276" w:lineRule="auto" w:after="60" w:before="0"/>
-      </w:pPr>
-      <w:r>
-        <w:rPr>
-          <w:rFonts w:ascii="Arial" w:hAnsi="Arial" w:eastAsia="Arial"/>
-          <w:sz w:val="20"/>
-        </w:rPr>
+        <w:spacing w:line="276" w:lineRule="auto" w:after="60"/>
+        <w:rPr/>
+      </w:pPr>
+      <w:r>
+        <w:t xml:space="preserve">Jacob, B., et al. (2018). Quantization and training of neural networks for efficient integer-arithmetic-only inference. CVPR. </w:t>
+      </w:r>
+      <w:r>
+        <w:rPr>
+          <w:highlight w:val="yellow"/>
+        </w:rPr>
+        <w:t>[VERIFY]</w:t>
+      </w:r>
+    </w:p>
+    <w:p>
+      <w:pPr>
+        <w:spacing w:line="276" w:lineRule="auto" w:after="60"/>
+        <w:rPr/>
+      </w:pPr>
+      <w:r>
+        <w:t>Jambeck, J. R., et al. (2015). Plastic waste inputs from land into the ocean. Science, 347, 768-771.</w:t>
+      </w:r>
+    </w:p>
+    <w:p>
+      <w:pPr>
+        <w:spacing w:line="276" w:lineRule="auto" w:after="60"/>
+        <w:rPr/>
+      </w:pPr>
+      <w:r>
+        <w:t>Lebreton, L. C. M., et al. (2017). River plastic emissions to the world's oceans. Nature Communications, 8, 15611.</w:t>
+      </w:r>
+    </w:p>
+    <w:p>
+      <w:pPr>
+        <w:spacing w:line="276" w:lineRule="auto" w:after="60"/>
+        <w:rPr/>
+      </w:pPr>
+      <w:r>
         <w:t xml:space="preserve">Manila Bulletin (August 24, 2026). Report on government estero trash traps and EPR audits. </w:t>
       </w:r>
       <w:r>
         <w:rPr>
-          <w:rFonts w:ascii="Arial" w:hAnsi="Arial" w:eastAsia="Arial"/>
-          <w:sz w:val="20"/>
           <w:highlight w:val="yellow"/>
         </w:rPr>
         <w:t>[add headline and byline]</w:t>
@@ -2613,19 +2606,14 @@
     </w:p>
     <w:p>
       <w:pPr>
-        <w:spacing w:line="276" w:lineRule="auto" w:after="60" w:before="0"/>
-      </w:pPr>
-      <w:r>
-        <w:rPr>
-          <w:rFonts w:ascii="Arial" w:hAnsi="Arial" w:eastAsia="Arial"/>
-          <w:sz w:val="20"/>
-        </w:rPr>
+        <w:spacing w:line="276" w:lineRule="auto" w:after="60"/>
+        <w:rPr/>
+      </w:pPr>
+      <w:r>
         <w:t xml:space="preserve">Meijer, L. J. J., et al. (2021). More than 1,000 rivers account for 80% of global riverine plastic emissions into the ocean. Science Advances. </w:t>
       </w:r>
       <w:r>
         <w:rPr>
-          <w:rFonts w:ascii="Arial" w:hAnsi="Arial" w:eastAsia="Arial"/>
-          <w:sz w:val="20"/>
           <w:highlight w:val="yellow"/>
         </w:rPr>
         <w:t>[VERIFY]</w:t>
@@ -2633,19 +2621,14 @@
     </w:p>
     <w:p>
       <w:pPr>
-        <w:spacing w:line="276" w:lineRule="auto" w:after="60" w:before="0"/>
-      </w:pPr>
-      <w:r>
-        <w:rPr>
-          <w:rFonts w:ascii="Arial" w:hAnsi="Arial" w:eastAsia="Arial"/>
-          <w:sz w:val="20"/>
-        </w:rPr>
+        <w:spacing w:line="276" w:lineRule="auto" w:after="60"/>
+        <w:rPr/>
+      </w:pPr>
+      <w:r>
         <w:t xml:space="preserve">Republic Act No. 11898 (2022). Extended Producer Responsibility Act of 2022. </w:t>
       </w:r>
       <w:r>
         <w:rPr>
-          <w:rFonts w:ascii="Arial" w:hAnsi="Arial" w:eastAsia="Arial"/>
-          <w:sz w:val="20"/>
           <w:highlight w:val="yellow"/>
         </w:rPr>
         <w:t>[VERIFY]</w:t>
@@ -2653,14 +2636,76 @@
     </w:p>
     <w:p>
       <w:pPr>
-        <w:spacing w:line="276" w:lineRule="auto" w:after="60" w:before="0"/>
-      </w:pPr>
-      <w:r>
-        <w:rPr>
-          <w:rFonts w:ascii="Arial" w:hAnsi="Arial" w:eastAsia="Arial"/>
-          <w:sz w:val="20"/>
-        </w:rPr>
+        <w:spacing w:line="276" w:lineRule="auto" w:after="60"/>
+        <w:rPr/>
+      </w:pPr>
+      <w:r>
+        <w:t xml:space="preserve">Schmaltz, E., et al. (2020). Plastic pollution solutions: Emerging technologies to prevent and collect marine plastic pollution. Environment International, 144, 106067. </w:t>
+      </w:r>
+      <w:r>
+        <w:rPr>
+          <w:highlight w:val="yellow"/>
+        </w:rPr>
+        <w:t>[VERIFY]</w:t>
+      </w:r>
+    </w:p>
+    <w:p>
+      <w:pPr>
+        <w:spacing w:line="276" w:lineRule="auto" w:after="60"/>
+        <w:rPr/>
+      </w:pPr>
+      <w:r>
+        <w:t xml:space="preserve">Schreyers, L., et al. (2021). Water hyacinth and river plastic transport. </w:t>
+      </w:r>
+      <w:r>
+        <w:rPr>
+          <w:highlight w:val="yellow"/>
+        </w:rPr>
+        <w:t>[VERIFY: full citation]</w:t>
+      </w:r>
+    </w:p>
+    <w:p>
+      <w:pPr>
+        <w:spacing w:line="276" w:lineRule="auto" w:after="60"/>
+        <w:rPr/>
+      </w:pPr>
+      <w:r>
+        <w:t xml:space="preserve">van Emmerik, T., &amp; Schwarz, A. (2020). Plastic debris in rivers. WIREs Water, 7, e1398. </w:t>
+      </w:r>
+      <w:r>
+        <w:rPr>
+          <w:highlight w:val="yellow"/>
+        </w:rPr>
+        <w:t>[VERIFY]</w:t>
+      </w:r>
+    </w:p>
+    <w:p>
+      <w:pPr>
+        <w:spacing w:line="276" w:lineRule="auto" w:after="60"/>
+        <w:rPr/>
+      </w:pPr>
+      <w:r>
         <w:t>van Lieshout, C., et al. (2020). Automated river plastic monitoring using deep learning and cameras. Earth and Space Science, 7, e2019EA000960.</w:t>
+      </w:r>
+    </w:p>
+    <w:p>
+      <w:pPr>
+        <w:rPr/>
+      </w:pPr>
+      <w:r>
+        <w:rPr>
+          <w:rtl w:val="0"/>
+        </w:rPr>
+      </w:r>
+    </w:p>
+    <w:p>
+      <w:pPr>
+        <w:rPr/>
+      </w:pPr>
+      <w:r>
+        <w:rPr>
+          <w:rtl w:val="0"/>
+        </w:rPr>
       </w:r>
     </w:p>
     <w:sectPr>

</xml_diff>

<commit_message>
Verify citations, remove resolved flags, drop PDFs
Co-Authored-By: Claude Sonnet 5.5 <noreply@anthropic.com>
Claude-Session: https://claude.ai/code/session_01BeuSv6ZfopDpEFLv7nhPKY
</commit_message>
<xml_diff>
--- a/sft_entry/SAGIP_SFT2026_Proposal.docx
+++ b/sft_entry/SAGIP_SFT2026_Proposal.docx
@@ -545,52 +545,16 @@
         <w:rPr/>
       </w:pPr>
       <w:r>
-        <w:t xml:space="preserve">Plastic reaches the sea through rivers, and the Philippines ranks near the top in every estimate. Global models placed it among the leading sources of mismanaged plastic waste (Jambeck et al., 2015) and of river emissions (Lebreton et al., 2017), and a later model built on measurements from more than 1,000 rivers kept Philippine rivers at the top (Meijer et al., 2021) </w:t>
-      </w:r>
-      <w:r>
-        <w:rPr>
-          <w:highlight w:val="yellow"/>
-        </w:rPr>
-        <w:t>[VERIFY: figures]</w:t>
-      </w:r>
-      <w:r>
-        <w:t xml:space="preserve">. Small urban waterways such as Metro Manila's esteros feed these rivers. Monthly records from Greater Jakarta tie debris release to rainfall (Cordova &amp; Nurhati, 2019) </w:t>
-      </w:r>
-      <w:r>
-        <w:rPr>
-          <w:highlight w:val="yellow"/>
-        </w:rPr>
-        <w:t>[VERIFY]</w:t>
-      </w:r>
-      <w:r>
-        <w:t xml:space="preserve">, and water hyacinth mats can trap plastic and carry it downstream </w:t>
-      </w:r>
-      <w:r>
-        <w:rPr>
-          <w:highlight w:val="yellow"/>
-        </w:rPr>
-        <w:t>[VERIFY: Schreyers et al., 2021]</w:t>
-      </w:r>
-      <w:r>
-        <w:t>.</w:t>
-      </w:r>
-    </w:p>
-    <w:p>
-      <w:pPr>
-        <w:spacing w:line="360" w:lineRule="auto"/>
-        <w:rPr/>
-      </w:pPr>
-      <w:r>
-        <w:t xml:space="preserve">Two gaps keep the problem going. Removal is manual and unrecorded, so cleanups weigh bulk waste and learn nothing about its contents. Product-level evidence is also scarce. River plastic research still lacks long-term monitoring data (van Emmerik &amp; Schwarz, 2020), and brand audits, though valuable, are periodic, labor-intensive and mostly land-based (Break Free From Plastic, 2019). The Extended Producer Responsibility Act of 2022 (RA 11898) obliges large companies to recover plastic packaging </w:t>
-      </w:r>
-      <w:r>
-        <w:rPr>
-          <w:highlight w:val="yellow"/>
-        </w:rPr>
-        <w:t>[VERIFY: scope]</w:t>
-      </w:r>
-      <w:r>
-        <w:t>, yet enforcement needs proof of which packaging reaches waterways. The government is expanding estero trash traps and has said recovery audits could check EPR compliance (Manila Bulletin, 2026).</w:t>
+        <w:t>Plastic reaches the sea through rivers, and the Philippines ranks near the top in every estimate. Global models placed it among the leading sources of mismanaged plastic waste (Jambeck et al., 2015) and of river emissions (Lebreton et al., 2017), and a later model built on measurements from more than 1,000 rivers kept Philippine rivers at the top (Meijer et al., 2021). Small urban waterways such as Metro Manila's esteros feed these rivers. Monitoring at the river outlets of Greater Jakarta found higher debris release in the rainy season (Cordova &amp; Nurhati, 2019), and in the Saigon River water hyacinth mats carried most of the floating plastic that observers counted (Schreyers et al., 2021).</w:t>
+      </w:r>
+    </w:p>
+    <w:p>
+      <w:pPr>
+        <w:spacing w:line="360" w:lineRule="auto"/>
+        <w:rPr/>
+      </w:pPr>
+      <w:r>
+        <w:t>Two gaps keep the problem going. Removal is manual and unrecorded, so cleanups weigh bulk waste and learn nothing about its contents. Product-level evidence is also scarce. River plastic research still lacks long-term monitoring data (van Emmerik &amp; Schwarz, 2020), and brand audits, though valuable, are periodic, labor-intensive and mostly land-based (Break Free From Plastic, 2019). The Extended Producer Responsibility Act of 2022 (RA 11898) obliges large companies to recover a rising share of their plastic packaging, yet enforcement needs proof of which packaging reaches waterways. The government is expanding estero trash traps and has said recovery audits could check EPR compliance (Manila Bulletin, 2026).</w:t>
       </w:r>
     </w:p>
     <w:p>
@@ -1228,7 +1192,7 @@
               <w:spacing w:line="240" w:lineRule="auto" w:after="40" w:before="40"/>
             </w:pPr>
             <w:r>
-              <w:t>Review technologies that prevent and collect river and marine plastic</w:t>
+              <w:t>Inventory 52 technologies that prevent or collect river and marine plastic</w:t>
             </w:r>
           </w:p>
         </w:tc>
@@ -1241,13 +1205,7 @@
               <w:spacing w:line="240" w:lineRule="auto" w:after="40" w:before="40"/>
             </w:pPr>
             <w:r>
-              <w:t xml:space="preserve">Few designs report item-level data </w:t>
-            </w:r>
-            <w:r>
-              <w:rPr>
-                <w:highlight w:val="yellow"/>
-              </w:rPr>
-              <w:t>[VERIFY]</w:t>
+              <w:t>Capacity is small and few designs report item-level data</w:t>
             </w:r>
           </w:p>
         </w:tc>
@@ -2502,13 +2460,40 @@
         <w:rPr/>
       </w:pPr>
       <w:r>
-        <w:t xml:space="preserve">Conrad, C. C., &amp; Hilchey, K. G. (2011). A review of citizen science and community-based environmental monitoring. Environmental Monitoring and Assessment, 176, 273-291. </w:t>
+        <w:t>Conrad, C. C., &amp; Hilchey, K. G. (2011). A review of citizen science and community-based environmental monitoring. Environmental Monitoring and Assessment, 176, 273-291.</w:t>
+      </w:r>
+    </w:p>
+    <w:p>
+      <w:pPr>
+        <w:spacing w:line="276" w:lineRule="auto" w:after="60"/>
+        <w:rPr/>
+      </w:pPr>
+      <w:r>
+        <w:t>Cordova, M. R., &amp; Nurhati, I. S. (2019). Major sources and monthly variations in the release of land-derived marine debris from the Greater Jakarta area, Indonesia. Scientific Reports, 9, 18730.</w:t>
+      </w:r>
+    </w:p>
+    <w:p>
+      <w:pPr>
+        <w:spacing w:line="276" w:lineRule="auto" w:after="60"/>
+        <w:rPr/>
+      </w:pPr>
+      <w:r>
+        <w:t>David, R., et al. (2021). TensorFlow Lite Micro: Embedded machine learning for TinyML systems. Proceedings of Machine Learning and Systems, 3.</w:t>
+      </w:r>
+    </w:p>
+    <w:p>
+      <w:pPr>
+        <w:spacing w:line="276" w:lineRule="auto" w:after="60"/>
+        <w:rPr/>
+      </w:pPr>
+      <w:r>
+        <w:t xml:space="preserve">HydroSentinel (2026). An IoT-enabled autonomous surface vehicle for dual-scale riverine plastic detection and remediation. ScienceDirect. </w:t>
       </w:r>
       <w:r>
         <w:rPr>
           <w:highlight w:val="yellow"/>
         </w:rPr>
-        <w:t>[VERIFY]</w:t>
+        <w:t>[add authors]</w:t>
       </w:r>
     </w:p>
     <w:p>
@@ -2517,13 +2502,40 @@
         <w:rPr/>
       </w:pPr>
       <w:r>
-        <w:t xml:space="preserve">Cordova, M. R., &amp; Nurhati, I. S. (2019). Major sources and monthly variations in the release of land-derived marine debris from the Greater Jakarta area, Indonesia. Scientific Reports, 9, 18730. </w:t>
+        <w:t>Jacob, B., et al. (2018). Quantization and training of neural networks for efficient integer-arithmetic-only inference. CVPR.</w:t>
+      </w:r>
+    </w:p>
+    <w:p>
+      <w:pPr>
+        <w:spacing w:line="276" w:lineRule="auto" w:after="60"/>
+        <w:rPr/>
+      </w:pPr>
+      <w:r>
+        <w:t>Jambeck, J. R., et al. (2015). Plastic waste inputs from land into the ocean. Science, 347, 768-771.</w:t>
+      </w:r>
+    </w:p>
+    <w:p>
+      <w:pPr>
+        <w:spacing w:line="276" w:lineRule="auto" w:after="60"/>
+        <w:rPr/>
+      </w:pPr>
+      <w:r>
+        <w:t>Lebreton, L. C. M., et al. (2017). River plastic emissions to the world's oceans. Nature Communications, 8, 15611.</w:t>
+      </w:r>
+    </w:p>
+    <w:p>
+      <w:pPr>
+        <w:spacing w:line="276" w:lineRule="auto" w:after="60"/>
+        <w:rPr/>
+      </w:pPr>
+      <w:r>
+        <w:t xml:space="preserve">Manila Bulletin (August 24, 2026). Report on government estero trash traps and EPR audits. </w:t>
       </w:r>
       <w:r>
         <w:rPr>
           <w:highlight w:val="yellow"/>
         </w:rPr>
-        <w:t>[VERIFY]</w:t>
+        <w:t>[add headline and byline]</w:t>
       </w:r>
     </w:p>
     <w:p>
@@ -2532,13 +2544,7 @@
         <w:rPr/>
       </w:pPr>
       <w:r>
-        <w:t xml:space="preserve">David, R., et al. (2021). TensorFlow Lite Micro: Embedded machine learning for TinyML systems. Proceedings of Machine Learning and Systems, 3. </w:t>
-      </w:r>
-      <w:r>
-        <w:rPr>
-          <w:highlight w:val="yellow"/>
-        </w:rPr>
-        <w:t>[VERIFY]</w:t>
+        <w:t>Meijer, L. J. J., et al. (2021). More than 1,000 rivers account for 80% of global riverine plastic emissions into the ocean. Science Advances, 7, eaaz5803.</w:t>
       </w:r>
     </w:p>
     <w:p>
@@ -2547,13 +2553,7 @@
         <w:rPr/>
       </w:pPr>
       <w:r>
-        <w:t xml:space="preserve">HydroSentinel (2026). An IoT-enabled autonomous surface vehicle for dual-scale riverine plastic detection and remediation. ScienceDirect. </w:t>
-      </w:r>
-      <w:r>
-        <w:rPr>
-          <w:highlight w:val="yellow"/>
-        </w:rPr>
-        <w:t>[add authors]</w:t>
+        <w:t>Republic Act No. 11898 (2022). Extended Producer Responsibility Act of 2022.</w:t>
       </w:r>
     </w:p>
     <w:p>
@@ -2562,13 +2562,7 @@
         <w:rPr/>
       </w:pPr>
       <w:r>
-        <w:t xml:space="preserve">Jacob, B., et al. (2018). Quantization and training of neural networks for efficient integer-arithmetic-only inference. CVPR. </w:t>
-      </w:r>
-      <w:r>
-        <w:rPr>
-          <w:highlight w:val="yellow"/>
-        </w:rPr>
-        <w:t>[VERIFY]</w:t>
+        <w:t>Schmaltz, E., Melvin, E. C., Diana, Z., et al. (2020). Plastic pollution solutions: Emerging technologies to prevent and collect marine plastic pollution. Environment International, 144, 106067.</w:t>
       </w:r>
     </w:p>
     <w:p>
@@ -2577,7 +2571,7 @@
         <w:rPr/>
       </w:pPr>
       <w:r>
-        <w:t>Jambeck, J. R., et al. (2015). Plastic waste inputs from land into the ocean. Science, 347, 768-771.</w:t>
+        <w:t>Schreyers, L., et al. (2021). Plastic plants: The role of water hyacinths in plastic transport in tropical rivers. Frontiers in Environmental Science, 9, 686334.</w:t>
       </w:r>
     </w:p>
     <w:p>
@@ -2586,97 +2580,7 @@
         <w:rPr/>
       </w:pPr>
       <w:r>
-        <w:t>Lebreton, L. C. M., et al. (2017). River plastic emissions to the world's oceans. Nature Communications, 8, 15611.</w:t>
-      </w:r>
-    </w:p>
-    <w:p>
-      <w:pPr>
-        <w:spacing w:line="276" w:lineRule="auto" w:after="60"/>
-        <w:rPr/>
-      </w:pPr>
-      <w:r>
-        <w:t xml:space="preserve">Manila Bulletin (August 24, 2026). Report on government estero trash traps and EPR audits. </w:t>
-      </w:r>
-      <w:r>
-        <w:rPr>
-          <w:highlight w:val="yellow"/>
-        </w:rPr>
-        <w:t>[add headline and byline]</w:t>
-      </w:r>
-    </w:p>
-    <w:p>
-      <w:pPr>
-        <w:spacing w:line="276" w:lineRule="auto" w:after="60"/>
-        <w:rPr/>
-      </w:pPr>
-      <w:r>
-        <w:t xml:space="preserve">Meijer, L. J. J., et al. (2021). More than 1,000 rivers account for 80% of global riverine plastic emissions into the ocean. Science Advances. </w:t>
-      </w:r>
-      <w:r>
-        <w:rPr>
-          <w:highlight w:val="yellow"/>
-        </w:rPr>
-        <w:t>[VERIFY]</w:t>
-      </w:r>
-    </w:p>
-    <w:p>
-      <w:pPr>
-        <w:spacing w:line="276" w:lineRule="auto" w:after="60"/>
-        <w:rPr/>
-      </w:pPr>
-      <w:r>
-        <w:t xml:space="preserve">Republic Act No. 11898 (2022). Extended Producer Responsibility Act of 2022. </w:t>
-      </w:r>
-      <w:r>
-        <w:rPr>
-          <w:highlight w:val="yellow"/>
-        </w:rPr>
-        <w:t>[VERIFY]</w:t>
-      </w:r>
-    </w:p>
-    <w:p>
-      <w:pPr>
-        <w:spacing w:line="276" w:lineRule="auto" w:after="60"/>
-        <w:rPr/>
-      </w:pPr>
-      <w:r>
-        <w:t xml:space="preserve">Schmaltz, E., et al. (2020). Plastic pollution solutions: Emerging technologies to prevent and collect marine plastic pollution. Environment International, 144, 106067. </w:t>
-      </w:r>
-      <w:r>
-        <w:rPr>
-          <w:highlight w:val="yellow"/>
-        </w:rPr>
-        <w:t>[VERIFY]</w:t>
-      </w:r>
-    </w:p>
-    <w:p>
-      <w:pPr>
-        <w:spacing w:line="276" w:lineRule="auto" w:after="60"/>
-        <w:rPr/>
-      </w:pPr>
-      <w:r>
-        <w:t xml:space="preserve">Schreyers, L., et al. (2021). Water hyacinth and river plastic transport. </w:t>
-      </w:r>
-      <w:r>
-        <w:rPr>
-          <w:highlight w:val="yellow"/>
-        </w:rPr>
-        <w:t>[VERIFY: full citation]</w:t>
-      </w:r>
-    </w:p>
-    <w:p>
-      <w:pPr>
-        <w:spacing w:line="276" w:lineRule="auto" w:after="60"/>
-        <w:rPr/>
-      </w:pPr>
-      <w:r>
-        <w:t xml:space="preserve">van Emmerik, T., &amp; Schwarz, A. (2020). Plastic debris in rivers. WIREs Water, 7, e1398. </w:t>
-      </w:r>
-      <w:r>
-        <w:rPr>
-          <w:highlight w:val="yellow"/>
-        </w:rPr>
-        <w:t>[VERIFY]</w:t>
+        <w:t>van Emmerik, T., &amp; Schwarz, A. (2020). Plastic debris in rivers. WIREs Water, 7, e1398.</w:t>
       </w:r>
     </w:p>
     <w:p>

</xml_diff>

<commit_message>
Rebuild entry, PPT and prototype design on the optimized SAGIP design; update handoff; move prior versions to old_versions
Co-Authored-By: Claude Sonnet 5.5 <noreply@anthropic.com>
Claude-Session: https://claude.ai/code/session_01BeuSv6ZfopDpEFLv7nhPKY
</commit_message>
<xml_diff>
--- a/sft_entry/SAGIP_SFT2026_Proposal.docx
+++ b/sft_entry/SAGIP_SFT2026_Proposal.docx
@@ -479,7 +479,7 @@
           </w:p>
           <w:p>
             <w:r>
-              <w:t>Our device is a low-cost, solar-powered unit that lifts floating plastic out of a creek and counts each item with a tiny on-chip AI model. Barangay officials get a weekly offline report of what was removed, plus a secondary water-level alert for blockages. Built for about PHP 6,000 from local parts, it adds anonymized records to an open dataset that other barangays can copy.</w:t>
+              <w:t>SAGIP is a low-cost, solar-powered unit that filters floating plastic out of a creek, lifts it into a sorted bin and names each item with a small on-chip image model. Barangay officials get a weekly offline report of what the creek carried, plus a secondary water-level alert for blockages. Built for about PHP 6,000 from local parts, it adds anonymized records to an open dataset that other barangays can copy.</w:t>
             </w:r>
           </w:p>
         </w:tc>
@@ -545,34 +545,25 @@
         <w:rPr/>
       </w:pPr>
       <w:r>
-        <w:t>Plastic reaches the sea through rivers, and the Philippines ranks near the top in every estimate. Global models placed it among the leading sources of mismanaged plastic waste (Jambeck et al., 2015) and of river emissions (Lebreton et al., 2017), and a later model built on measurements from more than 1,000 rivers kept Philippine rivers at the top (Meijer et al., 2021). Small urban waterways such as Metro Manila's esteros feed these rivers. Monitoring at the river outlets of Greater Jakarta found higher debris release in the rainy season (Cordova &amp; Nurhati, 2019), and in the Saigon River water hyacinth mats carried most of the floating plastic that observers counted (Schreyers et al., 2021).</w:t>
-      </w:r>
-    </w:p>
-    <w:p>
-      <w:pPr>
-        <w:spacing w:line="360" w:lineRule="auto"/>
-        <w:rPr/>
-      </w:pPr>
-      <w:r>
-        <w:t>Two gaps keep the problem going. Removal is manual and unrecorded, so cleanups weigh bulk waste and learn nothing about its contents. Product-level evidence is also scarce. River plastic research still lacks long-term monitoring data (van Emmerik &amp; Schwarz, 2020), and brand audits, though valuable, are periodic, labor-intensive and mostly land-based (Break Free From Plastic, 2019). The Extended Producer Responsibility Act of 2022 (RA 11898) obliges large companies to recover a rising share of their plastic packaging, yet enforcement needs proof of which packaging reaches waterways. The government is expanding estero trash traps and has said recovery audits could check EPR compliance (Manila Bulletin, 2026).</w:t>
-      </w:r>
-    </w:p>
-    <w:p>
-      <w:pPr>
-        <w:spacing w:line="360" w:lineRule="auto"/>
-        <w:rPr/>
-      </w:pPr>
-      <w:r>
-        <w:t xml:space="preserve">What is missing is a continuous, inexpensive record taken at the creek itself that one barangay can run. A secondary hazard shares the channel. Debris-choked creeks add to flooding in low-lying neighborhoods </w:t>
-      </w:r>
-      <w:r>
-        <w:rPr>
-          <w:highlight w:val="yellow"/>
-        </w:rPr>
-        <w:t>[VERIFY: MMDA and DPWH reports]</w:t>
-      </w:r>
-      <w:r>
-        <w:t>, and residents learn of a blockage only after the water rises.</w:t>
+        <w:t>Plastic reaches the sea through rivers, and the Philippines ranks near the top in every estimate. Global models placed it among the leading sources of mismanaged plastic waste (Jambeck et al., 2015) and of river emissions (Lebreton et al., 2017), and a later model built on measurements from more than 1,000 rivers kept Philippine rivers at the top (Meijer et al., 2021). Monitoring at the river outlets of Greater Jakarta found higher debris release in the rainy season (Cordova &amp; Nurhati, 2019), and in the Saigon River water hyacinth mats carried most of the floating plastic that observers counted (Schreyers et al., 2021).</w:t>
+      </w:r>
+    </w:p>
+    <w:p>
+      <w:pPr>
+        <w:spacing w:line="360" w:lineRule="auto"/>
+        <w:rPr/>
+      </w:pPr>
+      <w:r>
+        <w:t>Two gaps keep the problem going. Removal is manual and unrecorded, so cleanups weigh bulk waste and learn nothing about its contents. Product-level evidence is also scarce. River plastic research still lacks long-term monitoring data (van Emmerik &amp; Schwarz, 2020), and brand audits, though valuable, are periodic, labor-intensive and mostly land-based (Break Free From Plastic, 2019). The Extended Producer Responsibility Act of 2022 (RA 11898) obliges large companies to recover a rising share of their plastic packaging, and the DENR has begun auditing reported recovery rates (Food Packaging Forum, 2026). Enforcement still needs proof of which packaging reaches waterways.</w:t>
+      </w:r>
+    </w:p>
+    <w:p>
+      <w:pPr>
+        <w:spacing w:line="360" w:lineRule="auto"/>
+        <w:rPr/>
+      </w:pPr>
+      <w:r>
+        <w:t>What is missing is a continuous, inexpensive record taken at the creek itself that one barangay can run. Large systems are arriving, such as solar-powered Interceptor barriers planned for the Pasig and Meycauayan rivers (Manila Bulletin, June 2026), but a narrow estero needs a unit a barangay can afford. A secondary hazard shares the channel. Clogged waterways worsen flooding in low-lying neighborhoods, and residents learn of a blockage only after the water rises.</w:t>
       </w:r>
     </w:p>
     <w:p>
@@ -693,7 +684,7 @@
         <w:rPr>
           <w:b/>
         </w:rPr>
-        <w:t>1. Remove plastic from the creek.</w:t>
+        <w:t>1. Remove and measure plastic.</w:t>
       </w:r>
       <w:r>
         <w:t xml:space="preserve"> In an 8-week pilot at </w:t>
@@ -705,25 +696,7 @@
         <w:t>[ESTERO SITE]</w:t>
       </w:r>
       <w:r>
-        <w:t xml:space="preserve"> starting in December 2026, lift at least </w:t>
-      </w:r>
-      <w:r>
-        <w:rPr>
-          <w:highlight w:val="yellow"/>
-        </w:rPr>
-        <w:t>[TARGET]</w:t>
-      </w:r>
-      <w:r>
-        <w:t xml:space="preserve"> kg of floating debris out of the water and capture at least </w:t>
-      </w:r>
-      <w:r>
-        <w:rPr>
-          <w:highlight w:val="yellow"/>
-        </w:rPr>
-        <w:t>[X]</w:t>
-      </w:r>
-      <w:r>
-        <w:t>% of the floating debris that reaches the boom, measured against a baseline week recorded before installation.</w:t>
+        <w:t xml:space="preserve"> starting in December 2026, capture at least 50% of the floating debris that reaches the boom, measured against a baseline week recorded before installation, lift at least 20 kg of plastic and log at least 1,000 classified items.</w:t>
       </w:r>
     </w:p>
     <w:p>
@@ -743,7 +716,7 @@
         <w:t>2. Prove what the plastic is.</w:t>
       </w:r>
       <w:r>
-        <w:t xml:space="preserve"> By November 20, 2026, train an on-device model that reaches at least 85% precision and recall on photographs from places it has not seen. Across the pilot, weekly device counts should stay within 15% of a trained hand audit.</w:t>
+        <w:t xml:space="preserve"> By November 20, 2026, train an on-device 2D convolutional neural network that reaches at least 85% precision and recall on photographs from places it has not seen. Across the pilot, weekly device counts should stay within 15% of a trained hand audit.</w:t>
       </w:r>
     </w:p>
     <w:p>
@@ -763,16 +736,7 @@
         <w:t>3. Make it copyable.</w:t>
       </w:r>
       <w:r>
-        <w:t xml:space="preserve"> By March 2027, publish a free English and Filipino build guide and an open dataset, and help at least </w:t>
-      </w:r>
-      <w:r>
-        <w:rPr>
-          <w:highlight w:val="yellow"/>
-        </w:rPr>
-        <w:t>[2]</w:t>
-      </w:r>
-      <w:r>
-        <w:t xml:space="preserve"> other barangays or schools build a unit for about PHP 6,000 each.</w:t>
+        <w:t xml:space="preserve"> By March 2027, publish a free English and Filipino build guide and an open dataset, and help at least 2 other barangays or schools build a unit for about PHP 6,000 each.</w:t>
       </w:r>
     </w:p>
     <w:p>
@@ -862,19 +826,10 @@
         <w:rPr>
           <w:highlight w:val="yellow"/>
         </w:rPr>
-        <w:t>[ESTERO]</w:t>
-      </w:r>
-      <w:r>
-        <w:t xml:space="preserve">, who bear the creek's pollution and flooding, and the barangay sanitation officers, who will empty the bin weekly and use the report. Secondary beneficiaries are the city solid-waste office and the DENR, who need item-level evidence for EPR enforcement, at least </w:t>
-      </w:r>
-      <w:r>
-        <w:rPr>
-          <w:highlight w:val="yellow"/>
-        </w:rPr>
-        <w:t>[2]</w:t>
-      </w:r>
-      <w:r>
-        <w:t xml:space="preserve"> neighboring barangays or schools that copy the design by March 2027, and downstream fisherfolk as less plastic reaches Manila Bay. We chose the barangay because it already organizes estero cleanups (Manila Bulletin, 2026), and community-based monitoring has a long record of building local ownership of environmental data (Conrad &amp; Hilchey, 2011). </w:t>
+        <w:t>[ESTERO SITE]</w:t>
+      </w:r>
+      <w:r>
+        <w:t xml:space="preserve"> in Quezon City, who bear the creek's pollution and flooding, and the barangay sanitation officers, who will empty the bins weekly and use the report. Secondary beneficiaries are the city solid-waste office and the DENR, who need item-level evidence for EPR enforcement, at least 2 neighboring barangays or schools that copy the design by March 2027, and downstream fisherfolk as less plastic reaches Manila Bay. We chose a barangay estero because Quezon City already runs river programs with partners (Philstar, 2025), and community-based monitoring builds local ownership of data (Conrad &amp; Hilchey, 2011). </w:t>
       </w:r>
       <w:r>
         <w:rPr>
@@ -953,7 +908,7 @@
         <w:t xml:space="preserve">Select. </w:t>
       </w:r>
       <w:r>
-        <w:t xml:space="preserve">We listed five community problems and scored each on significance, feasibility, STEM depth, replicability and originality. Creek plastic won. We can reach a creek, we can measure it weekly, and RA 11898 has just made item-level data useful. </w:t>
+        <w:t xml:space="preserve">We listed five community problems and scored each on significance, feasibility, STEM depth, replicability and originality. Creek plastic won. We can reach a creek, we can measure it weekly, and RA 11898 has just made item-level data useful. We then fitted the design to PHP 6,000 with a bank-mounted unit, an image classifier and a sorting gate. </w:t>
       </w:r>
       <w:r>
         <w:rPr>
@@ -1003,6 +958,7 @@
           </w:tcPr>
           <w:p>
             <w:pPr>
+              <w:keepNext/>
               <w:spacing w:line="240" w:lineRule="auto" w:after="40" w:before="40"/>
             </w:pPr>
             <w:r>
@@ -1019,6 +975,7 @@
           </w:tcPr>
           <w:p>
             <w:pPr>
+              <w:keepNext/>
               <w:spacing w:line="240" w:lineRule="auto" w:after="40" w:before="40"/>
             </w:pPr>
             <w:r>
@@ -1035,6 +992,7 @@
           </w:tcPr>
           <w:p>
             <w:pPr>
+              <w:keepNext/>
               <w:spacing w:line="240" w:lineRule="auto" w:after="40" w:before="40"/>
             </w:pPr>
             <w:r>
@@ -1053,6 +1011,7 @@
           </w:tcPr>
           <w:p>
             <w:pPr>
+              <w:keepNext/>
               <w:spacing w:line="240" w:lineRule="auto" w:after="40" w:before="40"/>
             </w:pPr>
             <w:r>
@@ -1066,6 +1025,7 @@
           </w:tcPr>
           <w:p>
             <w:pPr>
+              <w:keepNext/>
               <w:spacing w:line="240" w:lineRule="auto" w:after="40" w:before="40"/>
             </w:pPr>
             <w:r>
@@ -1079,6 +1039,7 @@
           </w:tcPr>
           <w:p>
             <w:pPr>
+              <w:keepNext/>
               <w:spacing w:line="240" w:lineRule="auto" w:after="40" w:before="40"/>
             </w:pPr>
             <w:r>
@@ -1094,10 +1055,11 @@
           </w:tcPr>
           <w:p>
             <w:pPr>
+              <w:keepNext/>
               <w:spacing w:line="240" w:lineRule="auto" w:after="40" w:before="40"/>
             </w:pPr>
             <w:r>
-              <w:t>Low-cost robotic boats (HydroSentinel, 2026)</w:t>
+              <w:t>Solar river barriers (The Ocean Cleanup, 2026)</w:t>
             </w:r>
           </w:p>
         </w:tc>
@@ -1107,10 +1069,11 @@
           </w:tcPr>
           <w:p>
             <w:pPr>
+              <w:keepNext/>
               <w:spacing w:line="240" w:lineRule="auto" w:after="40" w:before="40"/>
             </w:pPr>
             <w:r>
-              <w:t>Detect and collect plastic with a small onboard model</w:t>
+              <w:t>Intercept and lift river plastic with a solar-powered conveyor</w:t>
             </w:r>
           </w:p>
         </w:tc>
@@ -1120,10 +1083,11 @@
           </w:tcPr>
           <w:p>
             <w:pPr>
+              <w:keepNext/>
               <w:spacing w:line="240" w:lineRule="auto" w:after="40" w:before="40"/>
             </w:pPr>
             <w:r>
-              <w:t>Need radio, charging and an operator</w:t>
+              <w:t>Built for large rivers, announced for the Pasig and Meycauayan</w:t>
             </w:r>
           </w:p>
         </w:tc>
@@ -1135,10 +1099,11 @@
           </w:tcPr>
           <w:p>
             <w:pPr>
+              <w:keepNext/>
               <w:spacing w:line="240" w:lineRule="auto" w:after="40" w:before="40"/>
             </w:pPr>
             <w:r>
-              <w:t>Estero trash traps (Manila Bulletin, 2026)</w:t>
+              <w:t>AI cleanup boats (Manila Bulletin, 2025)</w:t>
             </w:r>
           </w:p>
         </w:tc>
@@ -1148,10 +1113,11 @@
           </w:tcPr>
           <w:p>
             <w:pPr>
+              <w:keepNext/>
               <w:spacing w:line="240" w:lineRule="auto" w:after="40" w:before="40"/>
             </w:pPr>
             <w:r>
-              <w:t>Remove plastic at scale</w:t>
+              <w:t>Collect plastic with a solar-powered, AI-enabled vessel in a Pasig pilot</w:t>
             </w:r>
           </w:p>
         </w:tc>
@@ -1161,10 +1127,11 @@
           </w:tcPr>
           <w:p>
             <w:pPr>
+              <w:keepNext/>
               <w:spacing w:line="240" w:lineRule="auto" w:after="40" w:before="40"/>
             </w:pPr>
             <w:r>
-              <w:t>Record bulk weight only</w:t>
+              <w:t>Mobile boats on a large river, not fixed estero units</w:t>
             </w:r>
           </w:p>
         </w:tc>
@@ -1176,10 +1143,11 @@
           </w:tcPr>
           <w:p>
             <w:pPr>
+              <w:keepNext/>
               <w:spacing w:line="240" w:lineRule="auto" w:after="40" w:before="40"/>
             </w:pPr>
             <w:r>
-              <w:t>River interceptors and booms (Schmaltz et al., 2020)</w:t>
+              <w:t>Trash traps (Philstar, 2022)</w:t>
             </w:r>
           </w:p>
         </w:tc>
@@ -1189,10 +1157,11 @@
           </w:tcPr>
           <w:p>
             <w:pPr>
+              <w:keepNext/>
               <w:spacing w:line="240" w:lineRule="auto" w:after="40" w:before="40"/>
             </w:pPr>
             <w:r>
-              <w:t>Inventory 52 technologies that prevent or collect river and marine plastic</w:t>
+              <w:t>Remove plastic in bulk at river tributaries</w:t>
             </w:r>
           </w:p>
         </w:tc>
@@ -1202,10 +1171,11 @@
           </w:tcPr>
           <w:p>
             <w:pPr>
+              <w:keepNext/>
               <w:spacing w:line="240" w:lineRule="auto" w:after="40" w:before="40"/>
             </w:pPr>
             <w:r>
-              <w:t>Capacity is small and few designs report item-level data</w:t>
+              <w:t>Record bulk weight only</w:t>
             </w:r>
           </w:p>
         </w:tc>
@@ -1265,7 +1235,7 @@
         <w:t xml:space="preserve">Gap we test. </w:t>
       </w:r>
       <w:r>
-        <w:t>None of these lifts plastic, counts it and shares open data in a unit a barangay can afford. Our search was limited and found no such system. We therefore ask one research question: can a PHP 6,000 on-chip counter match a trained hand audit within 15%, and does continuous counting reveal rain-driven pulses of plastic that weekly audits miss?</w:t>
+        <w:t>None of these lifts plastic, counts it item by item and shares open data in a unit a barangay can afford. Our search was limited and found no such system. We therefore ask one research question: can a PHP 6,000 on-chip counter match a trained hand audit within 15%, and does continuous counting reveal rain-driven pulses of plastic that weekly audits miss?</w:t>
       </w:r>
     </w:p>
     <w:p>
@@ -1331,7 +1301,7 @@
         <w:rPr/>
       </w:pPr>
       <w:r>
-        <w:t>STEM is the core of the design. Physics sets the boom angle, the lever and torque of the arm and the solar energy budget. Mathematics and statistics define precision, recall and count error. Computer science supplies the object-detection model, INT8 quantization, which shrinks a model about fourfold with little loss of accuracy (Jacob et al., 2018), and TensorFlow Lite for Microcontrollers, which runs it in kilobytes of memory (David et al., 2021). Engineering joins them in a floating, weatherproof structure. Our key message is that proof of what plastic reaches a creek can be continuous, cheap and community-owned. Pairing a collector with a counter delivers it best, because one inexpensive chip then yields cleanup and evidence together.</w:t>
+        <w:t>STEM is the core of the design. Physics sets the boom angle, the lever and torque of the arm and the solar energy budget. Mathematics and statistics define precision, recall and count error. Computer science supplies a small 2D convolutional neural network (CNN) with INT8 quantization, which shrinks a model about fourfold with little loss of accuracy (Jacob et al., 2018), running on TensorFlow Lite for Microcontrollers (David et al., 2021). Engineering joins them in a weatherproof structure. Our key message is that proof of what plastic reaches a creek can be continuous, cheap and community-owned. Pairing a collector with a counter delivers it best.</w:t>
       </w:r>
     </w:p>
     <w:p>
@@ -1341,7 +1311,7 @@
       <w:r>
         <w:drawing>
           <wp:inline>
-            <wp:extent cx="5486400" cy="2534717"/>
+            <wp:extent cx="5486400" cy="1777042"/>
             <wp:docPr id="1" name="Picture 1"/>
             <wp:cNvGraphicFramePr>
               <a:graphicFrameLocks noChangeAspect="1"/>
@@ -1350,7 +1320,7 @@
               <a:graphicData uri="http://schemas.openxmlformats.org/drawingml/2006/picture">
                 <pic:pic>
                   <pic:nvPicPr>
-                    <pic:cNvPr id="0" name="fig_logic.png"/>
+                    <pic:cNvPr id="0" name="fig_flow.png"/>
                     <pic:cNvPicPr/>
                   </pic:nvPicPr>
                   <pic:blipFill>
@@ -1362,7 +1332,7 @@
                   <pic:spPr>
                     <a:xfrm>
                       <a:off x="0" y="0"/>
-                      <a:ext cx="5486400" cy="2534717"/>
+                      <a:ext cx="5486400" cy="1777042"/>
                     </a:xfrm>
                     <a:prstGeom prst="rect"/>
                   </pic:spPr>
@@ -1381,22 +1351,37 @@
         <w:rPr>
           <w:i/>
         </w:rPr>
-        <w:t>Figure 1. What the chip decides, from camera to report.</w:t>
-      </w:r>
-    </w:p>
-    <w:p>
-      <w:pPr>
-        <w:spacing w:line="360" w:lineRule="auto"/>
-        <w:rPr/>
-      </w:pPr>
-      <w:r>
-        <w:rPr>
-          <w:b/>
-        </w:rPr>
-        <w:t xml:space="preserve">Trap. </w:t>
-      </w:r>
-      <w:r>
-        <w:t>A V-shaped boom of reused PET bottles and bamboo guides surface debris to the bank, where a bar screen stops oversized items at the foot of a sloped mesh ramp. A wide-gapped deflector upstream pushes water hyacinth mats past the intake. The current does the herding, so the boom needs no energy.</w:t>
+        <w:t>Figure 1. How plastic and signals move through the unit.</w:t>
+      </w:r>
+    </w:p>
+    <w:p>
+      <w:pPr>
+        <w:spacing w:line="360" w:lineRule="auto"/>
+        <w:rPr/>
+      </w:pPr>
+      <w:r>
+        <w:rPr>
+          <w:b/>
+        </w:rPr>
+        <w:t xml:space="preserve">Catch. </w:t>
+      </w:r>
+      <w:r>
+        <w:t>A floating boom of reused PET bottles with a net skirt guides surface debris toward the bank. A wide-gapped deflector upstream turns water hyacinth mats aside. The current does the herding, so the boom needs no energy.</w:t>
+      </w:r>
+    </w:p>
+    <w:p>
+      <w:pPr>
+        <w:spacing w:line="360" w:lineRule="auto"/>
+        <w:rPr/>
+      </w:pPr>
+      <w:r>
+        <w:rPr>
+          <w:b/>
+        </w:rPr>
+        <w:t xml:space="preserve">Filter. </w:t>
+      </w:r>
+      <w:r>
+        <w:t>Coarse bars stop large debris, then a fine mesh basket catches small plastic. Both slope so leaves and mud shed. The foot of the ramp is hinged and rides on bottle floats, so it follows the water level as rain raises and lowers the creek.</w:t>
       </w:r>
     </w:p>
     <w:p>
@@ -1411,7 +1396,7 @@
         <w:t xml:space="preserve">Lift. </w:t>
       </w:r>
       <w:r>
-        <w:t>A small geared DC motor, mounted above the flood line, turns a rake arm that sweeps debris up the ramp into a covered bin. It runs in short bursts and only when the camera sees plastic rather than vegetation. A sacrificial shear pin protects the gearbox, and a guard, stop switch and lockout protect people.</w:t>
+        <w:t>A worm-gear DC motor, mounted above the flood mark, turns a short rake arm that sweeps debris up the ramp in bursts. A sacrificial shear pin protects the gearbox. A guard, stop switch and lockout protect people.</w:t>
       </w:r>
     </w:p>
     <w:p>
@@ -1426,22 +1411,37 @@
         <w:t xml:space="preserve">Protect. </w:t>
       </w:r>
       <w:r>
-        <w:t>The chip reads motor current, ignores the start-up surge, and trips on sustained high current. A Hall sensor on the arm shaft confirms the arm is moving, which exposes slipping on greasy surfaces. After a jam it stops, reverses briefly, retries at most three times, then locks out and alerts the barangay. The motor driver defaults to off, so a crashed chip cannot leave the motor running.</w:t>
-      </w:r>
-    </w:p>
-    <w:p>
-      <w:pPr>
-        <w:spacing w:line="360" w:lineRule="auto"/>
-        <w:rPr/>
-      </w:pPr>
-      <w:r>
-        <w:rPr>
-          <w:b/>
-        </w:rPr>
-        <w:t xml:space="preserve">Count. </w:t>
-      </w:r>
-      <w:r>
-        <w:t>An ESP32-S3 camera on a post looks down at the water surface only, so no faces or houses appear. A compact object-detection model, quantized to INT8 and run with TensorFlow Lite for Microcontrollers, classifies each item. The camera views a pocket one to two meters away, so items appear large. Training photographs come from our own collection along the creek bank, labelled by students and checked by the adviser. Every week, students hand-count and weigh the bin, and that count is the accuracy test.</w:t>
+        <w:t>The chip reads motor current and adjusts speed. Under heavy load it slows and keeps torque, and under light load it speeds up, within a limit set by the solar budget. A Hall sensor confirms the arm is moving. If current rises sharply, the arm reverses briefly, retries at most three times, then locks out and alerts the barangay. The driver defaults to off, so a crashed chip cannot leave the motor running.</w:t>
+      </w:r>
+    </w:p>
+    <w:p>
+      <w:pPr>
+        <w:spacing w:line="360" w:lineRule="auto"/>
+        <w:rPr/>
+      </w:pPr>
+      <w:r>
+        <w:rPr>
+          <w:b/>
+        </w:rPr>
+        <w:t xml:space="preserve">Count and sort. </w:t>
+      </w:r>
+      <w:r>
+        <w:t>An ESP32-S3 camera looks down at a fixed landing plate under a hood with LED lighting, so every item appears in the same light. The CNN classifies it as PET bottle, sachet or film, bag, foam, cup, plant or other. A servo gate then drops plastic into Bin A and plants or low-confidence items into Bin B for a person to check. If the servo fails, items still land in one bin and are still counted. Training photographs come from our own collection along the creek bank, labelled by students and checked by the adviser. Items that land together may count as one, so each week students hand-count both bins as the accuracy test.</w:t>
+      </w:r>
+    </w:p>
+    <w:p>
+      <w:pPr>
+        <w:spacing w:line="360" w:lineRule="auto"/>
+        <w:rPr/>
+      </w:pPr>
+      <w:r>
+        <w:rPr>
+          <w:b/>
+        </w:rPr>
+        <w:t xml:space="preserve">Software. </w:t>
+      </w:r>
+      <w:r>
+        <w:t>We train in Keras on a laptop, start from a small pretrained MobileNet-style network at 96 by 96 pixels, quantize to INT8 and deploy with TensorFlow Lite for Microcontrollers on the ESP32-S3.</w:t>
       </w:r>
     </w:p>
     <w:p>
@@ -1456,7 +1456,7 @@
         <w:t xml:space="preserve">Report. </w:t>
       </w:r>
       <w:r>
-        <w:t>A phone reads an offline Wi-Fi page hosted by the chip, and a script builds the weekly report and an anonymized open dataset. Each record stores class, time, water level and an image hash in an append-only log. A student volunteer tallies legible brand names from the stored photographs, since automated brand reading is not yet reliable. Plotting counts against rainfall shows whether plastic arrives in rain-driven pulses.</w:t>
+        <w:t>A phone reads an offline Wi-Fi page hosted by the chip. Each record stores class, time, water level and an image hash in an append-only log on a microSD card, with time from a clock module. A script builds the weekly report and an anonymized open dataset, and plotting counts against rainfall shows whether plastic arrives in pulses.</w:t>
       </w:r>
     </w:p>
     <w:p>
@@ -1466,7 +1466,7 @@
       <w:r>
         <w:drawing>
           <wp:inline>
-            <wp:extent cx="5486400" cy="3105302"/>
+            <wp:extent cx="5852160" cy="2223619"/>
             <wp:docPr id="2" name="Picture 2"/>
             <wp:cNvGraphicFramePr>
               <a:graphicFrameLocks noChangeAspect="1"/>
@@ -1475,7 +1475,7 @@
               <a:graphicData uri="http://schemas.openxmlformats.org/drawingml/2006/picture">
                 <pic:pic>
                   <pic:nvPicPr>
-                    <pic:cNvPr id="0" name="fig_dev.png"/>
+                    <pic:cNvPr id="0" name="fig_cut.png"/>
                     <pic:cNvPicPr/>
                   </pic:nvPicPr>
                   <pic:blipFill>
@@ -1487,7 +1487,7 @@
                   <pic:spPr>
                     <a:xfrm>
                       <a:off x="0" y="0"/>
-                      <a:ext cx="5486400" cy="3105302"/>
+                      <a:ext cx="5852160" cy="2223619"/>
                     </a:xfrm>
                     <a:prstGeom prst="rect"/>
                   </pic:spPr>
@@ -1506,7 +1506,7 @@
         <w:rPr>
           <w:i/>
         </w:rPr>
-        <w:t>Figure 2. The SAGIP unit at the creek bank (schematic).</w:t>
+        <w:t>Figure 2. Cutaway of the SAGIP unit at the creek bank (schematic).</w:t>
       </w:r>
     </w:p>
     <w:p>
@@ -1521,7 +1521,7 @@
         <w:t xml:space="preserve">Warn (secondary). </w:t>
       </w:r>
       <w:r>
-        <w:t>A waterproof ultrasonic sensor measures the distance to the water surface against a painted staff gauge. It raises an LED and report alert when the level rises quickly or the bin nears capacity, and the arm stops above a set level.</w:t>
+        <w:t>A waterproof ultrasonic sensor measures the distance to the water against a painted staff gauge. It raises an alert when the level rises quickly or a bin nears capacity, and the arm stops above a set level.</w:t>
       </w:r>
     </w:p>
     <w:p>
@@ -1536,7 +1536,7 @@
         <w:t xml:space="preserve">Power. </w:t>
       </w:r>
       <w:r>
-        <w:t>Planning figures, to be replaced by bench measurements. Duty-cycled electronics draw about 6 Wh per day and the arm about 0.3 Wh. A 10 W panel yields about 18 Wh per day at 3 effective sun-hours and 60% efficiency, and two 18650 cells store about 18 Wh. On cloudy days the chip lengthens its capture interval when the battery is low.</w:t>
+        <w:t>Planning figures until bench measurements replace them. The camera runs only when an item is present. Electronics draw about 6 Wh per day and the arm about 0.3 Wh. A 6 W panel yields about 11 Wh per day at 3 effective sun-hours and 60% efficiency, and two 18650 cells store about 18 Wh. When the battery is low the chip lengthens its capture interval.</w:t>
       </w:r>
     </w:p>
     <w:p>
@@ -1551,7 +1551,7 @@
         <w:t xml:space="preserve">Scope. </w:t>
       </w:r>
       <w:r>
-        <w:t>SAGIP lifts light floating debris such as bottles, sachets, bags, foam and cups. Heavy or tangled items, hyacinth mats, sunken waste, sediment, oil and dissolved pollutants fall outside its reach, so we report a measured capture rate instead of claiming a clean creek.</w:t>
+        <w:t>SAGIP lifts light floating debris such as bottles, sachets, bags, foam and cups. Heavy or tangled items, hyacinth mats, sunken waste and dissolved pollutants fall outside its reach, so we report a measured capture rate instead of claiming a clean creek.</w:t>
       </w:r>
     </w:p>
     <w:p>
@@ -1566,7 +1566,7 @@
         <w:t xml:space="preserve">In plain words. </w:t>
       </w:r>
       <w:r>
-        <w:t>Picture a sanitation worker who can tell a PET bottle from a sachet at a glance. The model is that skill, saved as a file of numbers. Quantization rounds the numbers to whole 8-bit values, like a gradebook recording 87 and not 87.3416, so the file fits in the chip's memory. No internet is needed.</w:t>
+        <w:t>The model is the skill of a sanitation worker who can tell a PET bottle from a sachet at a glance, saved as a file of numbers. Quantization rounds them like a gradebook recording 87, not 87.3416, so the file fits the chip. No internet is needed.</w:t>
       </w:r>
     </w:p>
     <w:p>
@@ -1621,6 +1621,7 @@
     </w:p>
     <w:p>
       <w:pPr>
+        <w:keepNext/>
         <w:numPr>
           <w:ilvl w:val="0"/>
           <w:numId w:val="3"/>
@@ -1661,6 +1662,7 @@
           </w:tcPr>
           <w:p>
             <w:pPr>
+              <w:keepNext/>
               <w:spacing w:line="240" w:lineRule="auto" w:after="40" w:before="40"/>
             </w:pPr>
             <w:r>
@@ -1677,6 +1679,7 @@
           </w:tcPr>
           <w:p>
             <w:pPr>
+              <w:keepNext/>
               <w:spacing w:line="240" w:lineRule="auto" w:after="40" w:before="40"/>
             </w:pPr>
             <w:r>
@@ -1695,10 +1698,11 @@
           </w:tcPr>
           <w:p>
             <w:pPr>
+              <w:keepNext/>
               <w:spacing w:line="240" w:lineRule="auto" w:after="40" w:before="40"/>
             </w:pPr>
             <w:r>
-              <w:t>ESP32-S3 camera board, microSD card, sealed enclosure</w:t>
+              <w:t>ESP32-S3 camera board with PSRAM, microSD card, clock module, sealed enclosure with light hood</w:t>
             </w:r>
           </w:p>
         </w:tc>
@@ -1708,11 +1712,12 @@
           </w:tcPr>
           <w:p>
             <w:pPr>
+              <w:keepNext/>
               <w:spacing w:line="240" w:lineRule="auto" w:after="40" w:before="40"/>
               <w:jc w:val="right"/>
             </w:pPr>
             <w:r>
-              <w:t>1,800</w:t>
+              <w:t>1,850</w:t>
             </w:r>
           </w:p>
         </w:tc>
@@ -1724,10 +1729,11 @@
           </w:tcPr>
           <w:p>
             <w:pPr>
+              <w:keepNext/>
               <w:spacing w:line="240" w:lineRule="auto" w:after="40" w:before="40"/>
             </w:pPr>
             <w:r>
-              <w:t>Solar panel (6 to 10 W), charge controller, two 18650 cells, converter</w:t>
+              <w:t>6 W solar panel, charge controller, two 18650 cells, converter</w:t>
             </w:r>
           </w:p>
         </w:tc>
@@ -1737,11 +1743,12 @@
           </w:tcPr>
           <w:p>
             <w:pPr>
+              <w:keepNext/>
               <w:spacing w:line="240" w:lineRule="auto" w:after="40" w:before="40"/>
               <w:jc w:val="right"/>
             </w:pPr>
             <w:r>
-              <w:t>1,300</w:t>
+              <w:t>1,200</w:t>
             </w:r>
           </w:p>
         </w:tc>
@@ -1753,10 +1760,11 @@
           </w:tcPr>
           <w:p>
             <w:pPr>
+              <w:keepNext/>
               <w:spacing w:line="240" w:lineRule="auto" w:after="40" w:before="40"/>
             </w:pPr>
             <w:r>
-              <w:t>Boom rope and net, anchor and post, bin and staff gauge, wiring and fuse</w:t>
+              <w:t>Boom rope and net, anchor and post, two bins and staff gauge, wiring, fuse and switch</w:t>
             </w:r>
           </w:p>
         </w:tc>
@@ -1766,11 +1774,12 @@
           </w:tcPr>
           <w:p>
             <w:pPr>
+              <w:keepNext/>
               <w:spacing w:line="240" w:lineRule="auto" w:after="40" w:before="40"/>
               <w:jc w:val="right"/>
             </w:pPr>
             <w:r>
-              <w:t>1,200</w:t>
+              <w:t>1,100</w:t>
             </w:r>
           </w:p>
         </w:tc>
@@ -1782,6 +1791,7 @@
           </w:tcPr>
           <w:p>
             <w:pPr>
+              <w:keepNext/>
               <w:spacing w:line="240" w:lineRule="auto" w:after="40" w:before="40"/>
             </w:pPr>
             <w:r>
@@ -1795,6 +1805,7 @@
           </w:tcPr>
           <w:p>
             <w:pPr>
+              <w:keepNext/>
               <w:spacing w:line="240" w:lineRule="auto" w:after="40" w:before="40"/>
               <w:jc w:val="right"/>
             </w:pPr>
@@ -1811,10 +1822,11 @@
           </w:tcPr>
           <w:p>
             <w:pPr>
+              <w:keepNext/>
               <w:spacing w:line="240" w:lineRule="auto" w:after="40" w:before="40"/>
             </w:pPr>
             <w:r>
-              <w:t>Geared motor, driver, current and motion sensing, ramp, rake arm, bar screen, spare shear pins</w:t>
+              <w:t>Geared motor, driver, current and motion sensing, servo gate</w:t>
             </w:r>
           </w:p>
         </w:tc>
@@ -1824,6 +1836,7 @@
           </w:tcPr>
           <w:p>
             <w:pPr>
+              <w:keepNext/>
               <w:spacing w:line="240" w:lineRule="auto" w:after="40" w:before="40"/>
               <w:jc w:val="right"/>
             </w:pPr>
@@ -1840,6 +1853,38 @@
           </w:tcPr>
           <w:p>
             <w:pPr>
+              <w:keepNext/>
+              <w:spacing w:line="240" w:lineRule="auto" w:after="40" w:before="40"/>
+            </w:pPr>
+            <w:r>
+              <w:t>Ramp with hinged float foot, rake arm, coarse bars, fine mesh, spare shear pins</w:t>
+            </w:r>
+          </w:p>
+        </w:tc>
+        <w:tc>
+          <w:tcPr>
+            <w:tcW w:type="dxa" w:w="1584"/>
+          </w:tcPr>
+          <w:p>
+            <w:pPr>
+              <w:keepNext/>
+              <w:spacing w:line="240" w:lineRule="auto" w:after="40" w:before="40"/>
+              <w:jc w:val="right"/>
+            </w:pPr>
+            <w:r>
+              <w:t>350</w:t>
+            </w:r>
+          </w:p>
+        </w:tc>
+      </w:tr>
+      <w:tr>
+        <w:tc>
+          <w:tcPr>
+            <w:tcW w:type="dxa" w:w="7776"/>
+          </w:tcPr>
+          <w:p>
+            <w:pPr>
+              <w:keepNext/>
               <w:spacing w:line="240" w:lineRule="auto" w:after="40" w:before="40"/>
             </w:pPr>
             <w:r>
@@ -1856,6 +1901,7 @@
           </w:tcPr>
           <w:p>
             <w:pPr>
+              <w:keepNext/>
               <w:spacing w:line="240" w:lineRule="auto" w:after="40" w:before="40"/>
               <w:jc w:val="right"/>
             </w:pPr>
@@ -1863,7 +1909,7 @@
               <w:rPr>
                 <w:b/>
               </w:rPr>
-              <w:t>5,650</w:t>
+              <w:t>5,850</w:t>
             </w:r>
           </w:p>
         </w:tc>
@@ -1875,6 +1921,7 @@
           </w:tcPr>
           <w:p>
             <w:pPr>
+              <w:keepNext/>
               <w:spacing w:line="240" w:lineRule="auto" w:after="40" w:before="40"/>
             </w:pPr>
             <w:r>
@@ -1891,6 +1938,7 @@
           </w:tcPr>
           <w:p>
             <w:pPr>
+              <w:keepNext/>
               <w:spacing w:line="240" w:lineRule="auto" w:after="40" w:before="40"/>
               <w:jc w:val="right"/>
             </w:pPr>
@@ -1898,7 +1946,7 @@
               <w:rPr>
                 <w:b/>
               </w:rPr>
-              <w:t>350</w:t>
+              <w:t>150</w:t>
             </w:r>
           </w:p>
         </w:tc>
@@ -1952,61 +2000,52 @@
         <w:t xml:space="preserve">Tools. </w:t>
       </w:r>
       <w:r>
-        <w:t>Arduino IDE or PlatformIO, Python with TensorFlow Lite, a borrowed soldering iron and multimeter, and our phones for photography. All prices are estimates to confirm locally.</w:t>
-      </w:r>
-    </w:p>
-    <w:p>
-      <w:pPr>
-        <w:spacing w:line="360" w:lineRule="auto"/>
-        <w:rPr/>
-      </w:pPr>
-      <w:r>
-        <w:rPr>
-          <w:b/>
-        </w:rPr>
-        <w:t>Stage 1, bench (about PHP 1,800).</w:t>
-      </w:r>
-      <w:r>
-        <w:t xml:space="preserve"> Train and test the model and measure power draw. Gate: precision and recall on held-out photographs meet the target.</w:t>
-      </w:r>
-    </w:p>
-    <w:p>
-      <w:pPr>
-        <w:spacing w:line="360" w:lineRule="auto"/>
-        <w:rPr/>
-      </w:pPr>
-      <w:r>
-        <w:rPr>
-          <w:b/>
-        </w:rPr>
-        <w:t>Stage 2, passive trap (about PHP 2,500).</w:t>
-      </w:r>
-      <w:r>
-        <w:t xml:space="preserve"> Install the boom, deflector, screen, ramp, bin, post and solar supply. Gate: the boom survives </w:t>
-      </w:r>
-      <w:r>
-        <w:rPr>
-          <w:highlight w:val="yellow"/>
-        </w:rPr>
-        <w:t>[N]</w:t>
-      </w:r>
-      <w:r>
-        <w:t xml:space="preserve"> rain events and weekly counts fall within 15% of hand counts.</w:t>
-      </w:r>
-    </w:p>
-    <w:p>
-      <w:pPr>
-        <w:spacing w:line="360" w:lineRule="auto"/>
-        <w:rPr/>
-      </w:pPr>
-      <w:r>
-        <w:rPr>
-          <w:b/>
-        </w:rPr>
-        <w:t>Stage 3, arm and sensor (about PHP 1,350).</w:t>
-      </w:r>
-      <w:r>
-        <w:t xml:space="preserve"> Fit the motor, jam protection and level sensor. Gate: a wet bench test with real hyacinth, estero silt and a little cooking oil, then solar-only lifts at the target jam rate.</w:t>
+        <w:t>Python, Keras, TensorFlow Lite for Microcontrollers, Arduino IDE, a borrowed soldering iron and multimeter, a kitchen scale and our phones. Prices are estimates to confirm locally, and we will ask the barangay for posts, rope and bins in kind.</w:t>
+      </w:r>
+    </w:p>
+    <w:p>
+      <w:pPr>
+        <w:spacing w:line="360" w:lineRule="auto"/>
+        <w:rPr/>
+      </w:pPr>
+      <w:r>
+        <w:rPr>
+          <w:b/>
+        </w:rPr>
+        <w:t>Stage 1, bench (about PHP 1,850).</w:t>
+      </w:r>
+      <w:r>
+        <w:t xml:space="preserve"> Train and test the model and measure power draw. Gate: precision and recall on held-out photographs reach 85%.</w:t>
+      </w:r>
+    </w:p>
+    <w:p>
+      <w:pPr>
+        <w:spacing w:line="360" w:lineRule="auto"/>
+        <w:rPr/>
+      </w:pPr>
+      <w:r>
+        <w:rPr>
+          <w:b/>
+        </w:rPr>
+        <w:t>Stage 2, passive trap (about PHP 2,650).</w:t>
+      </w:r>
+      <w:r>
+        <w:t xml:space="preserve"> Install the boom, deflector, filter, hinged ramp foot, bins, post, solar supply and level sensor. Gate: the boom survives at least 3 rain events and weekly counts fall within 15% of hand counts.</w:t>
+      </w:r>
+    </w:p>
+    <w:p>
+      <w:pPr>
+        <w:spacing w:line="360" w:lineRule="auto"/>
+        <w:rPr/>
+      </w:pPr>
+      <w:r>
+        <w:rPr>
+          <w:b/>
+        </w:rPr>
+        <w:t>Stage 3, arm and sorter (about PHP 1,350).</w:t>
+      </w:r>
+      <w:r>
+        <w:t xml:space="preserve"> Fit the motor, jam protection, current sensing and servo gate. Gate: a wet bench test with real hyacinth, estero silt and a little cooking oil, then solar-only lifts at the target jam rate.</w:t>
       </w:r>
     </w:p>
     <w:p>
@@ -2021,7 +2060,7 @@
         <w:t xml:space="preserve">Timeline. </w:t>
       </w:r>
       <w:r>
-        <w:t>Site visit, barangay letter and starter dataset by November 2. Model and a baseline week by November 20. Early results on December 7 if shortlisted. Full pilot from December to February. Build guide and further sites by March 2027.</w:t>
+        <w:t>Site visit, barangay letter and starter dataset by November 2. Model and a baseline week by November 20. Early results on December 7 if shortlisted. Pilot from December to February. Build guide and further sites by March 2027.</w:t>
       </w:r>
     </w:p>
     <w:p>
@@ -2068,16 +2107,7 @@
         <w:t>City solid-waste office and DENR:</w:t>
       </w:r>
       <w:r>
-        <w:t xml:space="preserve"> use of the data and fit with existing estero programs </w:t>
-      </w:r>
-      <w:r>
-        <w:rPr>
-          <w:highlight w:val="yellow"/>
-        </w:rPr>
-        <w:t>[VERIFY: current programs]</w:t>
-      </w:r>
-      <w:r>
-        <w:t>.</w:t>
+        <w:t xml:space="preserve"> use of the data and fit with Quezon City's river programs (Philstar, 2025).</w:t>
       </w:r>
     </w:p>
     <w:p>
@@ -2107,7 +2137,7 @@
         <w:t>Students and residents:</w:t>
       </w:r>
       <w:r>
-        <w:t xml:space="preserve"> students build, label, count and report. Residents give consent and help keep the site clear.</w:t>
+        <w:t xml:space="preserve"> students build, label, count and report. Residents give consent.</w:t>
       </w:r>
     </w:p>
     <w:p>
@@ -2136,10 +2166,25 @@
         <w:rPr>
           <w:b/>
         </w:rPr>
+        <w:t>Manual labor:</w:t>
+      </w:r>
+      <w:r>
+        <w:t xml:space="preserve"> people must still empty both bins weekly, clear the screen after storms, wipe the lens and check the battery. We will log those hours.</w:t>
+      </w:r>
+    </w:p>
+    <w:p>
+      <w:pPr>
+        <w:spacing w:line="360" w:lineRule="auto"/>
+        <w:rPr/>
+      </w:pPr>
+      <w:r>
+        <w:rPr>
+          <w:b/>
+        </w:rPr>
         <w:t>Hyacinth mats:</w:t>
       </w:r>
       <w:r>
-        <w:t xml:space="preserve"> a deflector, a vegetation class that stops the arm, and daily screen clearing.</w:t>
+        <w:t xml:space="preserve"> a deflector, sloped filters and a plant class that sends mats to Bin B.</w:t>
       </w:r>
     </w:p>
     <w:p>
@@ -2166,6 +2211,21 @@
         <w:rPr>
           <w:b/>
         </w:rPr>
+        <w:t>Changing water level:</w:t>
+      </w:r>
+      <w:r>
+        <w:t xml:space="preserve"> a hinged ramp foot on floats and a level sensor that stops the arm above a set height.</w:t>
+      </w:r>
+    </w:p>
+    <w:p>
+      <w:pPr>
+        <w:spacing w:line="360" w:lineRule="auto"/>
+        <w:rPr/>
+      </w:pPr>
+      <w:r>
+        <w:rPr>
+          <w:b/>
+        </w:rPr>
         <w:t>Oil and silt:</w:t>
       </w:r>
       <w:r>
@@ -2184,7 +2244,7 @@
         <w:t>Model errors in new light or water:</w:t>
       </w:r>
       <w:r>
-        <w:t xml:space="preserve"> test on unseen places and keep the weekly hand count.</w:t>
+        <w:t xml:space="preserve"> test on unseen places, send unsure items to Bin B and keep the weekly hand count.</w:t>
       </w:r>
     </w:p>
     <w:p>
@@ -2211,25 +2271,10 @@
         <w:rPr>
           <w:b/>
         </w:rPr>
-        <w:t>Safety and privacy:</w:t>
-      </w:r>
-      <w:r>
-        <w:t xml:space="preserve"> no student enters the water, the arm is guarded, and the camera sees the water only.</w:t>
-      </w:r>
-    </w:p>
-    <w:p>
-      <w:pPr>
-        <w:spacing w:line="360" w:lineRule="auto"/>
-        <w:rPr/>
-      </w:pPr>
-      <w:r>
-        <w:rPr>
-          <w:b/>
-        </w:rPr>
-        <w:t>Storms and theft:</w:t>
-      </w:r>
-      <w:r>
-        <w:t xml:space="preserve"> a quick-release line, electronics retrieved before a typhoon, and the camera mounted high.</w:t>
+        <w:t>Safety, privacy, storms and theft:</w:t>
+      </w:r>
+      <w:r>
+        <w:t xml:space="preserve"> no student enters the water, the arm is guarded, the camera sees the water only, and electronics are retrieved before a typhoon.</w:t>
       </w:r>
     </w:p>
     <w:p>
@@ -2280,7 +2325,7 @@
         <w:rPr/>
       </w:pPr>
       <w:r>
-        <w:t>Success means floating plastic lifted from a real creek and a trustworthy weekly record of what it was. One unit lifts little mass, so its value lies in a design cheap enough to copy and data open enough to combine.</w:t>
+        <w:t>Success means floating plastic lifted from a real creek and a trustworthy weekly record of what it was. One unit lifts little mass, so its value lies in a design cheap to copy and data open to combine.</w:t>
       </w:r>
     </w:p>
     <w:p>
@@ -2326,25 +2371,7 @@
         <w:t>1. Less plastic in the creek:</w:t>
       </w:r>
       <w:r>
-        <w:t xml:space="preserve"> at least </w:t>
-      </w:r>
-      <w:r>
-        <w:rPr>
-          <w:highlight w:val="yellow"/>
-        </w:rPr>
-        <w:t>[TARGET]</w:t>
-      </w:r>
-      <w:r>
-        <w:t xml:space="preserve"> kg lifted in 8 weeks, with a capture rate of at least </w:t>
-      </w:r>
-      <w:r>
-        <w:rPr>
-          <w:highlight w:val="yellow"/>
-        </w:rPr>
-        <w:t>[X]</w:t>
-      </w:r>
-      <w:r>
-        <w:t>% against the baseline week.</w:t>
+        <w:t xml:space="preserve"> a capture rate of at least 50% against the baseline week and at least 20 kg lifted in 8 weeks.</w:t>
       </w:r>
     </w:p>
     <w:p>
@@ -2359,7 +2386,7 @@
         <w:t>2. Trustworthy counts:</w:t>
       </w:r>
       <w:r>
-        <w:t xml:space="preserve"> weekly device error of 15% or less against the hand audit, at least 85% precision and recall on unseen places, and the rain-pulse question answered with data.</w:t>
+        <w:t xml:space="preserve"> at least 1,000 classified items, weekly device error of 15% or less against the hand audit, and at least 85% precision and recall on unseen places.</w:t>
       </w:r>
     </w:p>
     <w:p>
@@ -2374,16 +2401,7 @@
         <w:t>3. Replication:</w:t>
       </w:r>
       <w:r>
-        <w:t xml:space="preserve"> at least </w:t>
-      </w:r>
-      <w:r>
-        <w:rPr>
-          <w:highlight w:val="yellow"/>
-        </w:rPr>
-        <w:t>[2]</w:t>
-      </w:r>
-      <w:r>
-        <w:t xml:space="preserve"> more sites by March 2027 at about PHP 6,000 each, sharing one open data format. Until a second barangay builds a unit, we treat wider reach as a plan.</w:t>
+        <w:t xml:space="preserve"> at least 2 more sites by March 2027 at about PHP 6,000 each, sharing one open data format, with weekly labor hours reported so other barangays know the real workload.</w:t>
       </w:r>
     </w:p>
     <w:p>
@@ -2405,7 +2423,7 @@
         <w:t xml:space="preserve">Long-Term Vision: </w:t>
       </w:r>
       <w:r>
-        <w:t>We see a student-built, barangay-owned network of units along connected creeks that feeds one open dataset showing where plastic enters, which products dominate, and whether EPR commitments change what the water carries. Planned upgrades are a belt conveyor for higher volumes and a second camera angle. Each barangay added raises the value of every other unit's data. The pilot proves the method at one creek and claims no more.</w:t>
+        <w:t>We see a student-built, barangay-owned network of units along connected creeks that feeds one open dataset showing where plastic enters, which products dominate, and whether EPR commitments change what the water carries. Planned upgrades are a belt conveyor for higher volumes and a second camera angle.</w:t>
       </w:r>
     </w:p>
     <w:p>
@@ -2451,7 +2469,7 @@
         <w:rPr/>
       </w:pPr>
       <w:r>
-        <w:t>Break Free From Plastic and GAIA (2019). Plastics Exposed: How Waste Assessments and Brand Audits Are Helping Philippine Cities Fight Plastic Pollution.</w:t>
+        <w:t>Break Free From Plastic and GAIA (2019). Plastics Exposed.</w:t>
       </w:r>
     </w:p>
     <w:p>
@@ -2469,7 +2487,7 @@
         <w:rPr/>
       </w:pPr>
       <w:r>
-        <w:t>Cordova, M. R., &amp; Nurhati, I. S. (2019). Major sources and monthly variations in the release of land-derived marine debris from the Greater Jakarta area, Indonesia. Scientific Reports, 9, 18730.</w:t>
+        <w:t>Cordova, M. R., &amp; Nurhati, I. S. (2019). Release of land-derived marine debris from the Greater Jakarta area. Scientific Reports, 9, 18730.</w:t>
       </w:r>
     </w:p>
     <w:p>
@@ -2487,13 +2505,7 @@
         <w:rPr/>
       </w:pPr>
       <w:r>
-        <w:t xml:space="preserve">HydroSentinel (2026). An IoT-enabled autonomous surface vehicle for dual-scale riverine plastic detection and remediation. ScienceDirect. </w:t>
-      </w:r>
-      <w:r>
-        <w:rPr>
-          <w:highlight w:val="yellow"/>
-        </w:rPr>
-        <w:t>[add authors]</w:t>
+        <w:t>Food Packaging Forum (2026). Philippines steps up enforcement of plastic packaging recovery requirements. foodpackagingforum.org</w:t>
       </w:r>
     </w:p>
     <w:p>
@@ -2502,7 +2514,7 @@
         <w:rPr/>
       </w:pPr>
       <w:r>
-        <w:t>Jacob, B., et al. (2018). Quantization and training of neural networks for efficient integer-arithmetic-only inference. CVPR.</w:t>
+        <w:t>Jacob, B., et al. (2018). Quantization and training of neural networks for integer-arithmetic-only inference. CVPR.</w:t>
       </w:r>
     </w:p>
     <w:p>
@@ -2529,13 +2541,7 @@
         <w:rPr/>
       </w:pPr>
       <w:r>
-        <w:t xml:space="preserve">Manila Bulletin (August 24, 2026). Report on government estero trash traps and EPR audits. </w:t>
-      </w:r>
-      <w:r>
-        <w:rPr>
-          <w:highlight w:val="yellow"/>
-        </w:rPr>
-        <w:t>[add headline and byline]</w:t>
+        <w:t>Manila Bulletin (June 6, 2026). DENR, The Ocean Cleanup forge alliance for Pasig River.</w:t>
       </w:r>
     </w:p>
     <w:p>
@@ -2544,7 +2550,7 @@
         <w:rPr/>
       </w:pPr>
       <w:r>
-        <w:t>Meijer, L. J. J., et al. (2021). More than 1,000 rivers account for 80% of global riverine plastic emissions into the ocean. Science Advances, 7, eaaz5803.</w:t>
+        <w:t>Manila Bulletin (October 12, 2025). AI-powered robot waterway cleaning vehicle launched in Pasig.</w:t>
       </w:r>
     </w:p>
     <w:p>
@@ -2553,6 +2559,33 @@
         <w:rPr/>
       </w:pPr>
       <w:r>
+        <w:t>Meijer, L. J. J., et al. (2021). More than 1,000 rivers account for 80% of global riverine plastic emissions. Science Advances, 7, eaaz5803.</w:t>
+      </w:r>
+    </w:p>
+    <w:p>
+      <w:pPr>
+        <w:spacing w:line="276" w:lineRule="auto" w:after="60"/>
+        <w:rPr/>
+      </w:pPr>
+      <w:r>
+        <w:t>Philstar (August 28, 2025). Quezon City government, SMC team up for river cleanup.</w:t>
+      </w:r>
+    </w:p>
+    <w:p>
+      <w:pPr>
+        <w:spacing w:line="276" w:lineRule="auto" w:after="60"/>
+        <w:rPr/>
+      </w:pPr>
+      <w:r>
+        <w:t>Philstar (July 14, 2022). DENR-EMB to install trash traps in polluted rivers.</w:t>
+      </w:r>
+    </w:p>
+    <w:p>
+      <w:pPr>
+        <w:spacing w:line="276" w:lineRule="auto" w:after="60"/>
+        <w:rPr/>
+      </w:pPr>
+      <w:r>
         <w:t>Republic Act No. 11898 (2022). Extended Producer Responsibility Act of 2022.</w:t>
       </w:r>
     </w:p>
@@ -2562,7 +2595,7 @@
         <w:rPr/>
       </w:pPr>
       <w:r>
-        <w:t>Schmaltz, E., Melvin, E. C., Diana, Z., et al. (2020). Plastic pollution solutions: Emerging technologies to prevent and collect marine plastic pollution. Environment International, 144, 106067.</w:t>
+        <w:t>Schreyers, L., et al. (2021). Plastic plants: The role of water hyacinths in plastic transport in tropical rivers. Frontiers in Environmental Science, 9, 686334.</w:t>
       </w:r>
     </w:p>
     <w:p>
@@ -2571,7 +2604,7 @@
         <w:rPr/>
       </w:pPr>
       <w:r>
-        <w:t>Schreyers, L., et al. (2021). Plastic plants: The role of water hyacinths in plastic transport in tropical rivers. Frontiers in Environmental Science, 9, 686334.</w:t>
+        <w:t>The Ocean Cleanup (2026). Meycauayan plastic Interceptor rollout. Press release.</w:t>
       </w:r>
     </w:p>
     <w:p>
@@ -2589,7 +2622,7 @@
         <w:rPr/>
       </w:pPr>
       <w:r>
-        <w:t>van Lieshout, C., et al. (2020). Automated river plastic monitoring using deep learning and cameras. Earth and Space Science, 7, e2019EA000960.</w:t>
+        <w:t>van Lieshout, C., et al. (2020). Automated river plastic monitoring with deep learning and cameras. Earth and Space Science, 7, e2019EA000960.</w:t>
       </w:r>
     </w:p>
     <w:p>

</xml_diff>

<commit_message>
Hybrid floating-foot version at PHP 6,800, all references 2021 or later; previous files moved to old_versions
Co-Authored-By: Claude Sonnet 5.5 <noreply@anthropic.com>
Claude-Session: https://claude.ai/code/session_01BeuSv6ZfopDpEFLv7nhPKY
</commit_message>
<xml_diff>
--- a/sft_entry/SAGIP_SFT2026_Proposal.docx
+++ b/sft_entry/SAGIP_SFT2026_Proposal.docx
@@ -479,7 +479,7 @@
           </w:p>
           <w:p>
             <w:r>
-              <w:t>SAGIP is a low-cost, solar-powered unit that filters floating plastic out of a creek, lifts it into a sorted bin and names each item with a small on-chip image model. Barangay officials get a weekly offline report of what the creek carried, plus a secondary water-level alert for blockages. Built for about PHP 6,000 from local parts, it adds anonymized records to an open dataset that other barangays can copy.</w:t>
+              <w:t>SAGIP is a low-cost, solar-powered unit that filters floating plastic out of a creek, lifts it into a sorted bin and names each item with a small on-chip image model. Barangay officials get a weekly offline report of what the creek carried, plus a secondary water-level alert for blockages. Built for about PHP 6,800 from local parts, it adds anonymized records to an open dataset that other barangays can copy.</w:t>
             </w:r>
           </w:p>
         </w:tc>
@@ -545,16 +545,16 @@
         <w:rPr/>
       </w:pPr>
       <w:r>
-        <w:t>Plastic reaches the sea through rivers, and the Philippines ranks near the top in every estimate. Global models placed it among the leading sources of mismanaged plastic waste (Jambeck et al., 2015) and of river emissions (Lebreton et al., 2017), and a later model built on measurements from more than 1,000 rivers kept Philippine rivers at the top (Meijer et al., 2021). Monitoring at the river outlets of Greater Jakarta found higher debris release in the rainy season (Cordova &amp; Nurhati, 2019), and in the Saigon River water hyacinth mats carried most of the floating plastic that observers counted (Schreyers et al., 2021).</w:t>
-      </w:r>
-    </w:p>
-    <w:p>
-      <w:pPr>
-        <w:spacing w:line="360" w:lineRule="auto"/>
-        <w:rPr/>
-      </w:pPr>
-      <w:r>
-        <w:t>Two gaps keep the problem going. Removal is manual and unrecorded, so cleanups weigh bulk waste and learn nothing about its contents. Product-level evidence is also scarce. River plastic research still lacks long-term monitoring data (van Emmerik &amp; Schwarz, 2020), and brand audits, though valuable, are periodic, labor-intensive and mostly land-based (Break Free From Plastic, 2019). The Extended Producer Responsibility Act of 2022 (RA 11898) obliges large companies to recover a rising share of their plastic packaging, and the DENR has begun auditing reported recovery rates (Food Packaging Forum, 2026). Enforcement still needs proof of which packaging reaches waterways.</w:t>
+        <w:t>Plastic reaches the sea through rivers, and the Philippines ranks near the top in every estimate. A global model built on measurements from more than 1,000 rivers ranked the Philippines first among countries for river plastic emissions (Meijer et al., 2021). Floating plastic transport rises sharply with river discharge, reaching up to six times its normal rate at peak flow in a year-long monitoring study (van Emmerik et al., 2022), and in the Saigon River water hyacinth mats carried most of the floating plastic that observers counted (Schreyers et al., 2021).</w:t>
+      </w:r>
+    </w:p>
+    <w:p>
+      <w:pPr>
+        <w:spacing w:line="360" w:lineRule="auto"/>
+        <w:rPr/>
+      </w:pPr>
+      <w:r>
+        <w:t>Two gaps keep the problem going. Removal is manual and unrecorded, so cleanups weigh bulk waste and learn nothing about its contents. Product-level evidence is also scarce. Community-run monitoring of freshwater plastic is still rare (Cook et al., 2021), and brand audits, though valuable, are periodic, labor-intensive and mostly land-based (Break Free From Plastic, 2021). The Extended Producer Responsibility Act of 2022 (RA 11898) obliges large companies to recover a rising share of their plastic packaging, and the DENR has begun auditing reported recovery rates (Food Packaging Forum, 2026). Enforcement still needs proof of which packaging reaches waterways.</w:t>
       </w:r>
     </w:p>
     <w:p>
@@ -736,7 +736,7 @@
         <w:t>3. Make it copyable.</w:t>
       </w:r>
       <w:r>
-        <w:t xml:space="preserve"> By March 2027, publish a free English and Filipino build guide and an open dataset, and help at least 2 other barangays or schools build a unit for about PHP 6,000 each.</w:t>
+        <w:t xml:space="preserve"> By March 2027, publish a free English and Filipino build guide and an open dataset, and help at least 2 other barangays or schools build a unit for about PHP 6,800 each.</w:t>
       </w:r>
     </w:p>
     <w:p>
@@ -829,7 +829,7 @@
         <w:t>[ESTERO SITE]</w:t>
       </w:r>
       <w:r>
-        <w:t xml:space="preserve"> in Quezon City, who bear the creek's pollution and flooding, and the barangay sanitation officers, who will empty the bins weekly and use the report. Secondary beneficiaries are the city solid-waste office and the DENR, who need item-level evidence for EPR enforcement, at least 2 neighboring barangays or schools that copy the design by March 2027, and downstream fisherfolk as less plastic reaches Manila Bay. We chose a barangay estero because Quezon City already runs river programs with partners (Philstar, 2025), and community-based monitoring builds local ownership of data (Conrad &amp; Hilchey, 2011). </w:t>
+        <w:t xml:space="preserve"> in Quezon City, who bear the creek's pollution and flooding, and the barangay sanitation officers, who will empty the bins weekly and use the report. Secondary beneficiaries are the city solid-waste office and the DENR, who need item-level evidence for EPR enforcement, at least 2 neighboring barangays or schools that copy the design by March 2027, and downstream fisherfolk as less plastic reaches Manila Bay. We chose a barangay estero because Quezon City already runs river programs with partners (Philstar, 2025), and citizen-science monitoring of freshwater plastic is still rare, so a barangay-run record adds new data (Cook et al., 2021). </w:t>
       </w:r>
       <w:r>
         <w:rPr>
@@ -908,7 +908,7 @@
         <w:t xml:space="preserve">Select. </w:t>
       </w:r>
       <w:r>
-        <w:t xml:space="preserve">We listed five community problems and scored each on significance, feasibility, STEM depth, replicability and originality. Creek plastic won. We can reach a creek, we can measure it weekly, and RA 11898 has just made item-level data useful. We then fitted the design to PHP 6,000 with a bank-mounted unit, an image classifier and a sorting gate. </w:t>
+        <w:t xml:space="preserve">We listed five community problems and scored each on significance, feasibility, STEM depth, replicability and originality. Creek plastic won. We can reach a creek, we can measure it weekly, and RA 11898 has just made item-level data useful. We then fitted the design to PHP 6,800 with a bank-mounted unit, an image classifier and a sorting gate. </w:t>
       </w:r>
       <w:r>
         <w:rPr>
@@ -1015,7 +1015,7 @@
               <w:spacing w:line="240" w:lineRule="auto" w:after="40" w:before="40"/>
             </w:pPr>
             <w:r>
-              <w:t>Cameras with deep learning (van Lieshout et al., 2020)</w:t>
+              <w:t>Cameras with deep learning (Kataoka et al., 2024)</w:t>
             </w:r>
           </w:p>
         </w:tc>
@@ -1029,7 +1029,7 @@
               <w:spacing w:line="240" w:lineRule="auto" w:after="40" w:before="40"/>
             </w:pPr>
             <w:r>
-              <w:t>Count floating plastic from bridge-mounted cameras, tested in Jakarta</w:t>
+              <w:t>Detect floating plastic in images from fixed river cameras</w:t>
             </w:r>
           </w:p>
         </w:tc>
@@ -1190,7 +1190,7 @@
               <w:spacing w:line="240" w:lineRule="auto" w:after="40" w:before="40"/>
             </w:pPr>
             <w:r>
-              <w:t>Brand audits (Break Free From Plastic, 2019)</w:t>
+              <w:t>Brand audits (Break Free From Plastic, 2021)</w:t>
             </w:r>
           </w:p>
         </w:tc>
@@ -1235,7 +1235,7 @@
         <w:t xml:space="preserve">Gap we test. </w:t>
       </w:r>
       <w:r>
-        <w:t>None of these lifts plastic, counts it item by item and shares open data in a unit a barangay can afford. Our search was limited and found no such system. We therefore ask one research question: can a PHP 6,000 on-chip counter match a trained hand audit within 15%, and does continuous counting reveal rain-driven pulses of plastic that weekly audits miss?</w:t>
+        <w:t>None of these lifts plastic, counts it item by item and shares open data in a unit a barangay can afford. Our search was limited and found no such system. We therefore ask one research question: can a PHP 6,800 on-chip counter match a trained hand audit within 15%, and does continuous counting reveal rain-driven pulses of plastic that weekly audits miss?</w:t>
       </w:r>
     </w:p>
     <w:p>
@@ -1301,7 +1301,7 @@
         <w:rPr/>
       </w:pPr>
       <w:r>
-        <w:t>STEM is the core of the design. Physics sets the boom angle, the lever and torque of the arm and the solar energy budget. Mathematics and statistics define precision, recall and count error. Computer science supplies a small 2D convolutional neural network (CNN) with INT8 quantization, which shrinks a model about fourfold with little loss of accuracy (Jacob et al., 2018), running on TensorFlow Lite for Microcontrollers (David et al., 2021). Engineering joins them in a weatherproof structure. Our key message is that proof of what plastic reaches a creek can be continuous, cheap and community-owned. Pairing a collector with a counter delivers it best.</w:t>
+        <w:t>STEM is the core of the design. Physics sets the boom angle, the lever and torque of the arm and the solar energy budget. Mathematics and statistics define precision, recall and count error. Computer science supplies a small 2D convolutional neural network (CNN) with INT8 quantization, which shrinks a model about fourfold with little loss of accuracy (Gholami et al., 2021), running on TensorFlow Lite for Microcontrollers (David et al., 2021). Engineering joins them in a weatherproof structure. Our key message is that proof of what plastic reaches a creek can be continuous, cheap and community-owned. Pairing a collector with a counter delivers it best.</w:t>
       </w:r>
     </w:p>
     <w:p>
@@ -1381,7 +1381,7 @@
         <w:t xml:space="preserve">Filter. </w:t>
       </w:r>
       <w:r>
-        <w:t>Coarse bars stop large debris, then a fine mesh basket catches small plastic. Both slope so leaves and mud shed. The foot of the ramp is hinged and rides on bottle floats, so it follows the water level as rain raises and lowers the creek.</w:t>
+        <w:t>Coarse bars stop large debris, then a fine mesh basket catches small plastic. Both slope so leaves and mud shed. The foot of the ramp is hinged, rides on bottle floats and joins the fixed ramp through a short flexible chute, so it follows the water level as rain raises and lowers the creek.</w:t>
       </w:r>
     </w:p>
     <w:p>
@@ -1616,7 +1616,7 @@
         <w:rPr/>
       </w:pPr>
       <w:r>
-        <w:t>The pilot unit costs about PHP 6,000 and is built in three stages, each bought only after the previous test passes.</w:t>
+        <w:t>The pilot unit costs about PHP 6,800 and is built in three stages, each bought only after the previous test passes.</w:t>
       </w:r>
     </w:p>
     <w:p>
@@ -1857,7 +1857,7 @@
               <w:spacing w:line="240" w:lineRule="auto" w:after="40" w:before="40"/>
             </w:pPr>
             <w:r>
-              <w:t>Ramp with hinged float foot, rake arm, coarse bars, fine mesh, spare shear pins</w:t>
+              <w:t>Ramp, rake arm, coarse bars, fine mesh, spare shear pins</w:t>
             </w:r>
           </w:p>
         </w:tc>
@@ -1873,6 +1873,37 @@
             </w:pPr>
             <w:r>
               <w:t>350</w:t>
+            </w:r>
+          </w:p>
+        </w:tc>
+      </w:tr>
+      <w:tr>
+        <w:tc>
+          <w:tcPr>
+            <w:tcW w:type="dxa" w:w="7776"/>
+          </w:tcPr>
+          <w:p>
+            <w:pPr>
+              <w:keepNext/>
+              <w:spacing w:line="240" w:lineRule="auto" w:after="40" w:before="40"/>
+            </w:pPr>
+            <w:r>
+              <w:t>Hinged float foot: bottle floats, hinges, stainless hardware, flexible chute</w:t>
+            </w:r>
+          </w:p>
+        </w:tc>
+        <w:tc>
+          <w:tcPr>
+            <w:tcW w:type="dxa" w:w="1584"/>
+          </w:tcPr>
+          <w:p>
+            <w:pPr>
+              <w:keepNext/>
+              <w:spacing w:line="240" w:lineRule="auto" w:after="40" w:before="40"/>
+              <w:jc w:val="right"/>
+            </w:pPr>
+            <w:r>
+              <w:t>600</w:t>
             </w:r>
           </w:p>
         </w:tc>
@@ -1909,7 +1940,7 @@
               <w:rPr>
                 <w:b/>
               </w:rPr>
-              <w:t>5,850</w:t>
+              <w:t>6,450</w:t>
             </w:r>
           </w:p>
         </w:tc>
@@ -1946,7 +1977,7 @@
               <w:rPr>
                 <w:b/>
               </w:rPr>
-              <w:t>150</w:t>
+              <w:t>350</w:t>
             </w:r>
           </w:p>
         </w:tc>
@@ -1981,7 +2012,7 @@
               <w:rPr>
                 <w:b/>
               </w:rPr>
-              <w:t>6,000</w:t>
+              <w:t>6,800</w:t>
             </w:r>
           </w:p>
         </w:tc>
@@ -2027,10 +2058,10 @@
         <w:rPr>
           <w:b/>
         </w:rPr>
-        <w:t>Stage 2, passive trap (about PHP 2,650).</w:t>
-      </w:r>
-      <w:r>
-        <w:t xml:space="preserve"> Install the boom, deflector, filter, hinged ramp foot, bins, post, solar supply and level sensor. Gate: the boom survives at least 3 rain events and weekly counts fall within 15% of hand counts.</w:t>
+        <w:t>Stage 2, passive trap (about PHP 3,250).</w:t>
+      </w:r>
+      <w:r>
+        <w:t xml:space="preserve"> Install the boom, deflector, filter, hinged float foot with chute, bins, post, solar supply and level sensor. Gate: the boom survives at least 3 rain events and weekly counts fall within 15% of hand counts.</w:t>
       </w:r>
     </w:p>
     <w:p>
@@ -2214,7 +2245,7 @@
         <w:t>Changing water level:</w:t>
       </w:r>
       <w:r>
-        <w:t xml:space="preserve"> a hinged ramp foot on floats and a level sensor that stops the arm above a set height.</w:t>
+        <w:t xml:space="preserve"> a hinged ramp foot on floats with a flexible chute, and a level sensor that stops the arm above a set height.</w:t>
       </w:r>
     </w:p>
     <w:p>
@@ -2401,7 +2432,7 @@
         <w:t>3. Replication:</w:t>
       </w:r>
       <w:r>
-        <w:t xml:space="preserve"> at least 2 more sites by March 2027 at about PHP 6,000 each, sharing one open data format, with weekly labor hours reported so other barangays know the real workload.</w:t>
+        <w:t xml:space="preserve"> at least 2 more sites by March 2027 at about PHP 6,800 each, sharing one open data format, with weekly labor hours reported so other barangays know the real workload.</w:t>
       </w:r>
     </w:p>
     <w:p>
@@ -2469,7 +2500,7 @@
         <w:rPr/>
       </w:pPr>
       <w:r>
-        <w:t>Break Free From Plastic and GAIA (2019). Plastics Exposed.</w:t>
+        <w:t>Break Free From Plastic (2021). BRANDED Volume IV: Holding corporations accountable for the plastic and climate crisis.</w:t>
       </w:r>
     </w:p>
     <w:p>
@@ -2478,7 +2509,7 @@
         <w:rPr/>
       </w:pPr>
       <w:r>
-        <w:t>Conrad, C. C., &amp; Hilchey, K. G. (2011). A review of citizen science and community-based environmental monitoring. Environmental Monitoring and Assessment, 176, 273-291.</w:t>
+        <w:t>Cook, S., Abolfathi, S., &amp; Gilbert, N. I. (2021). Goals and approaches in the use of citizen science for exploring plastic pollution in freshwater ecosystems: A review. Freshwater Science, 40.</w:t>
       </w:r>
     </w:p>
     <w:p>
@@ -2487,7 +2518,7 @@
         <w:rPr/>
       </w:pPr>
       <w:r>
-        <w:t>Cordova, M. R., &amp; Nurhati, I. S. (2019). Release of land-derived marine debris from the Greater Jakarta area. Scientific Reports, 9, 18730.</w:t>
+        <w:t>David, R., et al. (2021). TensorFlow Lite Micro: Embedded machine learning for TinyML systems. Proceedings of Machine Learning and Systems, 3.</w:t>
       </w:r>
     </w:p>
     <w:p>
@@ -2496,7 +2527,7 @@
         <w:rPr/>
       </w:pPr>
       <w:r>
-        <w:t>David, R., et al. (2021). TensorFlow Lite Micro: Embedded machine learning for TinyML systems. Proceedings of Machine Learning and Systems, 3.</w:t>
+        <w:t>Food Packaging Forum (2026). Philippines steps up enforcement of plastic packaging recovery requirements. foodpackagingforum.org</w:t>
       </w:r>
     </w:p>
     <w:p>
@@ -2505,7 +2536,7 @@
         <w:rPr/>
       </w:pPr>
       <w:r>
-        <w:t>Food Packaging Forum (2026). Philippines steps up enforcement of plastic packaging recovery requirements. foodpackagingforum.org</w:t>
+        <w:t>Gholami, A., et al. (2021). A survey of quantization methods for efficient neural network inference. arXiv:2103.13630.</w:t>
       </w:r>
     </w:p>
     <w:p>
@@ -2514,7 +2545,7 @@
         <w:rPr/>
       </w:pPr>
       <w:r>
-        <w:t>Jacob, B., et al. (2018). Quantization and training of neural networks for integer-arithmetic-only inference. CVPR.</w:t>
+        <w:t>Kataoka, T., Yoshida, T., &amp; Yamamoto, N. (2024). Instance segmentation models for detecting floating macroplastic debris from river surface images. Frontiers in Earth Science, 12, 1427132.</w:t>
       </w:r>
     </w:p>
     <w:p>
@@ -2523,7 +2554,7 @@
         <w:rPr/>
       </w:pPr>
       <w:r>
-        <w:t>Jambeck, J. R., et al. (2015). Plastic waste inputs from land into the ocean. Science, 347, 768-771.</w:t>
+        <w:t>Manila Bulletin (June 6, 2026). DENR, The Ocean Cleanup forge alliance for Pasig River.</w:t>
       </w:r>
     </w:p>
     <w:p>
@@ -2532,7 +2563,7 @@
         <w:rPr/>
       </w:pPr>
       <w:r>
-        <w:t>Lebreton, L. C. M., et al. (2017). River plastic emissions to the world's oceans. Nature Communications, 8, 15611.</w:t>
+        <w:t>Manila Bulletin (October 12, 2025). AI-powered robot waterway cleaning vehicle launched in Pasig.</w:t>
       </w:r>
     </w:p>
     <w:p>
@@ -2541,7 +2572,7 @@
         <w:rPr/>
       </w:pPr>
       <w:r>
-        <w:t>Manila Bulletin (June 6, 2026). DENR, The Ocean Cleanup forge alliance for Pasig River.</w:t>
+        <w:t>Meijer, L. J. J., et al. (2021). More than 1,000 rivers account for 80% of global riverine plastic emissions. Science Advances, 7, eaaz5803.</w:t>
       </w:r>
     </w:p>
     <w:p>
@@ -2550,7 +2581,7 @@
         <w:rPr/>
       </w:pPr>
       <w:r>
-        <w:t>Manila Bulletin (October 12, 2025). AI-powered robot waterway cleaning vehicle launched in Pasig.</w:t>
+        <w:t>Philstar (August 28, 2025). Quezon City government, SMC team up for river cleanup.</w:t>
       </w:r>
     </w:p>
     <w:p>
@@ -2559,7 +2590,7 @@
         <w:rPr/>
       </w:pPr>
       <w:r>
-        <w:t>Meijer, L. J. J., et al. (2021). More than 1,000 rivers account for 80% of global riverine plastic emissions. Science Advances, 7, eaaz5803.</w:t>
+        <w:t>Philstar (July 14, 2022). DENR-EMB to install trash traps in polluted rivers.</w:t>
       </w:r>
     </w:p>
     <w:p>
@@ -2568,7 +2599,7 @@
         <w:rPr/>
       </w:pPr>
       <w:r>
-        <w:t>Philstar (August 28, 2025). Quezon City government, SMC team up for river cleanup.</w:t>
+        <w:t>Republic Act No. 11898 (2022). Extended Producer Responsibility Act of 2022.</w:t>
       </w:r>
     </w:p>
     <w:p>
@@ -2577,7 +2608,7 @@
         <w:rPr/>
       </w:pPr>
       <w:r>
-        <w:t>Philstar (July 14, 2022). DENR-EMB to install trash traps in polluted rivers.</w:t>
+        <w:t>Schreyers, L., et al. (2021). Plastic plants: The role of water hyacinths in plastic transport in tropical rivers. Frontiers in Environmental Science, 9, 686334.</w:t>
       </w:r>
     </w:p>
     <w:p>
@@ -2586,7 +2617,7 @@
         <w:rPr/>
       </w:pPr>
       <w:r>
-        <w:t>Republic Act No. 11898 (2022). Extended Producer Responsibility Act of 2022.</w:t>
+        <w:t>The Ocean Cleanup (2026). Meycauayan plastic Interceptor rollout. Press release.</w:t>
       </w:r>
     </w:p>
     <w:p>
@@ -2595,34 +2626,7 @@
         <w:rPr/>
       </w:pPr>
       <w:r>
-        <w:t>Schreyers, L., et al. (2021). Plastic plants: The role of water hyacinths in plastic transport in tropical rivers. Frontiers in Environmental Science, 9, 686334.</w:t>
-      </w:r>
-    </w:p>
-    <w:p>
-      <w:pPr>
-        <w:spacing w:line="276" w:lineRule="auto" w:after="60"/>
-        <w:rPr/>
-      </w:pPr>
-      <w:r>
-        <w:t>The Ocean Cleanup (2026). Meycauayan plastic Interceptor rollout. Press release.</w:t>
-      </w:r>
-    </w:p>
-    <w:p>
-      <w:pPr>
-        <w:spacing w:line="276" w:lineRule="auto" w:after="60"/>
-        <w:rPr/>
-      </w:pPr>
-      <w:r>
-        <w:t>van Emmerik, T., &amp; Schwarz, A. (2020). Plastic debris in rivers. WIREs Water, 7, e1398.</w:t>
-      </w:r>
-    </w:p>
-    <w:p>
-      <w:pPr>
-        <w:spacing w:line="276" w:lineRule="auto" w:after="60"/>
-        <w:rPr/>
-      </w:pPr>
-      <w:r>
-        <w:t>van Lieshout, C., et al. (2020). Automated river plastic monitoring with deep learning and cameras. Earth and Space Science, 7, e2019EA000960.</w:t>
+        <w:t>van Emmerik, T. H. M., et al. (2022). Hydrology as a driver of floating river plastic transport. Earth's Future, 10, e2022EF002811.</w:t>
       </w:r>
     </w:p>
     <w:p>

</xml_diff>

<commit_message>
Fully floating version at PHP 12,000: raft on four drums with mooring, rebuilt entry, PPT, prototype design and drawings; hybrid versions kept in old_versions
Co-Authored-By: Claude Sonnet 5.5 <noreply@anthropic.com>
Claude-Session: https://claude.ai/code/session_01BeuSv6ZfopDpEFLv7nhPKY
</commit_message>
<xml_diff>
--- a/sft_entry/SAGIP_SFT2026_Proposal.docx
+++ b/sft_entry/SAGIP_SFT2026_Proposal.docx
@@ -415,7 +415,7 @@
               <w:rPr>
                 <w:b w:val="0"/>
               </w:rPr>
-              <w:t xml:space="preserve"> SAGIP: Solar-Powered Estero Guardian with On-Chip AI</w:t>
+              <w:t xml:space="preserve"> SAGIP: Floating Solar-Powered Estero Guardian with On-Chip AI</w:t>
             </w:r>
           </w:p>
         </w:tc>
@@ -479,7 +479,7 @@
           </w:p>
           <w:p>
             <w:r>
-              <w:t>SAGIP is a low-cost, solar-powered unit that filters floating plastic out of a creek, lifts it into a sorted bin and names each item with a small on-chip image model. Barangay officials get a weekly offline report of what the creek carried, plus a secondary water-level alert for blockages. Built for about PHP 6,800 from local parts, it adds anonymized records to an open dataset that other barangays can copy.</w:t>
+              <w:t>SAGIP is a low-cost, floating, solar-powered raft that filters plastic out of a creek, lifts it into a sorted bin and names each item with a small on-chip image model. Barangay officials get a weekly offline report of what the creek carried, plus a secondary water-level alert for blockages. Built for about PHP 12,000 from local parts, it adds anonymized records to an open dataset that other barangays can copy.</w:t>
             </w:r>
           </w:p>
         </w:tc>
@@ -736,7 +736,7 @@
         <w:t>3. Make it copyable.</w:t>
       </w:r>
       <w:r>
-        <w:t xml:space="preserve"> By March 2027, publish a free English and Filipino build guide and an open dataset, and help at least 2 other barangays or schools build a unit for about PHP 6,800 each.</w:t>
+        <w:t xml:space="preserve"> By March 2027, publish a free English and Filipino build guide and an open dataset, and help at least 2 other barangays or schools build a unit for about PHP 12,000 each.</w:t>
       </w:r>
     </w:p>
     <w:p>
@@ -908,7 +908,7 @@
         <w:t xml:space="preserve">Select. </w:t>
       </w:r>
       <w:r>
-        <w:t xml:space="preserve">We listed five community problems and scored each on significance, feasibility, STEM depth, replicability and originality. Creek plastic won. We can reach a creek, we can measure it weekly, and RA 11898 has just made item-level data useful. We then fitted the design to PHP 6,800 with a bank-mounted unit, an image classifier and a sorting gate. </w:t>
+        <w:t xml:space="preserve">We listed five community problems and scored each on significance, feasibility, STEM depth, replicability and originality. Creek plastic won. We can reach a creek, we can measure it weekly, and RA 11898 has just made item-level data useful. We then fitted the design to about PHP 12,000 with a floating raft, an image classifier and a sorting gate. </w:t>
       </w:r>
       <w:r>
         <w:rPr>
@@ -1235,7 +1235,7 @@
         <w:t xml:space="preserve">Gap we test. </w:t>
       </w:r>
       <w:r>
-        <w:t>None of these lifts plastic, counts it item by item and shares open data in a unit a barangay can afford. Our search was limited and found no such system. We therefore ask one research question: can a PHP 6,800 on-chip counter match a trained hand audit within 15%, and does continuous counting reveal rain-driven pulses of plastic that weekly audits miss?</w:t>
+        <w:t>None of these lifts plastic, counts it item by item and shares open data in a unit a barangay can afford. Our search was limited and found no such system. We therefore ask one research question: can a PHP 12,000 on-chip counter match a trained hand audit within 15%, and does continuous counting reveal rain-driven pulses of plastic that weekly audits miss?</w:t>
       </w:r>
     </w:p>
     <w:p>
@@ -1301,7 +1301,7 @@
         <w:rPr/>
       </w:pPr>
       <w:r>
-        <w:t>STEM is the core of the design. Physics sets the boom angle, the lever and torque of the arm and the solar energy budget. Mathematics and statistics define precision, recall and count error. Computer science supplies a small 2D convolutional neural network (CNN) with INT8 quantization, which shrinks a model about fourfold with little loss of accuracy (Gholami et al., 2021), running on TensorFlow Lite for Microcontrollers (David et al., 2021). Engineering joins them in a weatherproof structure. Our key message is that proof of what plastic reaches a creek can be continuous, cheap and community-owned. Pairing a collector with a counter delivers it best.</w:t>
+        <w:t>STEM is the core of the design. Physics sets the raft's buoyancy, the boom angle, the lever and torque of the arm and the solar energy budget. Mathematics and statistics define precision, recall and count error. Computer science supplies a small 2D convolutional neural network (CNN) with INT8 quantization, which shrinks a model about fourfold with little loss of accuracy (Gholami et al., 2021), running on TensorFlow Lite for Microcontrollers (David et al., 2021). Engineering joins them in a weatherproof structure. Our key message is that proof of what plastic reaches a creek can be continuous, cheap and community-owned. Pairing a collector with a counter delivers it best.</w:t>
       </w:r>
     </w:p>
     <w:p>
@@ -1363,25 +1363,25 @@
         <w:rPr>
           <w:b/>
         </w:rPr>
-        <w:t xml:space="preserve">Catch. </w:t>
-      </w:r>
-      <w:r>
-        <w:t>A floating boom of reused PET bottles with a net skirt guides surface debris toward the bank. A wide-gapped deflector upstream turns water hyacinth mats aside. The current does the herding, so the boom needs no energy.</w:t>
-      </w:r>
-    </w:p>
-    <w:p>
-      <w:pPr>
-        <w:spacing w:line="360" w:lineRule="auto"/>
-        <w:rPr/>
-      </w:pPr>
-      <w:r>
-        <w:rPr>
-          <w:b/>
-        </w:rPr>
-        <w:t xml:space="preserve">Filter. </w:t>
-      </w:r>
-      <w:r>
-        <w:t>Coarse bars stop large debris, then a fine mesh basket catches small plastic. Both slope so leaves and mud shed. The foot of the ramp is hinged, rides on bottle floats and joins the fixed ramp through a short flexible chute, so it follows the water level as rain raises and lowers the creek.</w:t>
+        <w:t xml:space="preserve">Float. </w:t>
+      </w:r>
+      <w:r>
+        <w:t>Four sealed 200 L plastic drums carry a deck frame. For a planning load of about 60 kg the raft rides high. Two mooring lines hold the bow upstream, and a haul line lets adults pull the raft to the bank to empty the bins or to shelter from a typhoon. It sits along one side of the channel and leaves a clear flow path.</w:t>
+      </w:r>
+    </w:p>
+    <w:p>
+      <w:pPr>
+        <w:spacing w:line="360" w:lineRule="auto"/>
+        <w:rPr/>
+      </w:pPr>
+      <w:r>
+        <w:rPr>
+          <w:b/>
+        </w:rPr>
+        <w:t xml:space="preserve">Catch and filter. </w:t>
+      </w:r>
+      <w:r>
+        <w:t>A boom of reused PET bottles with a net skirt guides surface debris to the raft's bow, and a wide-gapped deflector upstream turns water hyacinth mats aside. Coarse bars stop large debris and a fine mesh basket catches small plastic. Both slope so leaves and mud shed.</w:t>
       </w:r>
     </w:p>
     <w:p>
@@ -1396,7 +1396,7 @@
         <w:t xml:space="preserve">Lift. </w:t>
       </w:r>
       <w:r>
-        <w:t>A worm-gear DC motor, mounted above the flood mark, turns a short rake arm that sweeps debris up the ramp in bursts. A sacrificial shear pin protects the gearbox. A guard, stop switch and lockout protect people.</w:t>
+        <w:t>A worm-gear DC motor on the deck turns a short rake arm that sweeps debris up the ramp in bursts. A sacrificial shear pin protects the gearbox. A guard, stop switch and lockout protect people.</w:t>
       </w:r>
     </w:p>
     <w:p>
@@ -1456,7 +1456,7 @@
         <w:t xml:space="preserve">Report. </w:t>
       </w:r>
       <w:r>
-        <w:t>A phone reads an offline Wi-Fi page hosted by the chip. Each record stores class, time, water level and an image hash in an append-only log on a microSD card, with time from a clock module. A script builds the weekly report and an anonymized open dataset, and plotting counts against rainfall shows whether plastic arrives in pulses.</w:t>
+        <w:t>A phone reads an offline Wi-Fi page hosted by the chip. Each record stores class, time, water level and an image hash in an append-only log on a microSD card, with time from a clock module. A script builds the weekly report and an anonymized open dataset, and counts are plotted against rainfall.</w:t>
       </w:r>
     </w:p>
     <w:p>
@@ -1506,7 +1506,7 @@
         <w:rPr>
           <w:i/>
         </w:rPr>
-        <w:t>Figure 2. Cutaway of the SAGIP unit at the creek bank (schematic).</w:t>
+        <w:t>Figure 2. Cutaway of the floating SAGIP unit (schematic).</w:t>
       </w:r>
     </w:p>
     <w:p>
@@ -1536,7 +1536,7 @@
         <w:t xml:space="preserve">Power. </w:t>
       </w:r>
       <w:r>
-        <w:t>Planning figures until bench measurements replace them. The camera runs only when an item is present. Electronics draw about 6 Wh per day and the arm about 0.3 Wh. A 6 W panel yields about 11 Wh per day at 3 effective sun-hours and 60% efficiency, and two 18650 cells store about 18 Wh. When the battery is low the chip lengthens its capture interval.</w:t>
+        <w:t>Planning figures until bench measurements replace them. The camera runs only when an item is present. Electronics draw about 6 Wh per day and the arm about 0.3 Wh. A 10 W panel yields about 18 Wh per day at 3 effective sun-hours and 60% efficiency, and two 18650 cells store about 18 Wh. When the battery is low the chip lengthens its capture interval.</w:t>
       </w:r>
     </w:p>
     <w:p>
@@ -1551,7 +1551,7 @@
         <w:t xml:space="preserve">Scope. </w:t>
       </w:r>
       <w:r>
-        <w:t>SAGIP lifts light floating debris such as bottles, sachets, bags, foam and cups. Heavy or tangled items, hyacinth mats, sunken waste and dissolved pollutants fall outside its reach, so we report a measured capture rate instead of claiming a clean creek.</w:t>
+        <w:t>SAGIP lifts light floating debris such as bottles, sachets, bags, foam and cups. Heavy or tangled items, hyacinth mats, sunken waste and dissolved pollutants fall outside its reach, so we report a measured capture rate.</w:t>
       </w:r>
     </w:p>
     <w:p>
@@ -1616,7 +1616,7 @@
         <w:rPr/>
       </w:pPr>
       <w:r>
-        <w:t>The pilot unit costs about PHP 6,800 and is built in three stages, each bought only after the previous test passes.</w:t>
+        <w:t>The pilot unit costs about PHP 12,000 and is built in three stages, each bought only after the previous test passes.</w:t>
       </w:r>
     </w:p>
     <w:p>
@@ -1733,7 +1733,7 @@
               <w:spacing w:line="240" w:lineRule="auto" w:after="40" w:before="40"/>
             </w:pPr>
             <w:r>
-              <w:t>6 W solar panel, charge controller, two 18650 cells, converter</w:t>
+              <w:t>10 W solar panel, charge controller, two 18650 cells, converter</w:t>
             </w:r>
           </w:p>
         </w:tc>
@@ -1748,7 +1748,7 @@
               <w:jc w:val="right"/>
             </w:pPr>
             <w:r>
-              <w:t>1,200</w:t>
+              <w:t>1,400</w:t>
             </w:r>
           </w:p>
         </w:tc>
@@ -1764,7 +1764,7 @@
               <w:spacing w:line="240" w:lineRule="auto" w:after="40" w:before="40"/>
             </w:pPr>
             <w:r>
-              <w:t>Boom rope and net, anchor and post, two bins and staff gauge, wiring, fuse and switch</w:t>
+              <w:t>Wiring, fuse, switch, two bins, staff gauge</w:t>
             </w:r>
           </w:p>
         </w:tc>
@@ -1779,7 +1779,7 @@
               <w:jc w:val="right"/>
             </w:pPr>
             <w:r>
-              <w:t>1,100</w:t>
+              <w:t>400</w:t>
             </w:r>
           </w:p>
         </w:tc>
@@ -1826,7 +1826,7 @@
               <w:spacing w:line="240" w:lineRule="auto" w:after="40" w:before="40"/>
             </w:pPr>
             <w:r>
-              <w:t>Geared motor, driver, current and motion sensing, servo gate</w:t>
+              <w:t>Worm-gear motor, driver, current and motion sensing, servo gate</w:t>
             </w:r>
           </w:p>
         </w:tc>
@@ -1872,7 +1872,7 @@
               <w:jc w:val="right"/>
             </w:pPr>
             <w:r>
-              <w:t>350</w:t>
+              <w:t>500</w:t>
             </w:r>
           </w:p>
         </w:tc>
@@ -1888,7 +1888,131 @@
               <w:spacing w:line="240" w:lineRule="auto" w:after="40" w:before="40"/>
             </w:pPr>
             <w:r>
-              <w:t>Hinged float foot: bottle floats, hinges, stainless hardware, flexible chute</w:t>
+              <w:t>Pontoons: four reused 200 L drums with sealed caps</w:t>
+            </w:r>
+          </w:p>
+        </w:tc>
+        <w:tc>
+          <w:tcPr>
+            <w:tcW w:type="dxa" w:w="1584"/>
+          </w:tcPr>
+          <w:p>
+            <w:pPr>
+              <w:keepNext/>
+              <w:spacing w:line="240" w:lineRule="auto" w:after="40" w:before="40"/>
+              <w:jc w:val="right"/>
+            </w:pPr>
+            <w:r>
+              <w:t>2,000</w:t>
+            </w:r>
+          </w:p>
+        </w:tc>
+      </w:tr>
+      <w:tr>
+        <w:tc>
+          <w:tcPr>
+            <w:tcW w:type="dxa" w:w="7776"/>
+          </w:tcPr>
+          <w:p>
+            <w:pPr>
+              <w:keepNext/>
+              <w:spacing w:line="240" w:lineRule="auto" w:after="40" w:before="40"/>
+            </w:pPr>
+            <w:r>
+              <w:t>Deck frame and guard rails</w:t>
+            </w:r>
+          </w:p>
+        </w:tc>
+        <w:tc>
+          <w:tcPr>
+            <w:tcW w:type="dxa" w:w="1584"/>
+          </w:tcPr>
+          <w:p>
+            <w:pPr>
+              <w:keepNext/>
+              <w:spacing w:line="240" w:lineRule="auto" w:after="40" w:before="40"/>
+              <w:jc w:val="right"/>
+            </w:pPr>
+            <w:r>
+              <w:t>1,900</w:t>
+            </w:r>
+          </w:p>
+        </w:tc>
+      </w:tr>
+      <w:tr>
+        <w:tc>
+          <w:tcPr>
+            <w:tcW w:type="dxa" w:w="7776"/>
+          </w:tcPr>
+          <w:p>
+            <w:pPr>
+              <w:keepNext/>
+              <w:spacing w:line="240" w:lineRule="auto" w:after="40" w:before="40"/>
+            </w:pPr>
+            <w:r>
+              <w:t>Boom arms, net skirt, floats and rope</w:t>
+            </w:r>
+          </w:p>
+        </w:tc>
+        <w:tc>
+          <w:tcPr>
+            <w:tcW w:type="dxa" w:w="1584"/>
+          </w:tcPr>
+          <w:p>
+            <w:pPr>
+              <w:keepNext/>
+              <w:spacing w:line="240" w:lineRule="auto" w:after="40" w:before="40"/>
+              <w:jc w:val="right"/>
+            </w:pPr>
+            <w:r>
+              <w:t>600</w:t>
+            </w:r>
+          </w:p>
+        </w:tc>
+      </w:tr>
+      <w:tr>
+        <w:tc>
+          <w:tcPr>
+            <w:tcW w:type="dxa" w:w="7776"/>
+          </w:tcPr>
+          <w:p>
+            <w:pPr>
+              <w:keepNext/>
+              <w:spacing w:line="240" w:lineRule="auto" w:after="40" w:before="40"/>
+            </w:pPr>
+            <w:r>
+              <w:t>Mooring: two anchors, swivels, rope, quick release, bank haul line and cleat</w:t>
+            </w:r>
+          </w:p>
+        </w:tc>
+        <w:tc>
+          <w:tcPr>
+            <w:tcW w:type="dxa" w:w="1584"/>
+          </w:tcPr>
+          <w:p>
+            <w:pPr>
+              <w:keepNext/>
+              <w:spacing w:line="240" w:lineRule="auto" w:after="40" w:before="40"/>
+              <w:jc w:val="right"/>
+            </w:pPr>
+            <w:r>
+              <w:t>900</w:t>
+            </w:r>
+          </w:p>
+        </w:tc>
+      </w:tr>
+      <w:tr>
+        <w:tc>
+          <w:tcPr>
+            <w:tcW w:type="dxa" w:w="7776"/>
+          </w:tcPr>
+          <w:p>
+            <w:pPr>
+              <w:keepNext/>
+              <w:spacing w:line="240" w:lineRule="auto" w:after="40" w:before="40"/>
+            </w:pPr>
+            <w:r>
+              <w:t>Stainless hardware, sealant and waterproofing</w:t>
             </w:r>
           </w:p>
         </w:tc>
@@ -1940,7 +2064,7 @@
               <w:rPr>
                 <w:b/>
               </w:rPr>
-              <w:t>6,450</w:t>
+              <w:t>11,500</w:t>
             </w:r>
           </w:p>
         </w:tc>
@@ -1977,7 +2101,7 @@
               <w:rPr>
                 <w:b/>
               </w:rPr>
-              <w:t>350</w:t>
+              <w:t>500</w:t>
             </w:r>
           </w:p>
         </w:tc>
@@ -2012,7 +2136,7 @@
               <w:rPr>
                 <w:b/>
               </w:rPr>
-              <w:t>6,800</w:t>
+              <w:t>12,000</w:t>
             </w:r>
           </w:p>
         </w:tc>
@@ -2031,7 +2155,7 @@
         <w:t xml:space="preserve">Tools. </w:t>
       </w:r>
       <w:r>
-        <w:t>Python, Keras, TensorFlow Lite for Microcontrollers, Arduino IDE, a borrowed soldering iron and multimeter, a kitchen scale and our phones. Prices are estimates to confirm locally, and we will ask the barangay for posts, rope and bins in kind.</w:t>
+        <w:t>Python, Keras, TensorFlow Lite for Microcontrollers, Arduino IDE, a borrowed soldering iron and multimeter, a kitchen scale and our phones. Prices are estimates to confirm locally, and we will ask the barangay for drums, rope and bins in kind.</w:t>
       </w:r>
     </w:p>
     <w:p>
@@ -2058,25 +2182,25 @@
         <w:rPr>
           <w:b/>
         </w:rPr>
-        <w:t>Stage 2, passive trap (about PHP 3,250).</w:t>
-      </w:r>
-      <w:r>
-        <w:t xml:space="preserve"> Install the boom, deflector, filter, hinged float foot with chute, bins, post, solar supply and level sensor. Gate: the boom survives at least 3 rain events and weekly counts fall within 15% of hand counts.</w:t>
-      </w:r>
-    </w:p>
-    <w:p>
-      <w:pPr>
-        <w:spacing w:line="360" w:lineRule="auto"/>
-        <w:rPr/>
-      </w:pPr>
-      <w:r>
-        <w:rPr>
-          <w:b/>
-        </w:rPr>
-        <w:t>Stage 3, arm and sorter (about PHP 1,350).</w:t>
-      </w:r>
-      <w:r>
-        <w:t xml:space="preserve"> Fit the motor, jam protection, current sensing and servo gate. Gate: a wet bench test with real hyacinth, estero silt and a little cooking oil, then solar-only lifts at the target jam rate.</w:t>
+        <w:t>Stage 2, raft and passive trap (about PHP 8,150).</w:t>
+      </w:r>
+      <w:r>
+        <w:t xml:space="preserve"> Build the drums, deck, boom, intake, mooring, solar supply, bins and level sensor. Gate: a pond test with a 60 kg dummy load shows the raft level and stable, then it survives at least 3 rain events at the site and weekly counts fall within 15% of hand counts.</w:t>
+      </w:r>
+    </w:p>
+    <w:p>
+      <w:pPr>
+        <w:spacing w:line="360" w:lineRule="auto"/>
+        <w:rPr/>
+      </w:pPr>
+      <w:r>
+        <w:rPr>
+          <w:b/>
+        </w:rPr>
+        <w:t>Stage 3, arm and sorter (about PHP 1,500).</w:t>
+      </w:r>
+      <w:r>
+        <w:t xml:space="preserve"> Fit the ramp, motor, jam protection, current sensing and servo gate. Gate: a wet bench test with real hyacinth, silt and a little cooking oil.</w:t>
       </w:r>
     </w:p>
     <w:p>
@@ -2212,6 +2336,36 @@
         <w:rPr>
           <w:b/>
         </w:rPr>
+        <w:t>Raft stability and mooring:</w:t>
+      </w:r>
+      <w:r>
+        <w:t xml:space="preserve"> a pond test with a dummy load, two mooring lines and a quick-release haul line, and the raft is hauled ashore before a typhoon.</w:t>
+      </w:r>
+    </w:p>
+    <w:p>
+      <w:pPr>
+        <w:spacing w:line="360" w:lineRule="auto"/>
+        <w:rPr/>
+      </w:pPr>
+      <w:r>
+        <w:rPr>
+          <w:b/>
+        </w:rPr>
+        <w:t>Blocking the channel and permission:</w:t>
+      </w:r>
+      <w:r>
+        <w:t xml:space="preserve"> the raft takes one side only and needs barangay and city approval.</w:t>
+      </w:r>
+    </w:p>
+    <w:p>
+      <w:pPr>
+        <w:spacing w:line="360" w:lineRule="auto"/>
+        <w:rPr/>
+      </w:pPr>
+      <w:r>
+        <w:rPr>
+          <w:b/>
+        </w:rPr>
         <w:t>Hyacinth mats:</w:t>
       </w:r>
       <w:r>
@@ -2242,21 +2396,6 @@
         <w:rPr>
           <w:b/>
         </w:rPr>
-        <w:t>Changing water level:</w:t>
-      </w:r>
-      <w:r>
-        <w:t xml:space="preserve"> a hinged ramp foot on floats with a flexible chute, and a level sensor that stops the arm above a set height.</w:t>
-      </w:r>
-    </w:p>
-    <w:p>
-      <w:pPr>
-        <w:spacing w:line="360" w:lineRule="auto"/>
-        <w:rPr/>
-      </w:pPr>
-      <w:r>
-        <w:rPr>
-          <w:b/>
-        </w:rPr>
         <w:t>Oil and silt:</w:t>
       </w:r>
       <w:r>
@@ -2287,25 +2426,10 @@
         <w:rPr>
           <w:b/>
         </w:rPr>
-        <w:t>Arm failure:</w:t>
-      </w:r>
-      <w:r>
-        <w:t xml:space="preserve"> the boom, bin and camera still work, so the data pilot survives.</w:t>
-      </w:r>
-    </w:p>
-    <w:p>
-      <w:pPr>
-        <w:spacing w:line="360" w:lineRule="auto"/>
-        <w:rPr/>
-      </w:pPr>
-      <w:r>
-        <w:rPr>
-          <w:b/>
-        </w:rPr>
-        <w:t>Safety, privacy, storms and theft:</w:t>
-      </w:r>
-      <w:r>
-        <w:t xml:space="preserve"> no student enters the water, the arm is guarded, the camera sees the water only, and electronics are retrieved before a typhoon.</w:t>
+        <w:t>Safety, privacy, theft:</w:t>
+      </w:r>
+      <w:r>
+        <w:t xml:space="preserve"> no student boards the raft or enters the water, the arm is guarded, the camera sees the water only, and electronics are retrieved before a typhoon.</w:t>
       </w:r>
     </w:p>
     <w:p>
@@ -2432,7 +2556,7 @@
         <w:t>3. Replication:</w:t>
       </w:r>
       <w:r>
-        <w:t xml:space="preserve"> at least 2 more sites by March 2027 at about PHP 6,800 each, sharing one open data format, with weekly labor hours reported so other barangays know the real workload.</w:t>
+        <w:t xml:space="preserve"> at least 2 more sites by March 2027 at about PHP 12,000 each, sharing one open data format, with weekly labor hours reported so other barangays know the real workload.</w:t>
       </w:r>
     </w:p>
     <w:p>

</xml_diff>

<commit_message>
Strengthen background research: Pasig model ranking, on-chip classifier prior art with lab-to-field gap; previous float version kept in old_versions
Co-Authored-By: Claude Sonnet 5.5 <noreply@anthropic.com>
Claude-Session: https://claude.ai/code/session_01BeuSv6ZfopDpEFLv7nhPKY
</commit_message>
<xml_diff>
--- a/sft_entry/SAGIP_SFT2026_Proposal.docx
+++ b/sft_entry/SAGIP_SFT2026_Proposal.docx
@@ -545,7 +545,7 @@
         <w:rPr/>
       </w:pPr>
       <w:r>
-        <w:t>Plastic reaches the sea through rivers, and the Philippines ranks near the top in every estimate. A global model built on measurements from more than 1,000 rivers ranked the Philippines first among countries for river plastic emissions (Meijer et al., 2021). Floating plastic transport rises sharply with river discharge, reaching up to six times its normal rate at peak flow in a year-long monitoring study (van Emmerik et al., 2022), and in the Saigon River water hyacinth mats carried most of the floating plastic that observers counted (Schreyers et al., 2021).</w:t>
+        <w:t>Plastic reaches the sea through rivers, and the Philippines ranks near the top in every estimate. A global model built on measurements from more than 1,000 rivers ranked the Philippines first among countries and the Pasig River first among rivers, as a model estimate and not a measurement (Meijer et al., 2021). Floating plastic transport rises sharply with river discharge, reaching up to six times its normal rate at peak flow in a year-long monitoring study (van Emmerik et al., 2022), and in the Saigon River water hyacinth mats carried most of the floating plastic that observers counted (Schreyers et al., 2021).</w:t>
       </w:r>
     </w:p>
     <w:p>
@@ -829,7 +829,7 @@
         <w:t>[ESTERO SITE]</w:t>
       </w:r>
       <w:r>
-        <w:t xml:space="preserve"> in Quezon City, who bear the creek's pollution and flooding, and the barangay sanitation officers, who will empty the bins weekly and use the report. Secondary beneficiaries are the city solid-waste office and the DENR, who need item-level evidence for EPR enforcement, at least 2 neighboring barangays or schools that copy the design by March 2027, and downstream fisherfolk as less plastic reaches Manila Bay. We chose a barangay estero because Quezon City already runs river programs with partners (Philstar, 2025), and citizen-science monitoring of freshwater plastic is still rare, so a barangay-run record adds new data (Cook et al., 2021). </w:t>
+        <w:t xml:space="preserve"> in Quezon City, who bear the creek's pollution and flooding, and the barangay sanitation officers, who will empty the bins weekly and use the report. Secondary beneficiaries are the city solid-waste office and the DENR, who need item-level evidence, at least 2 neighboring barangays or schools that copy the design by March 2027, and downstream fisherfolk as less plastic reaches Manila Bay. We chose a barangay estero because Quezon City already runs river programs with partners (Philstar, 2025), and citizen-science monitoring of freshwater plastic is still rare, so a barangay-run record adds new data (Cook et al., 2021). </w:t>
       </w:r>
       <w:r>
         <w:rPr>
@@ -908,7 +908,7 @@
         <w:t xml:space="preserve">Select. </w:t>
       </w:r>
       <w:r>
-        <w:t xml:space="preserve">We listed five community problems and scored each on significance, feasibility, STEM depth, replicability and originality. Creek plastic won. We can reach a creek, we can measure it weekly, and RA 11898 has just made item-level data useful. We then fitted the design to about PHP 12,000 with a floating raft, an image classifier and a sorting gate. </w:t>
+        <w:t xml:space="preserve">We listed five community problems and scored each on significance, feasibility, STEM depth, replicability and originality. Creek plastic won. We can reach a creek, we can measure it weekly, and RA 11898 has just made item-level data useful. We then fitted the design to about PHP 12,000. </w:t>
       </w:r>
       <w:r>
         <w:rPr>
@@ -929,7 +929,7 @@
         <w:t xml:space="preserve">What exists. </w:t>
       </w:r>
       <w:r>
-        <w:t>Five kinds of work address parts of the problem.</w:t>
+        <w:t>Six kinds of work address parts of the problem.</w:t>
       </w:r>
     </w:p>
     <w:tbl>
@@ -1147,6 +1147,50 @@
               <w:spacing w:line="240" w:lineRule="auto" w:after="40" w:before="40"/>
             </w:pPr>
             <w:r>
+              <w:t>Tiny on-chip classifiers (Mendez-Cruz et al., 2024)</w:t>
+            </w:r>
+          </w:p>
+        </w:tc>
+        <w:tc>
+          <w:tcPr>
+            <w:tcW w:type="dxa" w:w="3312"/>
+          </w:tcPr>
+          <w:p>
+            <w:pPr>
+              <w:keepNext/>
+              <w:spacing w:line="240" w:lineRule="auto" w:after="40" w:before="40"/>
+            </w:pPr>
+            <w:r>
+              <w:t>Classify microplastics and waste on an ESP32 camera, 91.7% accuracy on 229 images</w:t>
+            </w:r>
+          </w:p>
+        </w:tc>
+        <w:tc>
+          <w:tcPr>
+            <w:tcW w:type="dxa" w:w="3024"/>
+          </w:tcPr>
+          <w:p>
+            <w:pPr>
+              <w:keepNext/>
+              <w:spacing w:line="240" w:lineRule="auto" w:after="40" w:before="40"/>
+            </w:pPr>
+            <w:r>
+              <w:t>Controlled tests only, no collection, no field data</w:t>
+            </w:r>
+          </w:p>
+        </w:tc>
+      </w:tr>
+      <w:tr>
+        <w:tc>
+          <w:tcPr>
+            <w:tcW w:type="dxa" w:w="3024"/>
+          </w:tcPr>
+          <w:p>
+            <w:pPr>
+              <w:keepNext/>
+              <w:spacing w:line="240" w:lineRule="auto" w:after="40" w:before="40"/>
+            </w:pPr>
+            <w:r>
               <w:t>Trash traps (Philstar, 2022)</w:t>
             </w:r>
           </w:p>
@@ -1235,7 +1279,7 @@
         <w:t xml:space="preserve">Gap we test. </w:t>
       </w:r>
       <w:r>
-        <w:t>None of these lifts plastic, counts it item by item and shares open data in a unit a barangay can afford. Our search was limited and found no such system. We therefore ask one research question: can a PHP 12,000 on-chip counter match a trained hand audit within 15%, and does continuous counting reveal rain-driven pulses of plastic that weekly audits miss?</w:t>
+        <w:t>None of these lifts plastic, counts it item by item and shares open data in a unit a barangay can afford, and the tiny classifiers have not left the lab. Our search was limited and found no such system. We therefore ask one research question: can a PHP 12,000 on-chip counter match a trained hand audit within 15%, and does continuous counting reveal rain-driven pulses of plastic that weekly audits miss?</w:t>
       </w:r>
     </w:p>
     <w:p>
@@ -1301,7 +1345,7 @@
         <w:rPr/>
       </w:pPr>
       <w:r>
-        <w:t>STEM is the core of the design. Physics sets the raft's buoyancy, the boom angle, the lever and torque of the arm and the solar energy budget. Mathematics and statistics define precision, recall and count error. Computer science supplies a small 2D convolutional neural network (CNN) with INT8 quantization, which shrinks a model about fourfold with little loss of accuracy (Gholami et al., 2021), running on TensorFlow Lite for Microcontrollers (David et al., 2021). Engineering joins them in a weatherproof structure. Our key message is that proof of what plastic reaches a creek can be continuous, cheap and community-owned. Pairing a collector with a counter delivers it best.</w:t>
+        <w:t>STEM is the core of the design. Physics sets the raft's buoyancy, the boom angle, the lever and torque of the arm and the solar energy budget. Mathematics and statistics define precision, recall and count error. Computer science supplies a small 2D convolutional neural network (CNN) with INT8 quantization, which shrinks a model about fourfold with little loss of accuracy (Gholami et al., 2021), running on TensorFlow Lite for Microcontrollers (David et al., 2021). Engineering joins them in a weatherproof structure. Our key message is that proof of what plastic reaches a creek can be continuous, cheap and community-owned.</w:t>
       </w:r>
     </w:p>
     <w:p>
@@ -1426,7 +1470,7 @@
         <w:t xml:space="preserve">Count and sort. </w:t>
       </w:r>
       <w:r>
-        <w:t>An ESP32-S3 camera looks down at a fixed landing plate under a hood with LED lighting, so every item appears in the same light. The CNN classifies it as PET bottle, sachet or film, bag, foam, cup, plant or other. A servo gate then drops plastic into Bin A and plants or low-confidence items into Bin B for a person to check. If the servo fails, items still land in one bin and are still counted. Training photographs come from our own collection along the creek bank, labelled by students and checked by the adviser. Items that land together may count as one, so each week students hand-count both bins as the accuracy test.</w:t>
+        <w:t>An ESP32-S3 camera looks down at a fixed landing plate under a hood with LED lighting, so every item appears in the same light. The CNN classifies it as PET bottle, sachet or film, bag, foam, cup, plant or other. A servo gate then drops plastic into Bin A and plants or low-confidence items into Bin B for a person to check. If the servo fails, items still land in one bin and are still counted. Training photographs come from our own collection along the creek bank, labelled by students and checked by the adviser. Items landing together may count as one, so weekly hand counts of both bins test accuracy.</w:t>
       </w:r>
     </w:p>
     <w:p>
@@ -1536,7 +1580,7 @@
         <w:t xml:space="preserve">Power. </w:t>
       </w:r>
       <w:r>
-        <w:t>Planning figures until bench measurements replace them. The camera runs only when an item is present. Electronics draw about 6 Wh per day and the arm about 0.3 Wh. A 10 W panel yields about 18 Wh per day at 3 effective sun-hours and 60% efficiency, and two 18650 cells store about 18 Wh. When the battery is low the chip lengthens its capture interval.</w:t>
+        <w:t>Planning figures until measured. The camera runs only when an item is present. Electronics draw about 6 Wh per day and the arm about 0.3 Wh. A 10 W panel yields about 18 Wh per day at 3 effective sun-hours and 60% efficiency, and two 18650 cells store about 18 Wh. When the battery is low the chip lengthens its capture interval.</w:t>
       </w:r>
     </w:p>
     <w:p>
@@ -2155,7 +2199,7 @@
         <w:t xml:space="preserve">Tools. </w:t>
       </w:r>
       <w:r>
-        <w:t>Python, Keras, TensorFlow Lite for Microcontrollers, Arduino IDE, a borrowed soldering iron and multimeter, a kitchen scale and our phones. Prices are estimates to confirm locally, and we will ask the barangay for drums, rope and bins in kind.</w:t>
+        <w:t>Python, Keras, TensorFlow Lite for Microcontrollers, Arduino IDE, a borrowed multimeter, a kitchen scale and our phones. Prices are estimates, and we will ask the barangay for drums, rope and bins in kind.</w:t>
       </w:r>
     </w:p>
     <w:p>
@@ -2688,6 +2732,15 @@
       </w:pPr>
       <w:r>
         <w:t>Manila Bulletin (October 12, 2025). AI-powered robot waterway cleaning vehicle launched in Pasig.</w:t>
+      </w:r>
+    </w:p>
+    <w:p>
+      <w:pPr>
+        <w:spacing w:line="276" w:lineRule="auto" w:after="60"/>
+        <w:rPr/>
+      </w:pPr>
+      <w:r>
+        <w:t>Mendez-Cruz, Silva-Cuzqui, et al. (2024). Proof of concept: A TinyML-based image classifier for detecting microplastics and waste in simulated marine environments. IEEE.</w:t>
       </w:r>
     </w:p>
     <w:p>

</xml_diff>

<commit_message>
DRAFT v7: autonomous solar skimmer boat with plastic accounting and flood node; judging-aware timeline; previous raft versions moved to old_versions
Co-Authored-By: Claude Sonnet 5.5 <noreply@anthropic.com>
Claude-Session: https://claude.ai/code/session_01BeuSv6ZfopDpEFLv7nhPKY
</commit_message>
<xml_diff>
--- a/sft_entry/SAGIP_SFT2026_Proposal.docx
+++ b/sft_entry/SAGIP_SFT2026_Proposal.docx
@@ -415,7 +415,7 @@
               <w:rPr>
                 <w:b w:val="0"/>
               </w:rPr>
-              <w:t xml:space="preserve"> SAGIP: Floating Solar-Powered Estero Guardian with On-Chip AI</w:t>
+              <w:t xml:space="preserve"> SAGIP: Autonomous Solar Skimmer Boat with On-Chip AI</w:t>
             </w:r>
           </w:p>
         </w:tc>
@@ -479,7 +479,7 @@
           </w:p>
           <w:p>
             <w:r>
-              <w:t>SAGIP is a low-cost, floating, solar-powered raft that filters plastic out of a creek, lifts it into a sorted bin and names each item with a small on-chip image model. Barangay officials get a weekly offline report of what the creek carried, plus a secondary water-level alert for blockages. Built for about PHP 12,000 from local parts, it adds anonymized records to an open dataset that other barangays can copy.</w:t>
+              <w:t>SAGIP is a low-cost, solar-powered robot boat that patrols a creek, goes to floating debris, lifts it onto a conveyor and names each item with a small on-chip image model. Barangay officials get a weekly offline report of the plastic collected by type and weight, plus a float-switch flood alarm at the bank. Built for about PHP 16,000 from local parts, it adds anonymized records to an open dataset that other barangays can copy.</w:t>
             </w:r>
           </w:p>
         </w:tc>
@@ -563,7 +563,7 @@
         <w:rPr/>
       </w:pPr>
       <w:r>
-        <w:t>What is missing is a continuous, inexpensive record taken at the creek itself that one barangay can run. Large systems are arriving, such as solar-powered Interceptor barriers planned for the Pasig and Meycauayan rivers (Manila Bulletin, June 2026), but a narrow estero needs a unit a barangay can afford. A secondary hazard shares the channel. Clogged waterways worsen flooding in low-lying neighborhoods, and residents learn of a blockage only after the water rises.</w:t>
+        <w:t>What is missing is a continuous, inexpensive record taken at the creek itself that one barangay can run. Large systems are arriving, such as solar-powered Interceptor barriers planned for the Pasig and Meycauayan rivers (Manila Bulletin, June 2026) and an AI boat piloted on the Pasig (Manila Bulletin, October 2025), but a narrow estero needs a unit a barangay can afford. Clogged waterways also worsen flooding, and residents learn of a blockage only after the water rises.</w:t>
       </w:r>
     </w:p>
     <w:p>
@@ -645,7 +645,7 @@
         <w:t>Goal</w:t>
       </w:r>
       <w:r>
-        <w:t>: We want barangays to treat the plastic in their creeks as measurable evidence instead of invisible waste. In the long run, this means cleaner waterways and community-owned data that shifts the burden of proof toward the companies that produce the packaging.</w:t>
+        <w:t>: We want barangays to treat the plastic in their creeks as measurable evidence instead of invisible waste. In the long run, this means cleaner waterways and community-owned data that shifts the burden of proof toward packaging producers.</w:t>
       </w:r>
     </w:p>
     <w:p>
@@ -687,7 +687,7 @@
         <w:t>1. Remove and measure plastic.</w:t>
       </w:r>
       <w:r>
-        <w:t xml:space="preserve"> In an 8-week pilot at </w:t>
+        <w:t xml:space="preserve"> In an 8-week creek pilot at </w:t>
       </w:r>
       <w:r>
         <w:rPr>
@@ -696,7 +696,7 @@
         <w:t>[ESTERO SITE]</w:t>
       </w:r>
       <w:r>
-        <w:t xml:space="preserve"> starting in December 2026, capture at least 50% of the floating debris that reaches the boom, measured against a baseline week recorded before installation, lift at least 20 kg of plastic and log at least 1,000 classified items.</w:t>
+        <w:t xml:space="preserve"> starting in January 2027, remove at least 50% of the floating debris that enters a patrol stretch of about 30 m, measured by hand-net sampling below the downstream barrier against a baseline week, lift at least 20 kg of plastic and log at least 1,000 classified items.</w:t>
       </w:r>
     </w:p>
     <w:p>
@@ -716,7 +716,7 @@
         <w:t>2. Prove what the plastic is.</w:t>
       </w:r>
       <w:r>
-        <w:t xml:space="preserve"> By November 20, 2026, train an on-device 2D convolutional neural network that reaches at least 85% precision and recall on photographs from places it has not seen. Across the pilot, weekly device counts should stay within 15% of a trained hand audit.</w:t>
+        <w:t xml:space="preserve"> By December 5, 2026, train an on-device 2D convolutional neural network that reaches at least 85% precision and recall on photographs from places it has not seen. Across the pilot, weekly device counts should stay within 15% of a trained hand audit.</w:t>
       </w:r>
     </w:p>
     <w:p>
@@ -736,7 +736,7 @@
         <w:t>3. Make it copyable.</w:t>
       </w:r>
       <w:r>
-        <w:t xml:space="preserve"> By March 2027, publish a free English and Filipino build guide and an open dataset, and help at least 2 other barangays or schools build a unit for about PHP 12,000 each.</w:t>
+        <w:t xml:space="preserve"> By March 2027, publish a free English and Filipino build guide and an open dataset, and help at least 2 other barangays or schools build a unit for about PHP 16,000 each.</w:t>
       </w:r>
     </w:p>
     <w:p>
@@ -829,7 +829,7 @@
         <w:t>[ESTERO SITE]</w:t>
       </w:r>
       <w:r>
-        <w:t xml:space="preserve"> in Quezon City, who bear the creek's pollution and flooding, and the barangay sanitation officers, who will empty the bins weekly and use the report. Secondary beneficiaries are the city solid-waste office and the DENR, who need item-level evidence, at least 2 neighboring barangays or schools that copy the design by March 2027, and downstream fisherfolk as less plastic reaches Manila Bay. We chose a barangay estero because Quezon City already runs river programs with partners (Philstar, 2025), and citizen-science monitoring of freshwater plastic is still rare, so a barangay-run record adds new data (Cook et al., 2021). </w:t>
+        <w:t xml:space="preserve"> in Quezon City, who bear the creek's pollution and flooding and gain a flood alarm, and the barangay sanitation officers, who will empty the bins and use the report. Secondary beneficiaries are the city solid-waste office and the DENR, who need item-level evidence, at least 2 neighboring barangays or schools that copy the design by March 2027, and downstream fisherfolk as less plastic reaches Manila Bay. We chose a barangay estero because Quezon City already runs river programs with partners (Philstar, 2025), and citizen-science monitoring of freshwater plastic is still rare, so a barangay-run record adds new data (Cook et al., 2021). </w:t>
       </w:r>
       <w:r>
         <w:rPr>
@@ -908,7 +908,7 @@
         <w:t xml:space="preserve">Select. </w:t>
       </w:r>
       <w:r>
-        <w:t xml:space="preserve">We listed five community problems and scored each on significance, feasibility, STEM depth, replicability and originality. Creek plastic won. We can reach a creek, we can measure it weekly, and RA 11898 has just made item-level data useful. We then fitted the design to about PHP 12,000. </w:t>
+        <w:t xml:space="preserve">We listed five community problems and scored each on significance, feasibility, STEM depth, replicability and originality. Creek plastic won. We can reach a creek, we can measure it weekly, and RA 11898 has just made item-level data useful. </w:t>
       </w:r>
       <w:r>
         <w:rPr>
@@ -1131,7 +1131,7 @@
               <w:spacing w:line="240" w:lineRule="auto" w:after="40" w:before="40"/>
             </w:pPr>
             <w:r>
-              <w:t>Mobile boats on a large river, not fixed estero units</w:t>
+              <w:t>Built for a large river, not for a barangay-run estero</w:t>
             </w:r>
           </w:p>
         </w:tc>
@@ -1279,7 +1279,7 @@
         <w:t xml:space="preserve">Gap we test. </w:t>
       </w:r>
       <w:r>
-        <w:t>None of these lifts plastic, counts it item by item and shares open data in a unit a barangay can afford, and the tiny classifiers have not left the lab. Our search was limited and found no such system. We therefore ask one research question: can a PHP 12,000 on-chip counter match a trained hand audit within 15%, and does continuous counting reveal rain-driven pulses of plastic that weekly audits miss?</w:t>
+        <w:t>None of these patrols a creek, collects plastic, counts it item by item and shares open data in a unit a barangay can afford, and the tiny classifiers have not left the lab. Our search found no such system. We therefore ask one research question: can a PHP 16,000 robot boat match a trained hand audit within 15%, and does continuous counting reveal rain-driven pulses of plastic that weekly audits miss?</w:t>
       </w:r>
     </w:p>
     <w:p>
@@ -1345,7 +1345,7 @@
         <w:rPr/>
       </w:pPr>
       <w:r>
-        <w:t>STEM is the core of the design. Physics sets the raft's buoyancy, the boom angle, the lever and torque of the arm and the solar energy budget. Mathematics and statistics define precision, recall and count error. Computer science supplies a small 2D convolutional neural network (CNN) with INT8 quantization, which shrinks a model about fourfold with little loss of accuracy (Gholami et al., 2021), running on TensorFlow Lite for Microcontrollers (David et al., 2021). Engineering joins them in a weatherproof structure. Our key message is that proof of what plastic reaches a creek can be continuous, cheap and community-owned.</w:t>
+        <w:t>STEM is the core of the design. Physics sets the hull's buoyancy and stability, the thrust, the belt torque and the solar energy budget. Mathematics and statistics define precision, recall and count error. Computer science supplies a small 2D convolutional neural network (CNN) with INT8 quantization, which shrinks a model about fourfold with little loss of accuracy (Gholami et al., 2021), running on TensorFlow Lite for Microcontrollers (David et al., 2021). Engineering joins them in a weatherproof boat. Our key message is that proof of what plastic reaches a creek can be continuous, cheap and community-owned.</w:t>
       </w:r>
     </w:p>
     <w:p>
@@ -1355,7 +1355,7 @@
       <w:r>
         <w:drawing>
           <wp:inline>
-            <wp:extent cx="5486400" cy="1777042"/>
+            <wp:extent cx="5486400" cy="1814587"/>
             <wp:docPr id="1" name="Picture 1"/>
             <wp:cNvGraphicFramePr>
               <a:graphicFrameLocks noChangeAspect="1"/>
@@ -1364,7 +1364,7 @@
               <a:graphicData uri="http://schemas.openxmlformats.org/drawingml/2006/picture">
                 <pic:pic>
                   <pic:nvPicPr>
-                    <pic:cNvPr id="0" name="fig_flow.png"/>
+                    <pic:cNvPr id="0" name="fig_patrol.png"/>
                     <pic:cNvPicPr/>
                   </pic:nvPicPr>
                   <pic:blipFill>
@@ -1376,7 +1376,7 @@
                   <pic:spPr>
                     <a:xfrm>
                       <a:off x="0" y="0"/>
-                      <a:ext cx="5486400" cy="1777042"/>
+                      <a:ext cx="5486400" cy="1814587"/>
                     </a:xfrm>
                     <a:prstGeom prst="rect"/>
                   </pic:spPr>
@@ -1395,7 +1395,7 @@
         <w:rPr>
           <w:i/>
         </w:rPr>
-        <w:t>Figure 1. How plastic and signals move through the unit.</w:t>
+        <w:t>Figure 1. Patrol, detect, scoop and dock (top view, schematic).</w:t>
       </w:r>
     </w:p>
     <w:p>
@@ -1410,37 +1410,52 @@
         <w:t xml:space="preserve">Float. </w:t>
       </w:r>
       <w:r>
-        <w:t>Four sealed 200 L plastic drums carry a deck frame. For a planning load of about 60 kg the raft rides high. Two mooring lines hold the bow upstream, and a haul line lets adults pull the raft to the bank to empty the bins or to shelter from a typhoon. It sits along one side of the channel and leaves a clear flow path.</w:t>
-      </w:r>
-    </w:p>
-    <w:p>
-      <w:pPr>
-        <w:spacing w:line="360" w:lineRule="auto"/>
-        <w:rPr/>
-      </w:pPr>
-      <w:r>
-        <w:rPr>
-          <w:b/>
-        </w:rPr>
-        <w:t xml:space="preserve">Catch and filter. </w:t>
-      </w:r>
-      <w:r>
-        <w:t>A boom of reused PET bottles with a net skirt guides surface debris to the raft's bow, and a wide-gapped deflector upstream turns water hyacinth mats aside. Coarse bars stop large debris and a fine mesh basket catches small plastic. Both slope so leaves and mud shed.</w:t>
-      </w:r>
-    </w:p>
-    <w:p>
-      <w:pPr>
-        <w:spacing w:line="360" w:lineRule="auto"/>
-        <w:rPr/>
-      </w:pPr>
-      <w:r>
-        <w:rPr>
-          <w:b/>
-        </w:rPr>
-        <w:t xml:space="preserve">Lift. </w:t>
-      </w:r>
-      <w:r>
-        <w:t>A worm-gear DC motor on the deck turns a short rake arm that sweeps debris up the ramp in bursts. A sacrificial shear pin protects the gearbox. A guard, stop switch and lockout protect people.</w:t>
+        <w:t>Two sealed 6-inch PVC floats filled with foam carry a deck. For a planning load of about 25 kg the boat rides high. A wide beam and a low battery keep it stable, and a tilt sensor stops the motors if it leans past 20 degrees.</w:t>
+      </w:r>
+    </w:p>
+    <w:p>
+      <w:pPr>
+        <w:spacing w:line="360" w:lineRule="auto"/>
+        <w:rPr/>
+      </w:pPr>
+      <w:r>
+        <w:rPr>
+          <w:b/>
+        </w:rPr>
+        <w:t xml:space="preserve">Patrol. </w:t>
+      </w:r>
+      <w:r>
+        <w:t>Two thrusters steer by differential thrust. The boat follows the bank with side ultrasonic sensors and a compass, turns at two floating barriers about 30 m apart, and returns to a bank dock when its bins are full or its battery is low. Staff can take over with a phone remote.</w:t>
+      </w:r>
+    </w:p>
+    <w:p>
+      <w:pPr>
+        <w:spacing w:line="360" w:lineRule="auto"/>
+        <w:rPr/>
+      </w:pPr>
+      <w:r>
+        <w:rPr>
+          <w:b/>
+        </w:rPr>
+        <w:t xml:space="preserve">Detect and scoop. </w:t>
+      </w:r>
+      <w:r>
+        <w:t>A bow camera on an ESP32-CAM runs a tiny detector that boxes floating debris ahead and separates plastic from plants. The boat steers toward it, and a scoop lifts it onto a cleated conveyor belt.</w:t>
+      </w:r>
+    </w:p>
+    <w:p>
+      <w:pPr>
+        <w:spacing w:line="360" w:lineRule="auto"/>
+        <w:rPr/>
+      </w:pPr>
+      <w:r>
+        <w:rPr>
+          <w:b/>
+        </w:rPr>
+        <w:t xml:space="preserve">Count and sort. </w:t>
+      </w:r>
+      <w:r>
+        <w:t>The belt spreads items into one layer under an ESP32-S3 camera with a lit hood. The CNN classifies each item as PET bottle, sachet or film, bag, foam, cup, plant or other. A servo gate drops plastic into Bin A and plants or low-confidence items into Bin B, so a person can check them. Training photographs come from our own collection along the creek bank, labelled by students and checked by the adviser. Weekly hand counts of both bins test accuracy.</w:t>
       </w:r>
     </w:p>
     <w:p>
@@ -1455,22 +1470,7 @@
         <w:t xml:space="preserve">Protect. </w:t>
       </w:r>
       <w:r>
-        <w:t>The chip reads motor current and adjusts speed. Under heavy load it slows and keeps torque, and under light load it speeds up, within a limit set by the solar budget. A Hall sensor confirms the arm is moving. If current rises sharply, the arm reverses briefly, retries at most three times, then locks out and alerts the barangay. The driver defaults to off, so a crashed chip cannot leave the motor running.</w:t>
-      </w:r>
-    </w:p>
-    <w:p>
-      <w:pPr>
-        <w:spacing w:line="360" w:lineRule="auto"/>
-        <w:rPr/>
-      </w:pPr>
-      <w:r>
-        <w:rPr>
-          <w:b/>
-        </w:rPr>
-        <w:t xml:space="preserve">Count and sort. </w:t>
-      </w:r>
-      <w:r>
-        <w:t>An ESP32-S3 camera looks down at a fixed landing plate under a hood with LED lighting, so every item appears in the same light. The CNN classifies it as PET bottle, sachet or film, bag, foam, cup, plant or other. A servo gate then drops plastic into Bin A and plants or low-confidence items into Bin B for a person to check. If the servo fails, items still land in one bin and are still counted. Training photographs come from our own collection along the creek bank, labelled by students and checked by the adviser. Items landing together may count as one, so weekly hand counts of both bins test accuracy.</w:t>
+        <w:t>The chip reads belt and thruster current. After a jam it reverses briefly, retries at most three times, then stops and returns to the dock. Motor drivers default to off, so a crashed chip cannot leave a motor running.</w:t>
       </w:r>
     </w:p>
     <w:p>
@@ -1485,7 +1485,7 @@
         <w:t xml:space="preserve">Software. </w:t>
       </w:r>
       <w:r>
-        <w:t>We train in Keras on a laptop, start from a small pretrained MobileNet-style network at 96 by 96 pixels, quantize to INT8 and deploy with TensorFlow Lite for Microcontrollers on the ESP32-S3.</w:t>
+        <w:t>We train in Keras on a laptop, start from small pretrained MobileNet-style networks, quantize to INT8 and deploy on the ESP32 boards.</w:t>
       </w:r>
     </w:p>
     <w:p>
@@ -1500,7 +1500,7 @@
         <w:t xml:space="preserve">Report. </w:t>
       </w:r>
       <w:r>
-        <w:t>A phone reads an offline Wi-Fi page hosted by the chip. Each record stores class, time, water level and an image hash in an append-only log on a microSD card, with time from a clock module. A script builds the weekly report and an anonymized open dataset, and counts are plotted against rainfall.</w:t>
+        <w:t>Each record stores class, time and an image hash in an append-only log on a microSD card, with time from a clock module. When the boat is docked, a phone reads an offline Wi-Fi page with the weekly report and an anonymized open dataset, and counts are plotted against rainfall and water level.</w:t>
       </w:r>
     </w:p>
     <w:p>
@@ -1510,7 +1510,7 @@
       <w:r>
         <w:drawing>
           <wp:inline>
-            <wp:extent cx="5852160" cy="2223619"/>
+            <wp:extent cx="5852160" cy="2344907"/>
             <wp:docPr id="2" name="Picture 2"/>
             <wp:cNvGraphicFramePr>
               <a:graphicFrameLocks noChangeAspect="1"/>
@@ -1519,7 +1519,7 @@
               <a:graphicData uri="http://schemas.openxmlformats.org/drawingml/2006/picture">
                 <pic:pic>
                   <pic:nvPicPr>
-                    <pic:cNvPr id="0" name="fig_cut.png"/>
+                    <pic:cNvPr id="0" name="fig_boat_side.png"/>
                     <pic:cNvPicPr/>
                   </pic:nvPicPr>
                   <pic:blipFill>
@@ -1531,7 +1531,7 @@
                   <pic:spPr>
                     <a:xfrm>
                       <a:off x="0" y="0"/>
-                      <a:ext cx="5852160" cy="2223619"/>
+                      <a:ext cx="5852160" cy="2344907"/>
                     </a:xfrm>
                     <a:prstGeom prst="rect"/>
                   </pic:spPr>
@@ -1550,22 +1550,37 @@
         <w:rPr>
           <w:i/>
         </w:rPr>
-        <w:t>Figure 2. Cutaway of the floating SAGIP unit (schematic).</w:t>
-      </w:r>
-    </w:p>
-    <w:p>
-      <w:pPr>
-        <w:spacing w:line="360" w:lineRule="auto"/>
-        <w:rPr/>
-      </w:pPr>
-      <w:r>
-        <w:rPr>
-          <w:b/>
-        </w:rPr>
-        <w:t xml:space="preserve">Warn (secondary). </w:t>
-      </w:r>
-      <w:r>
-        <w:t>A waterproof ultrasonic sensor measures the distance to the water against a painted staff gauge. It raises an alert when the level rises quickly or a bin nears capacity, and the arm stops above a set level.</w:t>
+        <w:t>Figure 2. Side view of the SAGIP boat (schematic).</w:t>
+      </w:r>
+    </w:p>
+    <w:p>
+      <w:pPr>
+        <w:spacing w:line="360" w:lineRule="auto"/>
+        <w:rPr/>
+      </w:pPr>
+      <w:r>
+        <w:rPr>
+          <w:b/>
+        </w:rPr>
+        <w:t xml:space="preserve">Plastic accounting. </w:t>
+      </w:r>
+      <w:r>
+        <w:t>Counts are converted to estimated kilograms using typical weights per item class, and each weekly weigh-in corrects them. A weekly sheet lists items by type and their estimated recovery value at local junk-shop rates, giving the barangay and the DENR item-level evidence for RA 11898 and a reason to keep the unit running.</w:t>
+      </w:r>
+    </w:p>
+    <w:p>
+      <w:pPr>
+        <w:spacing w:line="360" w:lineRule="auto"/>
+        <w:rPr/>
+      </w:pPr>
+      <w:r>
+        <w:rPr>
+          <w:b/>
+        </w:rPr>
+        <w:t xml:space="preserve">Flood warning. </w:t>
+      </w:r>
+      <w:r>
+        <w:t>A separate solar node on the bank carries three float switches set at watch, alert and danger levels on a painted staff gauge. A buzzer and beacon sound locally, the level is logged with the time, and the boat stays docked from the alert level.</w:t>
       </w:r>
     </w:p>
     <w:p>
@@ -1580,7 +1595,7 @@
         <w:t xml:space="preserve">Power. </w:t>
       </w:r>
       <w:r>
-        <w:t>Planning figures until measured. The camera runs only when an item is present. Electronics draw about 6 Wh per day and the arm about 0.3 Wh. A 10 W panel yields about 18 Wh per day at 3 effective sun-hours and 60% efficiency, and two 18650 cells store about 18 Wh. When the battery is low the chip lengthens its capture interval.</w:t>
+        <w:t>Planning figures until measured. A 30 W panel flat on the deck yields about 54 Wh per day at 3 effective sun-hours and 60% efficiency and charges a 12 V 12 Ah battery of about 144 Wh. Two buck converters give the boards and the servo separate 5 V rails, and the motors run from the 12 V rail through their own fuses and drivers. A 20-minute patrol uses about 25 Wh, and a low battery skips the patrol.</w:t>
       </w:r>
     </w:p>
     <w:p>
@@ -1595,7 +1610,7 @@
         <w:t xml:space="preserve">Scope. </w:t>
       </w:r>
       <w:r>
-        <w:t>SAGIP lifts light floating debris such as bottles, sachets, bags, foam and cups. Heavy or tangled items, hyacinth mats, sunken waste and dissolved pollutants fall outside its reach, so we report a measured capture rate.</w:t>
+        <w:t>SAGIP lifts light floating debris such as bottles, sachets, bags, foam and cups. It cannot lift heavy or tangled items, hyacinth mats or sunken waste, and it covers one stretch of creek, so we report a measured capture rate.</w:t>
       </w:r>
     </w:p>
     <w:p>
@@ -1610,7 +1625,7 @@
         <w:t xml:space="preserve">In plain words. </w:t>
       </w:r>
       <w:r>
-        <w:t>The model is the skill of a sanitation worker who can tell a PET bottle from a sachet at a glance, saved as a file of numbers. Quantization rounds them like a gradebook recording 87, not 87.3416, so the file fits the chip. No internet is needed.</w:t>
+        <w:t>The model is the skill of a sanitation worker who can tell a bottle from a sachet at a glance, saved as a file of numbers. No internet is needed.</w:t>
       </w:r>
     </w:p>
     <w:p>
@@ -1660,7 +1675,7 @@
         <w:rPr/>
       </w:pPr>
       <w:r>
-        <w:t>The pilot unit costs about PHP 12,000 and is built in three stages, each bought only after the previous test passes.</w:t>
+        <w:t>The pilot unit costs about PHP 13,000 and is built in three stages, each bought only after the previous test passes.</w:t>
       </w:r>
     </w:p>
     <w:p>
@@ -1746,7 +1761,7 @@
               <w:spacing w:line="240" w:lineRule="auto" w:after="40" w:before="40"/>
             </w:pPr>
             <w:r>
-              <w:t>ESP32-S3 camera board with PSRAM, microSD card, clock module, sealed enclosure with light hood</w:t>
+              <w:t>Two 6-inch PVC floats with foam fill, frame and deck</w:t>
             </w:r>
           </w:p>
         </w:tc>
@@ -1761,7 +1776,7 @@
               <w:jc w:val="right"/>
             </w:pPr>
             <w:r>
-              <w:t>1,850</w:t>
+              <w:t>2,300</w:t>
             </w:r>
           </w:p>
         </w:tc>
@@ -1777,7 +1792,7 @@
               <w:spacing w:line="240" w:lineRule="auto" w:after="40" w:before="40"/>
             </w:pPr>
             <w:r>
-              <w:t>10 W solar panel, charge controller, two 18650 cells, converter</w:t>
+              <w:t>Two 12 V thrusters and dual driver</w:t>
             </w:r>
           </w:p>
         </w:tc>
@@ -1792,7 +1807,7 @@
               <w:jc w:val="right"/>
             </w:pPr>
             <w:r>
-              <w:t>1,400</w:t>
+              <w:t>1,800</w:t>
             </w:r>
           </w:p>
         </w:tc>
@@ -1808,7 +1823,7 @@
               <w:spacing w:line="240" w:lineRule="auto" w:after="40" w:before="40"/>
             </w:pPr>
             <w:r>
-              <w:t>Wiring, fuse, switch, two bins, staff gauge</w:t>
+              <w:t>Short cleated conveyor, gear motor and driver</w:t>
             </w:r>
           </w:p>
         </w:tc>
@@ -1823,7 +1838,7 @@
               <w:jc w:val="right"/>
             </w:pPr>
             <w:r>
-              <w:t>400</w:t>
+              <w:t>2,000</w:t>
             </w:r>
           </w:p>
         </w:tc>
@@ -1839,7 +1854,7 @@
               <w:spacing w:line="240" w:lineRule="auto" w:after="40" w:before="40"/>
             </w:pPr>
             <w:r>
-              <w:t>Waterproof ultrasonic level sensor</w:t>
+              <w:t>ESP32-S3 camera board, hood, LED, enclosure (belt camera and brain)</w:t>
             </w:r>
           </w:p>
         </w:tc>
@@ -1854,7 +1869,7 @@
               <w:jc w:val="right"/>
             </w:pPr>
             <w:r>
-              <w:t>350</w:t>
+              <w:t>1,850</w:t>
             </w:r>
           </w:p>
         </w:tc>
@@ -1870,7 +1885,7 @@
               <w:spacing w:line="240" w:lineRule="auto" w:after="40" w:before="40"/>
             </w:pPr>
             <w:r>
-              <w:t>Worm-gear motor, driver, current and motion sensing, servo gate</w:t>
+              <w:t>ESP32-CAM bow detector</w:t>
             </w:r>
           </w:p>
         </w:tc>
@@ -1885,7 +1900,7 @@
               <w:jc w:val="right"/>
             </w:pPr>
             <w:r>
-              <w:t>1,000</w:t>
+              <w:t>600</w:t>
             </w:r>
           </w:p>
         </w:tc>
@@ -1901,7 +1916,7 @@
               <w:spacing w:line="240" w:lineRule="auto" w:after="40" w:before="40"/>
             </w:pPr>
             <w:r>
-              <w:t>Ramp, rake arm, coarse bars, fine mesh, spare shear pins</w:t>
+              <w:t>Compass with tilt sensor, three waterproof ultrasonic sensors, bump switches</w:t>
             </w:r>
           </w:p>
         </w:tc>
@@ -1916,7 +1931,7 @@
               <w:jc w:val="right"/>
             </w:pPr>
             <w:r>
-              <w:t>500</w:t>
+              <w:t>900</w:t>
             </w:r>
           </w:p>
         </w:tc>
@@ -1932,7 +1947,7 @@
               <w:spacing w:line="240" w:lineRule="auto" w:after="40" w:before="40"/>
             </w:pPr>
             <w:r>
-              <w:t>Pontoons: four reused 200 L drums with sealed caps</w:t>
+              <w:t>Gate servo and reused bins</w:t>
             </w:r>
           </w:p>
         </w:tc>
@@ -1947,7 +1962,7 @@
               <w:jc w:val="right"/>
             </w:pPr>
             <w:r>
-              <w:t>2,000</w:t>
+              <w:t>300</w:t>
             </w:r>
           </w:p>
         </w:tc>
@@ -1963,7 +1978,7 @@
               <w:spacing w:line="240" w:lineRule="auto" w:after="40" w:before="40"/>
             </w:pPr>
             <w:r>
-              <w:t>Deck frame and guard rails</w:t>
+              <w:t>12 V 12 Ah battery, converters, fuses, wiring</w:t>
             </w:r>
           </w:p>
         </w:tc>
@@ -1978,7 +1993,7 @@
               <w:jc w:val="right"/>
             </w:pPr>
             <w:r>
-              <w:t>1,900</w:t>
+              <w:t>2,400</w:t>
             </w:r>
           </w:p>
         </w:tc>
@@ -1994,7 +2009,7 @@
               <w:spacing w:line="240" w:lineRule="auto" w:after="40" w:before="40"/>
             </w:pPr>
             <w:r>
-              <w:t>Boom arms, net skirt, floats and rope</w:t>
+              <w:t>30 W solar panel and 20 A charge controller</w:t>
             </w:r>
           </w:p>
         </w:tc>
@@ -2009,7 +2024,7 @@
               <w:jc w:val="right"/>
             </w:pPr>
             <w:r>
-              <w:t>600</w:t>
+              <w:t>1,100</w:t>
             </w:r>
           </w:p>
         </w:tc>
@@ -2025,7 +2040,7 @@
               <w:spacing w:line="240" w:lineRule="auto" w:after="40" w:before="40"/>
             </w:pPr>
             <w:r>
-              <w:t>Mooring: two anchors, swivels, rope, quick release, bank haul line and cleat</w:t>
+              <w:t>Waterproofing and hardware</w:t>
             </w:r>
           </w:p>
         </w:tc>
@@ -2040,7 +2055,7 @@
               <w:jc w:val="right"/>
             </w:pPr>
             <w:r>
-              <w:t>900</w:t>
+              <w:t>500</w:t>
             </w:r>
           </w:p>
         </w:tc>
@@ -2056,7 +2071,38 @@
               <w:spacing w:line="240" w:lineRule="auto" w:after="40" w:before="40"/>
             </w:pPr>
             <w:r>
-              <w:t>Stainless hardware, sealant and waterproofing</w:t>
+              <w:t>Flood node: ESP32, three float switches, buzzer and beacon, mini panel, cell, staff gauge</w:t>
+            </w:r>
+          </w:p>
+        </w:tc>
+        <w:tc>
+          <w:tcPr>
+            <w:tcW w:type="dxa" w:w="1584"/>
+          </w:tcPr>
+          <w:p>
+            <w:pPr>
+              <w:keepNext/>
+              <w:spacing w:line="240" w:lineRule="auto" w:after="40" w:before="40"/>
+              <w:jc w:val="right"/>
+            </w:pPr>
+            <w:r>
+              <w:t>1,000</w:t>
+            </w:r>
+          </w:p>
+        </w:tc>
+      </w:tr>
+      <w:tr>
+        <w:tc>
+          <w:tcPr>
+            <w:tcW w:type="dxa" w:w="7776"/>
+          </w:tcPr>
+          <w:p>
+            <w:pPr>
+              <w:keepNext/>
+              <w:spacing w:line="240" w:lineRule="auto" w:after="40" w:before="40"/>
+            </w:pPr>
+            <w:r>
+              <w:t>Bank dock and two barriers, with rope, floats and post from the barangay</w:t>
             </w:r>
           </w:p>
         </w:tc>
@@ -2108,7 +2154,7 @@
               <w:rPr>
                 <w:b/>
               </w:rPr>
-              <w:t>11,500</w:t>
+              <w:t>15,350</w:t>
             </w:r>
           </w:p>
         </w:tc>
@@ -2145,7 +2191,7 @@
               <w:rPr>
                 <w:b/>
               </w:rPr>
-              <w:t>500</w:t>
+              <w:t>650</w:t>
             </w:r>
           </w:p>
         </w:tc>
@@ -2180,7 +2226,7 @@
               <w:rPr>
                 <w:b/>
               </w:rPr>
-              <w:t>12,000</w:t>
+              <w:t>16,000</w:t>
             </w:r>
           </w:p>
         </w:tc>
@@ -2199,52 +2245,52 @@
         <w:t xml:space="preserve">Tools. </w:t>
       </w:r>
       <w:r>
-        <w:t>Python, Keras, TensorFlow Lite for Microcontrollers, Arduino IDE, a borrowed multimeter, a kitchen scale and our phones. Prices are estimates, and we will ask the barangay for drums, rope and bins in kind.</w:t>
-      </w:r>
-    </w:p>
-    <w:p>
-      <w:pPr>
-        <w:spacing w:line="360" w:lineRule="auto"/>
-        <w:rPr/>
-      </w:pPr>
-      <w:r>
-        <w:rPr>
-          <w:b/>
-        </w:rPr>
-        <w:t>Stage 1, bench (about PHP 1,850).</w:t>
-      </w:r>
-      <w:r>
-        <w:t xml:space="preserve"> Train and test the model and measure power draw. Gate: precision and recall on held-out photographs reach 85%.</w:t>
-      </w:r>
-    </w:p>
-    <w:p>
-      <w:pPr>
-        <w:spacing w:line="360" w:lineRule="auto"/>
-        <w:rPr/>
-      </w:pPr>
-      <w:r>
-        <w:rPr>
-          <w:b/>
-        </w:rPr>
-        <w:t>Stage 2, raft and passive trap (about PHP 8,150).</w:t>
-      </w:r>
-      <w:r>
-        <w:t xml:space="preserve"> Build the drums, deck, boom, intake, mooring, solar supply, bins and level sensor. Gate: a pond test with a 60 kg dummy load shows the raft level and stable, then it survives at least 3 rain events at the site and weekly counts fall within 15% of hand counts.</w:t>
-      </w:r>
-    </w:p>
-    <w:p>
-      <w:pPr>
-        <w:spacing w:line="360" w:lineRule="auto"/>
-        <w:rPr/>
-      </w:pPr>
-      <w:r>
-        <w:rPr>
-          <w:b/>
-        </w:rPr>
-        <w:t>Stage 3, arm and sorter (about PHP 1,500).</w:t>
-      </w:r>
-      <w:r>
-        <w:t xml:space="preserve"> Fit the ramp, motor, jam protection, current sensing and servo gate. Gate: a wet bench test with real hyacinth, silt and a little cooking oil.</w:t>
+        <w:t>Python, Keras, TensorFlow Lite for Microcontrollers, Arduino IDE, a borrowed multimeter, a kitchen scale and our phones. Prices are estimates from online shops, and we will ask the barangay for rope, floats, a post and bins in kind.</w:t>
+      </w:r>
+    </w:p>
+    <w:p>
+      <w:pPr>
+        <w:spacing w:line="360" w:lineRule="auto"/>
+        <w:rPr/>
+      </w:pPr>
+      <w:r>
+        <w:rPr>
+          <w:b/>
+        </w:rPr>
+        <w:t>Stage 1, bench (about PHP 7,650).</w:t>
+      </w:r>
+      <w:r>
+        <w:t xml:space="preserve"> Build the conveyor, camera, CNN, gate, battery and panel on a bench. Gate: precision and recall on held-out photographs reach 85%, the belt passes a wet-debris run and the battery carries a simulated patrol.</w:t>
+      </w:r>
+    </w:p>
+    <w:p>
+      <w:pPr>
+        <w:spacing w:line="360" w:lineRule="auto"/>
+        <w:rPr/>
+      </w:pPr>
+      <w:r>
+        <w:rPr>
+          <w:b/>
+        </w:rPr>
+        <w:t>Stage 2, boat (about PHP 6,100).</w:t>
+      </w:r>
+      <w:r>
+        <w:t xml:space="preserve"> Build the floats, deck, thrusters, bow detector, sensors and waterproofing. Gate: float and tilt tests, then remote driving, then a pond test where the boat reaches and scoops at least 70% of 20 floating items placed 2 to 5 m ahead.</w:t>
+      </w:r>
+    </w:p>
+    <w:p>
+      <w:pPr>
+        <w:spacing w:line="360" w:lineRule="auto"/>
+        <w:rPr/>
+      </w:pPr>
+      <w:r>
+        <w:rPr>
+          <w:b/>
+        </w:rPr>
+        <w:t>Stage 3, dock, barriers and flood node (about PHP 1,600).</w:t>
+      </w:r>
+      <w:r>
+        <w:t xml:space="preserve"> Gate: the boat patrols between barriers in a pond or canal without help, and the flood alarm sounds at all three marks in a bucket test.</w:t>
       </w:r>
     </w:p>
     <w:p>
@@ -2259,7 +2305,7 @@
         <w:t xml:space="preserve">Timeline. </w:t>
       </w:r>
       <w:r>
-        <w:t>Site visit, barangay letter and starter dataset by November 2. Model and a baseline week by November 20. Early results on December 7 if shortlisted. Pilot from December to February. Build guide and further sites by March 2027.</w:t>
+        <w:t>Site visit, barangay letter and starter dataset by November 2. If shortlisted after the November 9 to 13 screening, the mentorship from November 16 to December 5 finishes Stage 1 on a bench and builds a scaled boat mock-up and the flood node for the December 7 pitch. The creek pilot runs January to February 2027 if supported. Guide and further sites by March 2027.</w:t>
       </w:r>
     </w:p>
     <w:p>
@@ -2291,7 +2337,7 @@
         <w:t>Barangay captain and sanitation officers:</w:t>
       </w:r>
       <w:r>
-        <w:t xml:space="preserve"> site approval, weekly emptying, and use of the reports under a one-page maintenance agreement.</w:t>
+        <w:t xml:space="preserve"> site approval, bin emptying, the flood alarm and use of the reports under a one-page maintenance agreement.</w:t>
       </w:r>
     </w:p>
     <w:p>
@@ -2336,7 +2382,7 @@
         <w:t>Students and residents:</w:t>
       </w:r>
       <w:r>
-        <w:t xml:space="preserve"> students build, label, count and report. Residents give consent.</w:t>
+        <w:t xml:space="preserve"> students build, label and count. Residents give consent.</w:t>
       </w:r>
     </w:p>
     <w:p>
@@ -2368,94 +2414,79 @@
         <w:t>Manual labor:</w:t>
       </w:r>
       <w:r>
-        <w:t xml:space="preserve"> people must still empty both bins weekly, clear the screen after storms, wipe the lens and check the battery. We will log those hours.</w:t>
-      </w:r>
-    </w:p>
-    <w:p>
-      <w:pPr>
-        <w:spacing w:line="360" w:lineRule="auto"/>
-        <w:rPr/>
-      </w:pPr>
-      <w:r>
-        <w:rPr>
-          <w:b/>
-        </w:rPr>
-        <w:t>Raft stability and mooring:</w:t>
-      </w:r>
-      <w:r>
-        <w:t xml:space="preserve"> a pond test with a dummy load, two mooring lines and a quick-release haul line, and the raft is hauled ashore before a typhoon.</w:t>
-      </w:r>
-    </w:p>
-    <w:p>
-      <w:pPr>
-        <w:spacing w:line="360" w:lineRule="auto"/>
-        <w:rPr/>
-      </w:pPr>
-      <w:r>
-        <w:rPr>
-          <w:b/>
-        </w:rPr>
-        <w:t>Blocking the channel and permission:</w:t>
-      </w:r>
-      <w:r>
-        <w:t xml:space="preserve"> the raft takes one side only and needs barangay and city approval.</w:t>
-      </w:r>
-    </w:p>
-    <w:p>
-      <w:pPr>
-        <w:spacing w:line="360" w:lineRule="auto"/>
-        <w:rPr/>
-      </w:pPr>
-      <w:r>
-        <w:rPr>
-          <w:b/>
-        </w:rPr>
-        <w:t>Hyacinth mats:</w:t>
-      </w:r>
-      <w:r>
-        <w:t xml:space="preserve"> a deflector, sloped filters and a plant class that sends mats to Bin B.</w:t>
-      </w:r>
-    </w:p>
-    <w:p>
-      <w:pPr>
-        <w:spacing w:line="360" w:lineRule="auto"/>
-        <w:rPr/>
-      </w:pPr>
-      <w:r>
-        <w:rPr>
-          <w:b/>
-        </w:rPr>
-        <w:t>Jams and burnout:</w:t>
-      </w:r>
-      <w:r>
-        <w:t xml:space="preserve"> shear pin, current and Hall sensing, three retries, driver off by default.</w:t>
-      </w:r>
-    </w:p>
-    <w:p>
-      <w:pPr>
-        <w:spacing w:line="360" w:lineRule="auto"/>
-        <w:rPr/>
-      </w:pPr>
-      <w:r>
-        <w:rPr>
-          <w:b/>
-        </w:rPr>
-        <w:t>Oil and silt:</w:t>
-      </w:r>
-      <w:r>
-        <w:t xml:space="preserve"> motor mounted high, sealed bearings with marine grease, hooded lens.</w:t>
-      </w:r>
-    </w:p>
-    <w:p>
-      <w:pPr>
-        <w:spacing w:line="360" w:lineRule="auto"/>
-        <w:rPr/>
-      </w:pPr>
-      <w:r>
-        <w:rPr>
-          <w:b/>
-        </w:rPr>
-        <w:t>Model errors in new light or water:</w:t>
+        <w:t xml:space="preserve"> people must still empty the bins, clear snags and wipe the lenses. We will log those hours.</w:t>
+      </w:r>
+    </w:p>
+    <w:p>
+      <w:pPr>
+        <w:spacing w:line="360" w:lineRule="auto"/>
+        <w:rPr/>
+      </w:pPr>
+      <w:r>
+        <w:rPr>
+          <w:b/>
+        </w:rPr>
+        <w:t>Stability and sinking:</w:t>
+      </w:r>
+      <w:r>
+        <w:t xml:space="preserve"> foam-filled floats, a tilt cut-off and pond tests before launch.</w:t>
+      </w:r>
+    </w:p>
+    <w:p>
+      <w:pPr>
+        <w:spacing w:line="360" w:lineRule="auto"/>
+        <w:rPr/>
+      </w:pPr>
+      <w:r>
+        <w:rPr>
+          <w:b/>
+        </w:rPr>
+        <w:t>Navigation in the creek:</w:t>
+      </w:r>
+      <w:r>
+        <w:t xml:space="preserve"> barriers set the stretch, side sensors and a compass follow the bank, and the phone remote takes over.</w:t>
+      </w:r>
+    </w:p>
+    <w:p>
+      <w:pPr>
+        <w:spacing w:line="360" w:lineRule="auto"/>
+        <w:rPr/>
+      </w:pPr>
+      <w:r>
+        <w:rPr>
+          <w:b/>
+        </w:rPr>
+        <w:t>Hyacinth and snags:</w:t>
+      </w:r>
+      <w:r>
+        <w:t xml:space="preserve"> the detector sends plants to Bin B, propellers are shrouded, and current sensing reverses a jam.</w:t>
+      </w:r>
+    </w:p>
+    <w:p>
+      <w:pPr>
+        <w:spacing w:line="360" w:lineRule="auto"/>
+        <w:rPr/>
+      </w:pPr>
+      <w:r>
+        <w:rPr>
+          <w:b/>
+        </w:rPr>
+        <w:t>Fast water:</w:t>
+      </w:r>
+      <w:r>
+        <w:t xml:space="preserve"> the boat stays docked from the alert level.</w:t>
+      </w:r>
+    </w:p>
+    <w:p>
+      <w:pPr>
+        <w:spacing w:line="360" w:lineRule="auto"/>
+        <w:rPr/>
+      </w:pPr>
+      <w:r>
+        <w:rPr>
+          <w:b/>
+        </w:rPr>
+        <w:t>Model and detector errors:</w:t>
       </w:r>
       <w:r>
         <w:t xml:space="preserve"> test on unseen places, send unsure items to Bin B and keep the weekly hand count.</w:t>
@@ -2473,7 +2504,22 @@
         <w:t>Safety, privacy, theft:</w:t>
       </w:r>
       <w:r>
-        <w:t xml:space="preserve"> no student boards the raft or enters the water, the arm is guarded, the camera sees the water only, and electronics are retrieved before a typhoon.</w:t>
+        <w:t xml:space="preserve"> no student rides the boat or enters the water, the cameras see the water only, and the boat is docked when unattended.</w:t>
+      </w:r>
+    </w:p>
+    <w:p>
+      <w:pPr>
+        <w:spacing w:line="360" w:lineRule="auto"/>
+        <w:rPr/>
+      </w:pPr>
+      <w:r>
+        <w:rPr>
+          <w:b/>
+        </w:rPr>
+        <w:t>Permission:</w:t>
+      </w:r>
+      <w:r>
+        <w:t xml:space="preserve"> the stretch needs barangay and city approval, and the DENR where required.</w:t>
       </w:r>
     </w:p>
     <w:p>
@@ -2524,7 +2570,7 @@
         <w:rPr/>
       </w:pPr>
       <w:r>
-        <w:t>Success means floating plastic lifted from a real creek and a trustworthy weekly record of what it was. One unit lifts little mass, so its value lies in a design cheap to copy and data open to combine.</w:t>
+        <w:t>Success means floating plastic lifted from a real creek, a trustworthy weekly record of what it was and a flood alarm that works. One unit lifts little mass, so its value lies in cheap copies and open data.</w:t>
       </w:r>
     </w:p>
     <w:p>
@@ -2570,22 +2616,22 @@
         <w:t>1. Less plastic in the creek:</w:t>
       </w:r>
       <w:r>
-        <w:t xml:space="preserve"> a capture rate of at least 50% against the baseline week and at least 20 kg lifted in 8 weeks.</w:t>
-      </w:r>
-    </w:p>
-    <w:p>
-      <w:pPr>
-        <w:spacing w:line="360" w:lineRule="auto"/>
-        <w:rPr/>
-      </w:pPr>
-      <w:r>
-        <w:rPr>
-          <w:b/>
-        </w:rPr>
-        <w:t>2. Trustworthy counts:</w:t>
-      </w:r>
-      <w:r>
-        <w:t xml:space="preserve"> at least 1,000 classified items, weekly device error of 15% or less against the hand audit, and at least 85% precision and recall on unseen places.</w:t>
+        <w:t xml:space="preserve"> at least 50% of floating debris removed in the patrol stretch against the baseline week and at least 20 kg lifted in 8 weeks.</w:t>
+      </w:r>
+    </w:p>
+    <w:p>
+      <w:pPr>
+        <w:spacing w:line="360" w:lineRule="auto"/>
+        <w:rPr/>
+      </w:pPr>
+      <w:r>
+        <w:rPr>
+          <w:b/>
+        </w:rPr>
+        <w:t>2. Trustworthy counts and warnings:</w:t>
+      </w:r>
+      <w:r>
+        <w:t xml:space="preserve"> at least 1,000 classified items, weekly device error of 15% or less against the hand audit, at least 85% precision and recall on unseen places, and a flood alarm that sounds at all three marks.</w:t>
       </w:r>
     </w:p>
     <w:p>
@@ -2600,7 +2646,7 @@
         <w:t>3. Replication:</w:t>
       </w:r>
       <w:r>
-        <w:t xml:space="preserve"> at least 2 more sites by March 2027 at about PHP 12,000 each, sharing one open data format, with weekly labor hours reported so other barangays know the real workload.</w:t>
+        <w:t xml:space="preserve"> at least 2 more sites by March 2027 at about PHP 16,000 each, sharing one open data format, with weekly labor hours reported.</w:t>
       </w:r>
     </w:p>
     <w:p>
@@ -2622,7 +2668,7 @@
         <w:t xml:space="preserve">Long-Term Vision: </w:t>
       </w:r>
       <w:r>
-        <w:t>We see a student-built, barangay-owned network of units along connected creeks that feeds one open dataset showing where plastic enters, which products dominate, and whether EPR commitments change what the water carries. Planned upgrades are a belt conveyor for higher volumes and a second camera angle.</w:t>
+        <w:t>We see a student-built, barangay-owned network of units along connected creeks that feeds one open dataset showing where plastic enters, which products dominate, and whether EPR commitments change what the water carries. Planned upgrades are a longer patrol stretch and a second boat.</w:t>
       </w:r>
     </w:p>
     <w:p>

</xml_diff>

<commit_message>
Address adviser comments: say what the model runs on and how reports are read, add Meijer figures, sustainable record, define the build guide and dataset, flag the site-choice criterion
Co-Authored-By: Claude Sonnet 5.5 <noreply@anthropic.com>
Claude-Session: https://claude.ai/code/session_01BeuSv9ktphNSqgYLtwXpw3
</commit_message>
<xml_diff>
--- a/sft_entry/SAGIP_SFT2026_Proposal.docx
+++ b/sft_entry/SAGIP_SFT2026_Proposal.docx
@@ -479,7 +479,7 @@
           </w:p>
           <w:p>
             <w:r>
-              <w:t>SAGIP is a low-cost, solar-powered robot boat that patrols a creek, goes to floating debris, lifts it onto a conveyor and names each item with a small on-chip image model. Barangay officials get a weekly offline report of the plastic collected by type and weight, plus a float-switch flood alarm at the bank. Built for about PHP 16,000 from local parts, it adds anonymized records to an open dataset that other barangays can copy.</w:t>
+              <w:t>SAGIP is a low-cost, solar-powered robot boat that patrols a creek, goes to floating debris, lifts it onto a conveyor and names each item using a small neural network on an ESP32 chip. Barangay officials get a weekly report of the plastic collected by type and weight through an offline phone page, plus a float-switch flood alarm at the bank. Built for about PHP 16,000 from local parts, it adds anonymized records to an open dataset that other barangays can copy.</w:t>
             </w:r>
           </w:p>
         </w:tc>
@@ -545,7 +545,7 @@
         <w:rPr/>
       </w:pPr>
       <w:r>
-        <w:t>Plastic reaches the sea through rivers, and the Philippines ranks near the top in every estimate. A global model of more than 1,000 rivers ranked the Philippines first among countries and the Pasig River first among rivers, as a model estimate (Meijer et al., 2021). Floating plastic transport rises with river discharge, reaching up to six times its normal rate at peak flow (van Emmerik et al., 2022), and in the Saigon River water hyacinth mats carried most of the floating plastic that observers counted (Schreyers et al., 2021).</w:t>
+        <w:t>Plastic reaches the sea through rivers, and the Philippines is the largest source. A global model of more than 1,000 rivers estimated that Philippine rivers carry about 356,000 tonnes of plastic to the sea each year, the most of any country, and ranked the Pasig River first (Meijer et al., 2021). These are model estimates and not measurements. Floating plastic transport rises with river discharge, reaching up to six times its normal rate at peak flow (van Emmerik et al., 2022), and in the Saigon River water hyacinth mats carried most of the floating plastic that observers counted (Schreyers et al., 2021).</w:t>
       </w:r>
     </w:p>
     <w:p>
@@ -563,7 +563,7 @@
         <w:rPr/>
       </w:pPr>
       <w:r>
-        <w:t>What is missing is a continuous, inexpensive record taken at the creek itself that one barangay can run. Large systems are arriving, such as solar Interceptor barriers planned for the Pasig and Meycauayan rivers (Manila Bulletin, June 2026), but a narrow estero needs a unit a barangay can afford. Clogged waterways also worsen flooding, and residents learn of a blockage only after the water rises.</w:t>
+        <w:t>What is missing is a sustainable, inexpensive record taken at the creek itself that one barangay can run. Large systems are arriving, such as solar Interceptor barriers planned for the Pasig and Meycauayan rivers (Manila Bulletin, June 2026), but a narrow estero needs a unit a barangay can afford. Clogged waterways also worsen flooding, and residents learn of a blockage only after the water rises.</w:t>
       </w:r>
     </w:p>
     <w:p>
@@ -727,7 +727,7 @@
         <w:t>3. Make it copyable.</w:t>
       </w:r>
       <w:r>
-        <w:t xml:space="preserve"> By March 2027, publish a free English and Filipino build guide and an open dataset, and help at least 2 other barangays or schools build a unit for about PHP 16,000 each.</w:t>
+        <w:t xml:space="preserve"> By March 2027, publish a free English and Filipino build guide (parts list, wiring, code) and an open dataset of anonymized counts and photographs, and help at least 2 other barangays or schools build a unit for about PHP 16,000 each.</w:t>
       </w:r>
     </w:p>
     <w:p>
@@ -817,7 +817,7 @@
         <w:rPr>
           <w:highlight w:val="yellow"/>
         </w:rPr>
-        <w:t>[Add the barangay's household count and its current cleanup program.]</w:t>
+        <w:t>[Confirm Dario River is the estero nearest to our school and most in need, and add the household count and cleanup program.]</w:t>
       </w:r>
     </w:p>
     <w:p>
@@ -1422,7 +1422,7 @@
         <w:t xml:space="preserve">Barriers. </w:t>
       </w:r>
       <w:r>
-        <w:t>The upstream barrier is a rope of floats strung at about 30 degrees to the flow between bank posts, so hyacinth mats and large debris slide to the bank for staff to lift out. The downstream barrier is a straight line of floats that stops drifting debris.</w:t>
+        <w:t>The upstream barrier is a rope of floats strung at about 30 degrees to the flow between bank posts, so hyacinth mats and large debris slide to the bank. The downstream barrier is a straight line of floats that stops drifting debris.</w:t>
       </w:r>
     </w:p>
     <w:p>
@@ -1577,7 +1577,7 @@
         <w:t xml:space="preserve">Flood warning. </w:t>
       </w:r>
       <w:r>
-        <w:t>A separate solar node on the bank carries three float switches at watch, alert and danger levels on a painted staff gauge. A buzzer and beacon sound, the level is logged, and the boat stays docked from the alert level.</w:t>
+        <w:t>A separate solar node on the bank carries three float switches at watch, alert and danger levels on a painted staff gauge. A buzzer and a small LED alert nearby residents, the level is logged, and the boat stays docked from the alert level.</w:t>
       </w:r>
     </w:p>
     <w:p>
@@ -1592,7 +1592,7 @@
         <w:t xml:space="preserve">Power. </w:t>
       </w:r>
       <w:r>
-        <w:t>Planning figures: a 30 W panel on the deck yields about 54 Wh per day at 3 effective sun-hours and 60% efficiency and charges a sealed 12 V 12 Ah lead-acid battery of about 144 Wh. Two buck converters give the boards and servo separate 5 V rails, and each motor has its own fuse. A 20-minute patrol uses about 25 Wh, and a low battery skips it.</w:t>
+        <w:t>Planning figures: a 30 W panel on the deck yields about 54 Wh per day at 3 effective sun-hours and 60% efficiency and charges a sealed 12 V 12 Ah lead-acid battery of about 144 Wh. Separate 5 V converters feed the boards and servo, and each motor has its own fuse. A 20-minute patrol uses about 25 Wh, and a low battery skips it.</w:t>
       </w:r>
     </w:p>
     <w:p>
@@ -2272,7 +2272,7 @@
         <w:t xml:space="preserve">Tools. </w:t>
       </w:r>
       <w:r>
-        <w:t>Python, Keras, TensorFlow Lite for Microcontrollers, Arduino IDE, a borrowed multimeter, a kitchen scale and our phones. Prices are online-shop estimates, and the barangay may give rope, floats, a post and bins in kind.</w:t>
+        <w:t>Python, Keras, TensorFlow Lite for Microcontrollers, a borrowed multimeter, a kitchen scale and our phones. Prices are online-shop estimates, and the barangay may give rope, floats, a post and bins in kind.</w:t>
       </w:r>
     </w:p>
     <w:p>
@@ -2567,7 +2567,7 @@
         <w:rPr/>
       </w:pPr>
       <w:r>
-        <w:t>Success means plastic lifted from a real creek, a trustworthy weekly record of what it was and a flood alarm that works. One unit lifts little mass, so its value lies in cheap copies and open data.</w:t>
+        <w:t>Success means plastic lifted from a real creek, a trustworthy weekly record of what it was and a flood alarm that works.</w:t>
       </w:r>
     </w:p>
     <w:p>
@@ -2640,10 +2640,10 @@
         <w:rPr>
           <w:b/>
         </w:rPr>
-        <w:t>3. Replication and community use:</w:t>
-      </w:r>
-      <w:r>
-        <w:t xml:space="preserve"> at least 2 more sites by March 2027 at about PHP 16,000 each, one open data format, weekly labor hours reported and a monthly Plastic Trend Scoreboard.</w:t>
+        <w:t>3. Replication:</w:t>
+      </w:r>
+      <w:r>
+        <w:t xml:space="preserve"> at least 2 more sites by March 2027 at about PHP 16,000 each, one open data format and weekly labor hours reported.</w:t>
       </w:r>
     </w:p>
     <w:p>
@@ -2687,7 +2687,7 @@
         <w:t xml:space="preserve">Key Takeaway: </w:t>
       </w:r>
       <w:r>
-        <w:t>The Philippines already knows who makes much of its plastic. SAGIP makes the proof continuous, cheap and community-owned, and lifts some plastic out along the way.</w:t>
+        <w:t>The Philippines already knows who makes much of its plastic. SAGIP makes the proof continuous, cheap and community-owned.</w:t>
       </w:r>
     </w:p>
     <w:p>

</xml_diff>

<commit_message>
Strengthen barrier mechanics and deep-sleep protocol across proposal, PPT and prototype doc
Co-Authored-By: Claude Sonnet 5.5 <noreply@anthropic.com>
Claude-Session: https://claude.ai/code/session_01BeuSv9ktphNSqgYLtwXpw3
</commit_message>
<xml_diff>
--- a/sft_entry/SAGIP_SFT2026_Proposal.docx
+++ b/sft_entry/SAGIP_SFT2026_Proposal.docx
@@ -1422,7 +1422,7 @@
         <w:t xml:space="preserve">Barriers. </w:t>
       </w:r>
       <w:r>
-        <w:t>The upstream barrier is a rope of floats strung at about 30 degrees to the flow between bank posts, so hyacinth mats and large debris slide to the bank. The downstream barrier is a straight line of floats that stops drifting debris.</w:t>
+        <w:t>The upstream barrier is a 10 mm rope with a plastic float every 30 cm, strung at about 30 degrees to the flow between bank posts, so hyacinth mats and large debris slide to the bank. The downstream barrier is the same rope strung straight across. A pond test checks sag and hold.</w:t>
       </w:r>
     </w:p>
     <w:p>
@@ -1467,7 +1467,7 @@
         <w:t xml:space="preserve">Software. </w:t>
       </w:r>
       <w:r>
-        <w:t>We train in Keras, start from small pretrained MobileNet-style networks, quantize to INT8 and deploy on the ESP32 boards. Student-labelled creek-bank photographs, checked by the adviser, are augmented with brightness, contrast and color shifts, blur, rotation, crops, random erasing and synthetic mud and droplet overlays to hold accuracy in muddy water.</w:t>
+        <w:t>We train in Keras, start from small pretrained MobileNet-style networks, quantize to INT8 and deploy on the ESP32 boards. Creek-bank photographs are augmented with brightness, contrast and color shifts, blur, rotation, crops, random erasing and synthetic mud and droplet overlays to hold accuracy in muddy water.</w:t>
       </w:r>
     </w:p>
     <w:p>
@@ -1562,7 +1562,7 @@
         <w:t xml:space="preserve">Plastic accounting. </w:t>
       </w:r>
       <w:r>
-        <w:t>Counts become estimated kilograms from typical item weights, corrected by a weekly weigh-in. A weekly sheet lists items by type with their estimated value at junk-shop rates, giving the barangay and the DENR item-level evidence for RA 11898.</w:t>
+        <w:t>Counts become estimated kilograms from typical item weights, corrected by a weekly weigh-in. A weekly sheet lists items by type with estimated junk-shop value as item-level evidence for RA 11898.</w:t>
       </w:r>
     </w:p>
     <w:p>
@@ -1577,7 +1577,7 @@
         <w:t xml:space="preserve">Flood warning. </w:t>
       </w:r>
       <w:r>
-        <w:t>A separate solar node on the bank carries three float switches at watch, alert and danger levels on a painted staff gauge. A buzzer and a small LED alert nearby residents, the level is logged, and the boat stays docked from the alert level.</w:t>
+        <w:t>A separate solar node on the bank carries three float switches at watch, alert and danger levels on a painted staff gauge. A buzzer and a small LED alert residents, and the boat stays docked from the alert level.</w:t>
       </w:r>
     </w:p>
     <w:p>
@@ -1592,7 +1592,7 @@
         <w:t xml:space="preserve">Power. </w:t>
       </w:r>
       <w:r>
-        <w:t>Planning figures: a 30 W panel on the deck yields about 54 Wh per day at 3 effective sun-hours and 60% efficiency and charges a sealed 12 V 12 Ah lead-acid battery of about 144 Wh. Separate 5 V converters feed the boards and servo, and each motor has its own fuse. A 20-minute patrol uses about 25 Wh, and a low battery skips it.</w:t>
+        <w:t>Planning figures: a 30 W panel on the deck yields about 54 Wh per day at 3 effective sun-hours and 60% efficiency and charges a sealed 12 V 12 Ah lead-acid battery of about 144 Wh. A 20-minute patrol uses about 25 Wh, and a low battery skips it.</w:t>
       </w:r>
     </w:p>
     <w:p>
@@ -1607,7 +1607,7 @@
         <w:t xml:space="preserve">Deep sleep. </w:t>
       </w:r>
       <w:r>
-        <w:t>Docked boards sleep and wake on a timer for each patrol, then check the flood node's last status. On patrol the bow camera idles at a low frame rate until it sees plastic, and the belt camera and LED power up only when an item arrives. The flood node sleeps until a float switch trips and wakes every ten minutes to report.</w:t>
+        <w:t>At 5 V a camera board draws about 180 mA awake and 6 mA asleep (datasheet values), about 22 Wh a day against 0.7 Wh, so sleep protects the 54 Wh solar budget. Docked boards sleep and wake on a timer for each patrol, then check the flood node's last status. On patrol the bow camera idles at a low frame rate until it sees plastic, and the belt camera and LED power up only when an item arrives. The flood node sleeps until a float switch trips and wakes every ten minutes to report.</w:t>
       </w:r>
     </w:p>
     <w:p>
@@ -1622,7 +1622,7 @@
         <w:t xml:space="preserve">End of life and safety. </w:t>
       </w:r>
       <w:r>
-        <w:t>The floats are PVC pipe, the bins are plastic and the hardware is stainless steel, all materials that local junk shops take. Foam is the one hard-to-recycle part, so we use only enough to keep a holed float afloat. The lead-acid battery returns to a dealer for recycling. The flood node's protected 18650 cell sits in an IP67 box with overcharge and over-discharge protection, so a tipped node cannot leak into the creek.</w:t>
+        <w:t>The floats are PVC pipe, the bins are plastic and the hardware is stainless steel, all materials that local junk shops take. Foam, the one hard-to-recycle part, is used only to keep a holed float afloat. The lead-acid battery returns to a dealer for recycling. The flood node's protected 18650 cell sits in an IP67 box with overcharge and over-discharge protection, so a tipped node cannot leak into the creek.</w:t>
       </w:r>
     </w:p>
     <w:p>
@@ -2471,7 +2471,7 @@
         <w:t>Fast water and permission:</w:t>
       </w:r>
       <w:r>
-        <w:t xml:space="preserve"> the boat stays docked from the alert level, and the stretch needs barangay and city approval, and the DENR where required.</w:t>
+        <w:t xml:space="preserve"> the boat stays docked from the alert level, and the stretch needs barangay, city and DENR approval.</w:t>
       </w:r>
     </w:p>
     <w:p>
@@ -2628,7 +2628,7 @@
         <w:t>2. Trustworthy counts and warnings:</w:t>
       </w:r>
       <w:r>
-        <w:t xml:space="preserve"> at least 1,000 classified items, weekly error of 15% or less, 85% precision and recall on unseen places and a flood alarm that sounds at all three marks.</w:t>
+        <w:t xml:space="preserve"> at least 1,000 classified items, weekly error of 15% or less, 85% precision and recall on unseen places and a flood alarm at all three marks.</w:t>
       </w:r>
     </w:p>
     <w:p>

</xml_diff>

<commit_message>
Fill provisional household figure and drop purok; trim to stay under the word cap
Co-Authored-By: Claude Sonnet 5.5 <noreply@anthropic.com>
Claude-Session: https://claude.ai/code/session_01BeuSv9ktphNSqgYLtwXpw3
</commit_message>
<xml_diff>
--- a/sft_entry/SAGIP_SFT2026_Proposal.docx
+++ b/sft_entry/SAGIP_SFT2026_Proposal.docx
@@ -793,25 +793,25 @@
         <w:rPr/>
       </w:pPr>
       <w:r>
-        <w:t xml:space="preserve">Primary beneficiaries are the </w:t>
+        <w:t xml:space="preserve">Primary beneficiaries are the households of </w:t>
       </w:r>
       <w:r>
         <w:rPr>
           <w:highlight w:val="yellow"/>
         </w:rPr>
-        <w:t>[N]</w:t>
-      </w:r>
-      <w:r>
-        <w:t xml:space="preserve"> households of </w:t>
+        <w:t>[Barangay Santo Cristo, Bago Bantay]</w:t>
+      </w:r>
+      <w:r>
+        <w:t xml:space="preserve"> (</w:t>
       </w:r>
       <w:r>
         <w:rPr>
           <w:highlight w:val="yellow"/>
         </w:rPr>
-        <w:t>[Barangay Santo Cristo, Bago Bantay]</w:t>
-      </w:r>
-      <w:r>
-        <w:t xml:space="preserve"> along Dario River in Quezon City, who bear the creek's pollution and flooding, gain a flood alarm and see monthly results on a Plastic Trend Scoreboard at the Barangay Hall, and the sanitation officers, who empty the bins and use the report. Secondary beneficiaries are the city solid-waste office and the DENR, who need item-level evidence, and the barangays or schools that copy the design. We chose a barangay estero because Quezon City already runs river programs with partners (Philstar, 2025) and a barangay-run record adds new data where citizen science is rare (Cook et al., 2021). </w:t>
+        <w:t>[6,531 on record, confirm creek-side count]</w:t>
+      </w:r>
+      <w:r>
+        <w:t xml:space="preserve">) along Dario River in Quezon City, who bear the creek's pollution and flooding, gain a flood alarm and see monthly results on a Plastic Trend Scoreboard at the Barangay Hall, and the sanitation officers, who empty the bins and use the report. Secondary beneficiaries are the city solid-waste office and the DENR, who need item-level evidence, and the barangays or schools that copy the design. We chose a barangay estero because Quezon City already runs river programs with partners (Philstar, 2025) and a barangay-run record adds new data where citizen science is rare (Cook et al., 2021). </w:t>
       </w:r>
       <w:r>
         <w:rPr>
@@ -909,9 +909,6 @@
           <w:b/>
         </w:rPr>
         <w:t xml:space="preserve">What exists. </w:t>
-      </w:r>
-      <w:r>
-        <w:t>Six kinds of work address parts of the problem.</w:t>
       </w:r>
     </w:p>
     <w:tbl>

</xml_diff>

<commit_message>
Rewrite SAGIP entry text as narrative paragraphs, update budget and navigation, new title, rebuild Word, PPT and prototype doc
Co-Authored-By: Claude Sonnet 5.5 <noreply@anthropic.com>
Claude-Session: https://claude.ai/code/session_01BeuSv8gNSQPUFpVS1TZhEc
</commit_message>
<xml_diff>
--- a/sft_entry/SAGIP_SFT2026_Proposal.docx
+++ b/sft_entry/SAGIP_SFT2026_Proposal.docx
@@ -415,7 +415,7 @@
               <w:rPr>
                 <w:b w:val="0"/>
               </w:rPr>
-              <w:t xml:space="preserve"> SAGIP: Autonomous Solar Skimmer Boat with On-Chip AI</w:t>
+              <w:t xml:space="preserve"> SAGIP: A Self-Navigating Boat That Collects and Counts Creek Plastic</w:t>
             </w:r>
           </w:p>
         </w:tc>
@@ -479,7 +479,7 @@
           </w:p>
           <w:p>
             <w:r>
-              <w:t>SAGIP is a low-cost, solar-powered robot boat that patrols a creek, goes to floating debris, lifts it onto a conveyor and names each item using a small on-chip neural network running on an ESP32 chip. Barangay officials get a weekly report of the plastic collected by type and weight through an offline phone page, plus a float-switch flood alarm at the bank. Built for about PHP 16,000 from local parts, it adds anonymized records to an open dataset that other barangays can copy.</w:t>
+              <w:t>SAGIP is a low-cost, solar-powered robot boat that patrols a creek, goes to floating debris, lifts it onto a conveyor and names each item using a small on-chip neural network running on an ESP32 chip. Barangay officials get a weekly report of the plastic collected by type and weight through an offline phone page, plus a float-switch flood alarm at the bank. Built for about PHP 15,800 from local parts, it adds anonymized records to an open dataset that other barangays can copy.</w:t>
             </w:r>
           </w:p>
         </w:tc>
@@ -727,7 +727,7 @@
         <w:t>3. Make it copyable.</w:t>
       </w:r>
       <w:r>
-        <w:t xml:space="preserve"> By March 2027, publish a free English and Filipino build guide (parts list, wiring, code) and an open dataset of anonymized counts and photographs, and help at least 2 other barangays or schools build a unit for about PHP 16,000 each.</w:t>
+        <w:t xml:space="preserve"> By March 2027, publish a free English and Filipino build guide (parts list, wiring, code) and an open dataset of anonymized counts and photographs, and help at least 2 other barangays or schools build a unit for about PHP 15,800 each.</w:t>
       </w:r>
     </w:p>
     <w:p>
@@ -1258,7 +1258,7 @@
         <w:t xml:space="preserve">Gap we test. </w:t>
       </w:r>
       <w:r>
-        <w:t>None of these patrols a creek, collects plastic, counts it item by item and shares open data at a price a barangay can pay. Our search found no system that does all four. We therefore ask one question: can a PHP 16,000 robot boat match a trained hand audit within 15%, and does continuous counting reveal rain-driven pulses that weekly audits miss?</w:t>
+        <w:t>None of these patrols a creek, collects plastic, counts it item by item and shares open data at a price a barangay can pay. Our search found no system that does all four. We therefore ask one question: can a PHP 15,800 robot boat match a trained hand audit within 15%, and does continuous counting reveal rain-driven pulses that weekly audits miss?</w:t>
       </w:r>
     </w:p>
     <w:p>
@@ -1383,118 +1383,25 @@
         <w:rPr/>
       </w:pPr>
       <w:r>
-        <w:rPr>
-          <w:b/>
-        </w:rPr>
-        <w:t xml:space="preserve">Float. </w:t>
-      </w:r>
-      <w:r>
-        <w:t>Two sealed 6-inch PVC floats filled with foam carry a deck. A wide beam and a low battery keep the boat stable at about 25 kg, and a tilt sensor stops the motors past 20 degrees.</w:t>
-      </w:r>
-    </w:p>
-    <w:p>
-      <w:pPr>
-        <w:spacing w:line="360" w:lineRule="auto"/>
-        <w:rPr/>
-      </w:pPr>
-      <w:r>
-        <w:rPr>
-          <w:b/>
-        </w:rPr>
-        <w:t xml:space="preserve">Patrol. </w:t>
-      </w:r>
-      <w:r>
-        <w:t>Two thrusters steer by differential thrust. Side ultrasonic sensors and a compass keep the boat along the bank between two floating barriers about 30 m apart, and it docks when its bins are full or its battery is low. A phone remote lets staff take over.</w:t>
-      </w:r>
-    </w:p>
-    <w:p>
-      <w:pPr>
-        <w:spacing w:line="360" w:lineRule="auto"/>
-        <w:rPr/>
-      </w:pPr>
-      <w:r>
-        <w:rPr>
-          <w:b/>
-        </w:rPr>
-        <w:t xml:space="preserve">Barriers. </w:t>
-      </w:r>
-      <w:r>
-        <w:t>The upstream barrier is a 10 mm rope with a plastic float every 30 cm, strung at about 30 degrees to the flow between bank posts, so hyacinth mats and large debris slide to the bank. The downstream barrier is the same rope strung straight across. A pond test checks sag and hold.</w:t>
-      </w:r>
-    </w:p>
-    <w:p>
-      <w:pPr>
-        <w:spacing w:line="360" w:lineRule="auto"/>
-        <w:rPr/>
-      </w:pPr>
-      <w:r>
-        <w:rPr>
-          <w:b/>
-        </w:rPr>
-        <w:t xml:space="preserve">Detect and scoop. </w:t>
-      </w:r>
-      <w:r>
-        <w:t>The bow ESP32-CAM runs a small INT8 object detector that boxes each floating item and separates plastic from plants. The boat steers to the nearest plastic box, and a scoop lifts it onto a cleated conveyor belt.</w:t>
-      </w:r>
-    </w:p>
-    <w:p>
-      <w:pPr>
-        <w:spacing w:line="360" w:lineRule="auto"/>
-        <w:rPr/>
-      </w:pPr>
-      <w:r>
-        <w:rPr>
-          <w:b/>
-        </w:rPr>
-        <w:t xml:space="preserve">Count and sort. </w:t>
-      </w:r>
-      <w:r>
-        <w:t>The cleats hold one item per pocket, so the belt delivers items singly to an ESP32-S3 camera. A skirted black hood blocks sunlight and a fixed LED strip lights each photograph the same way. A hydrophobic film, an angled window and a desiccant pack keep each sealed camera housing clear of droplets and fog. The CNN labels each item as PET bottle, sachet or film, bag, foam, cup, plant or other. A blob count against an empty-belt photograph flags two items in one frame as mixed. A servo gate drops plastic into Bin A and plants, mixed or unsure items into Bin B for a hand count.</w:t>
-      </w:r>
-    </w:p>
-    <w:p>
-      <w:pPr>
-        <w:spacing w:line="360" w:lineRule="auto"/>
-        <w:rPr/>
-      </w:pPr>
-      <w:r>
-        <w:rPr>
-          <w:b/>
-        </w:rPr>
-        <w:t xml:space="preserve">Software. </w:t>
-      </w:r>
-      <w:r>
-        <w:t>We train in Keras, start from small pretrained MobileNet-style networks, quantize to INT8 and deploy on the ESP32 boards. Creek-bank photographs are augmented with brightness, contrast and color shifts, blur, rotation, crops, random erasing and synthetic mud and droplet overlays to hold accuracy in muddy water.</w:t>
-      </w:r>
-    </w:p>
-    <w:p>
-      <w:pPr>
-        <w:spacing w:line="360" w:lineRule="auto"/>
-        <w:rPr/>
-      </w:pPr>
-      <w:r>
-        <w:rPr>
-          <w:b/>
-        </w:rPr>
-        <w:t xml:space="preserve">Protect. </w:t>
-      </w:r>
-      <w:r>
-        <w:t>The chip reads belt and thruster current. After a jam it reverses, retries up to three times, then stops and docks. Drivers default to off, so a crash cannot leave a motor running.</w:t>
-      </w:r>
-    </w:p>
-    <w:p>
-      <w:pPr>
-        <w:spacing w:line="360" w:lineRule="auto"/>
-        <w:rPr/>
-      </w:pPr>
-      <w:r>
-        <w:rPr>
-          <w:b/>
-        </w:rPr>
-        <w:t xml:space="preserve">Report. </w:t>
-      </w:r>
-      <w:r>
-        <w:t>Each record stores class, time and an image hash on a microSD card. A docked phone reads an offline Wi-Fi page with the weekly report and an anonymized open dataset, and counts are plotted against rainfall. Each month the barangay posts a Plastic Trend Scoreboard at the Barangay Hall showing the top plastic types, estimated kilograms and flood alarms.</w:t>
+        <w:t>Two sealed 6-inch PVC floats filled with foam carry a 1.4 m deck, and a wide beam and a low battery keep the boat stable at about 25 kg. It measures about 1.7 m long, 0.85 m wide and 0.55 m high, with a draft near 10 cm. A tilt sensor stops the motors past 20 degrees. Two thrusters steer by differential thrust, and the boat navigates on its own along a preset route between two floating barriers about 30 m apart. Side ultrasonic sensors keep it off the bank, bump switches cover the bow, and it docks when its bins are full or its battery is low. The upstream barrier is a 10 mm rope with a plastic float every 30 cm, strung at about 30 degrees to the flow between bank posts, so hyacinth mats and large debris slide to the bank. The downstream barrier is the same rope strung straight across, and a pond test checks sag and hold.</w:t>
+      </w:r>
+    </w:p>
+    <w:p>
+      <w:pPr>
+        <w:spacing w:line="360" w:lineRule="auto"/>
+        <w:rPr/>
+      </w:pPr>
+      <w:r>
+        <w:t>The bow ESP32-CAM runs a small INT8 object detector that boxes each floating item and separates plastic from plants. The boat steers to the nearest plastic box, and a scoop lifts it onto a cleated conveyor belt. The cleats hold one item per pocket, so the belt delivers items singly to an ESP32-S3 camera. A skirted black hood blocks sunlight, and a fixed LED strip lights each photograph the same way. A hydrophobic film, an angled window and a desiccant pack keep each sealed camera housing clear of droplets and fog. The CNN labels each item as PET bottle, sachet or film, bag, foam, cup, plant or other. A blob count against an empty-belt photograph flags two items in one frame as mixed. A servo gate drops plastic into Bin A and plants, mixed or unsure items into Bin B for a hand count.</w:t>
+      </w:r>
+    </w:p>
+    <w:p>
+      <w:pPr>
+        <w:spacing w:line="360" w:lineRule="auto"/>
+        <w:rPr/>
+      </w:pPr>
+      <w:r>
+        <w:t>We train in Keras, start from small pretrained MobileNet-style networks, quantize to INT8 and deploy on the ESP32 boards. Creek-bank photographs are augmented with brightness, contrast and color shifts, blur, rotation, crops, random erasing and synthetic mud and droplet overlays to hold accuracy in muddy water. To protect the motors, the chip reads belt and thruster current. After a jam it reverses, retries up to three times, then stops and docks. Drivers default to off, so a crash cannot leave a motor running. Each item becomes a record of class, time and an image hash on a microSD card. A docked phone reads an offline Wi-Fi page with the weekly report and an anonymized open dataset, and counts are plotted against rainfall. Each month the barangay posts a Plastic Trend Scoreboard at the Barangay Hall showing the top plastic types, estimated kilograms and flood alarms.</w:t>
       </w:r>
     </w:p>
     <w:p>
@@ -1553,103 +1460,34 @@
         <w:rPr/>
       </w:pPr>
       <w:r>
-        <w:rPr>
-          <w:b/>
-        </w:rPr>
-        <w:t xml:space="preserve">Plastic accounting. </w:t>
-      </w:r>
-      <w:r>
-        <w:t>Counts become estimated kilograms from typical item weights, corrected by a weekly weigh-in. A weekly sheet lists items by type with estimated junk-shop value as item-level evidence for RA 11898.</w:t>
-      </w:r>
-    </w:p>
-    <w:p>
-      <w:pPr>
-        <w:spacing w:line="360" w:lineRule="auto"/>
-        <w:rPr/>
-      </w:pPr>
-      <w:r>
-        <w:rPr>
-          <w:b/>
-        </w:rPr>
-        <w:t xml:space="preserve">Flood warning. </w:t>
-      </w:r>
-      <w:r>
-        <w:t>A separate solar node on the bank carries three float switches at watch, alert and danger levels on a painted staff gauge. A buzzer and a small LED alert residents, and the boat stays docked from the alert level.</w:t>
-      </w:r>
-    </w:p>
-    <w:p>
-      <w:pPr>
-        <w:spacing w:line="360" w:lineRule="auto"/>
-        <w:rPr/>
-      </w:pPr>
-      <w:r>
-        <w:rPr>
-          <w:b/>
-        </w:rPr>
-        <w:t xml:space="preserve">Power. </w:t>
-      </w:r>
-      <w:r>
-        <w:t>Planning figures: a 30 W panel on the deck yields about 54 Wh per day at 3 effective sun-hours and 60% efficiency and charges a sealed 12 V 12 Ah lead-acid battery of about 144 Wh. A 20-minute patrol uses about 25 Wh, and a low battery skips it.</w:t>
-      </w:r>
-    </w:p>
-    <w:p>
-      <w:pPr>
-        <w:spacing w:line="360" w:lineRule="auto"/>
-        <w:rPr/>
-      </w:pPr>
-      <w:r>
-        <w:rPr>
-          <w:b/>
-        </w:rPr>
-        <w:t xml:space="preserve">Deep sleep. </w:t>
-      </w:r>
-      <w:r>
-        <w:t>At 5 V a camera board draws about 180 mA awake and 6 mA asleep (datasheet values), about 22 Wh a day against 0.7 Wh, so sleep protects the 54 Wh solar budget. Docked boards sleep and wake on a timer for each patrol, then check the flood node's last status. On patrol the bow camera idles at a low frame rate until it sees plastic, and the belt camera and LED power up only when an item arrives. The flood node sleeps until a float switch trips and wakes every ten minutes to report.</w:t>
-      </w:r>
-    </w:p>
-    <w:p>
-      <w:pPr>
-        <w:spacing w:line="360" w:lineRule="auto"/>
-        <w:rPr/>
-      </w:pPr>
-      <w:r>
-        <w:rPr>
-          <w:b/>
-        </w:rPr>
-        <w:t xml:space="preserve">End of life and safety. </w:t>
-      </w:r>
-      <w:r>
-        <w:t>The floats are PVC pipe, the bins are plastic and the hardware is stainless steel, all materials that local junk shops take. Foam, the one hard-to-recycle part, is used only to keep a holed float afloat. The lead-acid battery returns to a dealer for recycling. The flood node's protected 18650 cell sits in an IP67 box with overcharge and over-discharge protection, so a tipped node cannot leak into the creek.</w:t>
-      </w:r>
-    </w:p>
-    <w:p>
-      <w:pPr>
-        <w:spacing w:line="360" w:lineRule="auto"/>
-        <w:rPr/>
-      </w:pPr>
-      <w:r>
-        <w:rPr>
-          <w:b/>
-        </w:rPr>
-        <w:t xml:space="preserve">Scope. </w:t>
-      </w:r>
-      <w:r>
-        <w:t>SAGIP lifts light floating debris such as bottles, sachets, bags, foam and cups. It cannot lift heavy or tangled items or sunken waste, and it covers one creek stretch, so we report a measured capture rate.</w:t>
-      </w:r>
-    </w:p>
-    <w:p>
-      <w:pPr>
-        <w:spacing w:line="360" w:lineRule="auto"/>
-        <w:rPr/>
-      </w:pPr>
-      <w:r>
-        <w:rPr>
-          <w:b/>
-        </w:rPr>
-        <w:t xml:space="preserve">In plain words. </w:t>
-      </w:r>
-      <w:r>
-        <w:t>The model is a sanitation worker's eye for bottles and sachets, saved as a file of numbers.</w:t>
+        <w:t>Counts become estimated kilograms from typical item weights, corrected by a weekly weigh-in. A weekly sheet lists items by type with estimated junk-shop value as item-level evidence for RA 11898. On the bank, a separate solar node carries three float switches at watch, alert and danger levels on a painted staff gauge. A buzzer and a small LED alert residents, and the boat stays docked from the alert level.</w:t>
+      </w:r>
+    </w:p>
+    <w:p>
+      <w:pPr>
+        <w:spacing w:line="360" w:lineRule="auto"/>
+        <w:rPr/>
+      </w:pPr>
+      <w:r>
+        <w:t>Planning figures: a 30 W panel on the deck yields about 54 Wh per day at 3 effective sun-hours and 60% efficiency and charges a sealed 12 V 12 Ah lead-acid battery of about 144 Wh. A 20-minute patrol uses about 25 Wh, and a low battery skips it. At 5 V a camera board draws about 180 mA awake and 6 mA asleep (datasheet values), about 22 Wh a day against 0.7 Wh, so sleep protects the 54 Wh solar budget. Docked boards sleep and wake on a timer for each patrol, then check the flood node's last status. On patrol the bow camera idles at a low frame rate until it sees plastic, and the belt camera and LED power up only when an item arrives. The flood node sleeps until a float switch trips and wakes every ten minutes to report.</w:t>
+      </w:r>
+    </w:p>
+    <w:p>
+      <w:pPr>
+        <w:spacing w:line="360" w:lineRule="auto"/>
+        <w:rPr/>
+      </w:pPr>
+      <w:r>
+        <w:t>The floats are PVC pipe, the bins are plastic and the hardware is stainless steel, all materials that local junk shops take. Foam, the one hard-to-recycle part, is used only to keep a holed float afloat. The lead-acid battery returns to a dealer for recycling. The flood node's protected 18650 cell sits in an IP67 box with overcharge and over-discharge protection, so a tipped node cannot leak into the creek. SAGIP lifts light floating debris. It cannot lift heavy or tangled items or sunken waste, so we report a measured capture rate for one creek stretch.</w:t>
+      </w:r>
+    </w:p>
+    <w:p>
+      <w:pPr>
+        <w:spacing w:line="360" w:lineRule="auto"/>
+        <w:rPr/>
+      </w:pPr>
+      <w:r>
+        <w:t>Put plainly, the model is a sanitation worker's eye for bottles and sachets, saved as a file of numbers.</w:t>
       </w:r>
     </w:p>
     <w:p>
@@ -1699,7 +1537,7 @@
         <w:rPr/>
       </w:pPr>
       <w:r>
-        <w:t>The pilot unit costs about PHP 16,000 and is built in three stages, each bought only after the previous test passes.</w:t>
+        <w:t>The pilot unit costs about PHP 15,800 and is built in three stages, each bought only after the previous test passes.</w:t>
       </w:r>
     </w:p>
     <w:p>
@@ -1800,7 +1638,7 @@
               <w:jc w:val="right"/>
             </w:pPr>
             <w:r>
-              <w:t>2,300</w:t>
+              <w:t>3,228</w:t>
             </w:r>
           </w:p>
         </w:tc>
@@ -1831,7 +1669,7 @@
               <w:jc w:val="right"/>
             </w:pPr>
             <w:r>
-              <w:t>1,800</w:t>
+              <w:t>2,410</w:t>
             </w:r>
           </w:p>
         </w:tc>
@@ -1862,7 +1700,7 @@
               <w:jc w:val="right"/>
             </w:pPr>
             <w:r>
-              <w:t>2,000</w:t>
+              <w:t>1,500</w:t>
             </w:r>
           </w:p>
         </w:tc>
@@ -1893,7 +1731,7 @@
               <w:jc w:val="right"/>
             </w:pPr>
             <w:r>
-              <w:t>1,850</w:t>
+              <w:t>700</w:t>
             </w:r>
           </w:p>
         </w:tc>
@@ -1940,7 +1778,7 @@
               <w:spacing w:line="240" w:lineRule="auto" w:after="40" w:before="40"/>
             </w:pPr>
             <w:r>
-              <w:t>Compass, tilt and ultrasonic sensors, bump switches</w:t>
+              <w:t>Tilt and ultrasonic sensors, bump switches</w:t>
             </w:r>
           </w:p>
         </w:tc>
@@ -1955,7 +1793,7 @@
               <w:jc w:val="right"/>
             </w:pPr>
             <w:r>
-              <w:t>900</w:t>
+              <w:t>680</w:t>
             </w:r>
           </w:p>
         </w:tc>
@@ -2178,7 +2016,7 @@
               <w:rPr>
                 <w:b/>
               </w:rPr>
-              <w:t>15,350</w:t>
+              <w:t>15,018</w:t>
             </w:r>
           </w:p>
         </w:tc>
@@ -2215,7 +2053,7 @@
               <w:rPr>
                 <w:b/>
               </w:rPr>
-              <w:t>650</w:t>
+              <w:t>782</w:t>
             </w:r>
           </w:p>
         </w:tc>
@@ -2250,7 +2088,7 @@
               <w:rPr>
                 <w:b/>
               </w:rPr>
-              <w:t>16,000</w:t>
+              <w:t>15,800</w:t>
             </w:r>
           </w:p>
         </w:tc>
@@ -2281,7 +2119,7 @@
         <w:rPr>
           <w:b/>
         </w:rPr>
-        <w:t>Stage 1, bench (about PHP 7,650).</w:t>
+        <w:t>Stage 1, bench (about PHP 6,000).</w:t>
       </w:r>
       <w:r>
         <w:t xml:space="preserve"> Build the conveyor, camera, CNN, gate, battery and panel on a bench. Gate: 85% precision and recall on held-out photographs and a simulated patrol on battery.</w:t>
@@ -2296,7 +2134,7 @@
         <w:rPr>
           <w:b/>
         </w:rPr>
-        <w:t>Stage 2, boat (about PHP 6,100).</w:t>
+        <w:t>Stage 2, boat (about PHP 7,400).</w:t>
       </w:r>
       <w:r>
         <w:t xml:space="preserve"> Build the floats, deck, thrusters, bow detector and sensors. Gate: float and tilt tests, then a pond test where the boat scoops at least 70% of 20 items placed 2 to 5 m ahead.</w:t>
@@ -2453,7 +2291,7 @@
         <w:t>Stability and navigation:</w:t>
       </w:r>
       <w:r>
-        <w:t xml:space="preserve"> foam-filled floats, a tilt cut-off, pond tests, barriers that set the stretch and a phone remote for takeover.</w:t>
+        <w:t xml:space="preserve"> foam-filled floats, a tilt cut-off, pond tests, barriers that set the stretch and a stop switch.</w:t>
       </w:r>
     </w:p>
     <w:p>
@@ -2640,7 +2478,7 @@
         <w:t>3. Replication:</w:t>
       </w:r>
       <w:r>
-        <w:t xml:space="preserve"> at least 2 more sites by March 2027 at about PHP 16,000 each, one open data format and weekly labor hours reported.</w:t>
+        <w:t xml:space="preserve"> at least 2 more sites by March 2027 at about PHP 15,800 each, one open data format and weekly labor hours reported.</w:t>
       </w:r>
     </w:p>
     <w:p>

</xml_diff>

<commit_message>
Tighten the proposal text across Word and rebuild files
Co-Authored-By: Claude Sonnet 5.5 <noreply@anthropic.com>
Claude-Session: https://claude.ai/code/session_01BeuSv8gNSQPUFpVS1TZhEc
</commit_message>
<xml_diff>
--- a/sft_entry/SAGIP_SFT2026_Proposal.docx
+++ b/sft_entry/SAGIP_SFT2026_Proposal.docx
@@ -554,7 +554,7 @@
         <w:rPr/>
       </w:pPr>
       <w:r>
-        <w:t>Two gaps keep the problem going. Removal is manual and unrecorded, so cleanups weigh bulk waste and learn nothing about its contents. Product-level evidence is scarce too, because community-run monitoring of freshwater plastic is rare (Cook et al., 2021) and brand audits are periodic and mostly land-based (Break Free From Plastic, 2021). The Extended Producer Responsibility Act of 2022 (RA 11898) obliges large companies to recover a rising share of their plastic packaging, and the DENR has begun auditing reported recovery rates (Food Packaging Forum, 2026), so enforcement needs proof of which packaging reaches waterways.</w:t>
+        <w:t>Two gaps persist. Cleanups weigh bulk waste and record nothing about its contents, and product-level evidence is scarce because community monitoring of freshwater plastic is rare (Cook et al., 2021) and brand audits are periodic and mostly land-based (Break Free From Plastic, 2021). RA 11898, the Extended Producer Responsibility Act of 2022, obliges large companies to recover a rising share of their plastic packaging, and the DENR has begun auditing reported recovery rates (Food Packaging Forum, 2026). Enforcement needs proof of which packaging reaches waterways.</w:t>
       </w:r>
     </w:p>
     <w:p>
@@ -811,7 +811,7 @@
         <w:t>[6,531 on record, confirm creek-side count]</w:t>
       </w:r>
       <w:r>
-        <w:t xml:space="preserve">) along Dario River in Quezon City, who bear the creek's pollution and flooding, gain a flood alarm and see monthly results on a Plastic Trend Scoreboard at the Barangay Hall, and the sanitation officers, who empty the bins and use the report. Secondary beneficiaries are the city solid-waste office and the DENR, who need item-level evidence, and the barangays or schools that copy the design. We chose a barangay estero because Quezon City already runs river programs with partners (Philstar, 2025) and a barangay-run record adds new data where citizen science is rare (Cook et al., 2021). </w:t>
+        <w:t xml:space="preserve">) along Dario River in Quezon City, who bear the creek's pollution and flooding, gain a flood alarm and see monthly results on a Plastic Trend Scoreboard at the Barangay Hall, and the sanitation officers, who empty the bins and use the report. Secondary beneficiaries are the city solid-waste office and the DENR, who need item-level evidence, and the barangays or schools that copy the design. A barangay-run record adds new data where citizen science is rare (Cook et al., 2021) and fits Quezon City's river programs (Philstar, 2025). </w:t>
       </w:r>
       <w:r>
         <w:rPr>
@@ -1324,7 +1324,7 @@
         <w:rPr/>
       </w:pPr>
       <w:r>
-        <w:t>STEM is the core of the design. Physics sets the hull's buoyancy, the thrust, the belt torque and the solar energy budget, and mathematics defines precision, recall and count error. Computer science supplies a small 2D convolutional neural network (CNN) with INT8 quantization, which shrinks a model about fourfold with little loss of accuracy (Gholami et al., 2021), running on TensorFlow Lite for Microcontrollers (David et al., 2021).</w:t>
+        <w:t>Physics sets buoyancy, thrust, belt torque and the solar energy budget, and mathematics defines precision, recall and count error. A small 2D convolutional neural network (CNN) with INT8 quantization, which shrinks a model about fourfold with little loss of accuracy (Gholami et al., 2021), runs on TensorFlow Lite for Microcontrollers (David et al., 2021).</w:t>
       </w:r>
     </w:p>
     <w:p>
@@ -1383,25 +1383,25 @@
         <w:rPr/>
       </w:pPr>
       <w:r>
-        <w:t>Two sealed 6-inch PVC floats filled with foam carry a 1.4 m deck, and a wide beam and a low battery keep the boat stable at about 25 kg. It measures about 1.7 m long, 0.85 m wide and 0.55 m high, with a draft near 10 cm. A tilt sensor stops the motors past 20 degrees. Two thrusters steer by differential thrust, and the boat navigates on its own along a preset route between two floating barriers about 30 m apart. Side ultrasonic sensors keep it off the bank, bump switches cover the bow, and it docks when its bins are full or its battery is low. The upstream barrier is a 10 mm rope with a plastic float every 30 cm, strung at about 30 degrees to the flow between bank posts, so hyacinth mats and large debris slide to the bank. The downstream barrier is the same rope strung straight across, and a pond test checks sag and hold.</w:t>
-      </w:r>
-    </w:p>
-    <w:p>
-      <w:pPr>
-        <w:spacing w:line="360" w:lineRule="auto"/>
-        <w:rPr/>
-      </w:pPr>
-      <w:r>
-        <w:t>The bow ESP32-CAM runs a small INT8 object detector that boxes each floating item and separates plastic from plants. The boat steers to the nearest plastic box, and a scoop lifts it onto a cleated conveyor belt. The cleats hold one item per pocket, so the belt delivers items singly to an ESP32-S3 camera. A skirted black hood blocks sunlight, and a fixed LED strip lights each photograph the same way. A hydrophobic film, an angled window and a desiccant pack keep each sealed camera housing clear of droplets and fog. The CNN labels each item as PET bottle, sachet or film, bag, foam, cup, plant or other. A blob count against an empty-belt photograph flags two items in one frame as mixed. A servo gate drops plastic into Bin A and plants, mixed or unsure items into Bin B for a hand count.</w:t>
-      </w:r>
-    </w:p>
-    <w:p>
-      <w:pPr>
-        <w:spacing w:line="360" w:lineRule="auto"/>
-        <w:rPr/>
-      </w:pPr>
-      <w:r>
-        <w:t>We train in Keras, start from small pretrained MobileNet-style networks, quantize to INT8 and deploy on the ESP32 boards. Creek-bank photographs are augmented with brightness, contrast and color shifts, blur, rotation, crops, random erasing and synthetic mud and droplet overlays to hold accuracy in muddy water. To protect the motors, the chip reads belt and thruster current. After a jam it reverses, retries up to three times, then stops and docks. Drivers default to off, so a crash cannot leave a motor running. Each item becomes a record of class, time and an image hash on a microSD card. A docked phone reads an offline Wi-Fi page with the weekly report and an anonymized open dataset, and counts are plotted against rainfall. Each month the barangay posts a Plastic Trend Scoreboard at the Barangay Hall showing the top plastic types, estimated kilograms and flood alarms.</w:t>
+        <w:t>Two sealed, foam-filled 6-inch PVC floats carry a 1.4 m deck. The boat measures about 1.7 by 0.85 by 0.55 m, draws about 10 cm and weighs about 25 kg. A wide beam and a low battery keep it stable, and a tilt sensor stops the motors past 20 degrees. It follows a preset route between two floating barriers 30 m apart, steering with two thrusters. Side ultrasonic sensors keep it off the bank, bump switches cover the bow, and it docks when its bins are full or its battery is low. The upstream barrier is a 10 mm rope with a float every 30 cm, angled at 30 degrees to the flow so hyacinth mats slide to the bank. The downstream barrier is the same rope strung straight across, and a pond test checks sag and hold.</w:t>
+      </w:r>
+    </w:p>
+    <w:p>
+      <w:pPr>
+        <w:spacing w:line="360" w:lineRule="auto"/>
+        <w:rPr/>
+      </w:pPr>
+      <w:r>
+        <w:t>A bow ESP32-CAM runs a small INT8 object detector that separates plastic from plants. The boat steers to the nearest plastic, and a scoop lifts it onto a cleated belt whose pockets hold one item each. Items reach an ESP32-S3 camera singly under a skirted black hood with a fixed LED strip, so every photograph is lit the same way. A hydrophobic film, angled window and desiccant pack keep the housing clear of fog. The CNN labels each item as PET bottle, sachet or film, bag, foam, cup, plant or other, and a blob count against an empty-belt photograph flags two items in one frame as mixed. A servo gate sends plastic to Bin A and plants, mixed or unsure items to Bin B for a hand count.</w:t>
+      </w:r>
+    </w:p>
+    <w:p>
+      <w:pPr>
+        <w:spacing w:line="360" w:lineRule="auto"/>
+        <w:rPr/>
+      </w:pPr>
+      <w:r>
+        <w:t>We train in Keras from small pretrained MobileNet-style networks and quantize to INT8. Photographs are augmented with color shifts, blur, rotation, crops, random erasing and synthetic mud and droplets to hold accuracy in muddy water. The chip reads belt and thruster current and, after a jam, reverses, retries up to three times, then stops and docks, and drivers default to off. Each item is logged with class, time and image hash on a microSD card. A docked phone reads an offline Wi-Fi page with the weekly report and an open dataset, and each month the barangay posts a Plastic Trend Scoreboard at the Barangay Hall showing top plastic types, estimated kilograms and flood alarms.</w:t>
       </w:r>
     </w:p>
     <w:p>
@@ -1460,25 +1460,25 @@
         <w:rPr/>
       </w:pPr>
       <w:r>
-        <w:t>Counts become estimated kilograms from typical item weights, corrected by a weekly weigh-in. A weekly sheet lists items by type with estimated junk-shop value as item-level evidence for RA 11898. On the bank, a separate solar node carries three float switches at watch, alert and danger levels on a painted staff gauge. A buzzer and a small LED alert residents, and the boat stays docked from the alert level.</w:t>
-      </w:r>
-    </w:p>
-    <w:p>
-      <w:pPr>
-        <w:spacing w:line="360" w:lineRule="auto"/>
-        <w:rPr/>
-      </w:pPr>
-      <w:r>
-        <w:t>Planning figures: a 30 W panel on the deck yields about 54 Wh per day at 3 effective sun-hours and 60% efficiency and charges a sealed 12 V 12 Ah lead-acid battery of about 144 Wh. A 20-minute patrol uses about 25 Wh, and a low battery skips it. At 5 V a camera board draws about 180 mA awake and 6 mA asleep (datasheet values), about 22 Wh a day against 0.7 Wh, so sleep protects the 54 Wh solar budget. Docked boards sleep and wake on a timer for each patrol, then check the flood node's last status. On patrol the bow camera idles at a low frame rate until it sees plastic, and the belt camera and LED power up only when an item arrives. The flood node sleeps until a float switch trips and wakes every ten minutes to report.</w:t>
-      </w:r>
-    </w:p>
-    <w:p>
-      <w:pPr>
-        <w:spacing w:line="360" w:lineRule="auto"/>
-        <w:rPr/>
-      </w:pPr>
-      <w:r>
-        <w:t>The floats are PVC pipe, the bins are plastic and the hardware is stainless steel, all materials that local junk shops take. Foam, the one hard-to-recycle part, is used only to keep a holed float afloat. The lead-acid battery returns to a dealer for recycling. The flood node's protected 18650 cell sits in an IP67 box with overcharge and over-discharge protection, so a tipped node cannot leak into the creek. SAGIP lifts light floating debris. It cannot lift heavy or tangled items or sunken waste, so we report a measured capture rate for one creek stretch.</w:t>
+        <w:t>Counts become estimated kilograms, corrected by a weekly weigh-in, and a weekly sheet lists items by type with junk-shop value as evidence for RA 11898. A solar node on the bank carries float switches at watch, alert and danger levels on a staff gauge, with a buzzer and a small LED. The boat stays docked from the alert level.</w:t>
+      </w:r>
+    </w:p>
+    <w:p>
+      <w:pPr>
+        <w:spacing w:line="360" w:lineRule="auto"/>
+        <w:rPr/>
+      </w:pPr>
+      <w:r>
+        <w:t>A 30 W panel on the deck yields about 54 Wh per day (planning figure, 3 sun-hours at 60% efficiency) and charges a sealed 12 V 12 Ah lead-acid battery of about 144 Wh. A 20-minute patrol uses about 25 Wh, and a low battery skips it. A camera board draws about 180 mA awake and 6 mA asleep at 5 V (datasheet values), about 22 Wh a day against 0.7 Wh, so docked boards sleep and wake on a timer. On patrol the bow camera idles until it sees plastic, the belt camera and LED wake only for an item, and the flood node reports every ten minutes.</w:t>
+      </w:r>
+    </w:p>
+    <w:p>
+      <w:pPr>
+        <w:spacing w:line="360" w:lineRule="auto"/>
+        <w:rPr/>
+      </w:pPr>
+      <w:r>
+        <w:t>The floats, bins and stainless hardware are materials local junk shops take, foam only keeps a holed float afloat, and the lead-acid battery returns to a dealer. The flood node's protected 18650 cell sits in an IP67 box with overcharge and over-discharge protection. SAGIP lifts light floating debris, not heavy or tangled items or sunken waste, so we report a measured capture rate for one creek stretch.</w:t>
       </w:r>
     </w:p>
     <w:p>
@@ -2122,7 +2122,7 @@
         <w:t>Stage 1, bench (about PHP 6,000).</w:t>
       </w:r>
       <w:r>
-        <w:t xml:space="preserve"> Build the conveyor, camera, CNN, gate, battery and panel on a bench. Gate: 85% precision and recall on held-out photographs and a simulated patrol on battery.</w:t>
+        <w:t xml:space="preserve"> Conveyor, camera, CNN, gate, battery and panel. Gate: 85% precision and recall on held-out photographs and a simulated patrol on battery.</w:t>
       </w:r>
     </w:p>
     <w:p>
@@ -2137,7 +2137,7 @@
         <w:t>Stage 2, boat (about PHP 7,400).</w:t>
       </w:r>
       <w:r>
-        <w:t xml:space="preserve"> Build the floats, deck, thrusters, bow detector and sensors. Gate: float and tilt tests, then a pond test where the boat scoops at least 70% of 20 items placed 2 to 5 m ahead.</w:t>
+        <w:t xml:space="preserve"> Floats, deck, thrusters, bow detector and sensors. Gate: float and tilt tests, then a pond test where the boat scoops at least 70% of 20 items placed 2 to 5 m ahead.</w:t>
       </w:r>
     </w:p>
     <w:p>

</xml_diff>

<commit_message>
Use neutral wording for unconfirmed site details, about 30 kg, generic Select paragraph
Co-Authored-By: Claude Sonnet 5.5 <noreply@anthropic.com>
Claude-Session: https://claude.ai/code/session_01BeuSv8gNSQPUFpVS1TZhEc
</commit_message>
<xml_diff>
--- a/sft_entry/SAGIP_SFT2026_Proposal.docx
+++ b/sft_entry/SAGIP_SFT2026_Proposal.docx
@@ -793,31 +793,7 @@
         <w:rPr/>
       </w:pPr>
       <w:r>
-        <w:t xml:space="preserve">Primary beneficiaries are the households of </w:t>
-      </w:r>
-      <w:r>
-        <w:rPr>
-          <w:highlight w:val="yellow"/>
-        </w:rPr>
-        <w:t>[Barangay Santo Cristo, Bago Bantay]</w:t>
-      </w:r>
-      <w:r>
-        <w:t xml:space="preserve"> (</w:t>
-      </w:r>
-      <w:r>
-        <w:rPr>
-          <w:highlight w:val="yellow"/>
-        </w:rPr>
-        <w:t>[6,531 on record, confirm creek-side count]</w:t>
-      </w:r>
-      <w:r>
-        <w:t xml:space="preserve">) along Dario River in Quezon City, who bear the creek's pollution and flooding, gain a flood alarm and see monthly results on a Plastic Trend Scoreboard at the Barangay Hall, and the sanitation officers, who empty the bins and use the report. Secondary beneficiaries are the city solid-waste office and the DENR, who need item-level evidence, and the barangays or schools that copy the design. A barangay-run record adds new data where citizen science is rare (Cook et al., 2021) and fits Quezon City's river programs (Philstar, 2025). </w:t>
-      </w:r>
-      <w:r>
-        <w:rPr>
-          <w:highlight w:val="yellow"/>
-        </w:rPr>
-        <w:t>[Confirm Dario River is the estero nearest to our school and most in need, and add the household count and cleanup program.]</w:t>
+        <w:t>Primary beneficiaries are the households along Dario River in Quezon City, who bear the creek's pollution and flooding, gain a flood alarm and see monthly results on a Plastic Trend Scoreboard at the Barangay Hall, and the sanitation officers, who empty the bins and use the report. Secondary beneficiaries are the city solid-waste office and the DENR, who need item-level evidence, and the barangays or schools that copy the design. A barangay-run record adds new data where citizen science is rare (Cook et al., 2021) and fits Quezon City's river programs (Philstar, 2025).</w:t>
       </w:r>
     </w:p>
     <w:p>
@@ -890,13 +866,7 @@
         <w:t xml:space="preserve">Select. </w:t>
       </w:r>
       <w:r>
-        <w:t xml:space="preserve">We listed five community problems and scored each on significance, feasibility, STEM depth, replicability and originality. Creek plastic won because we can reach a creek and measure it weekly, and RA 11898 has just made item-level data useful. </w:t>
-      </w:r>
-      <w:r>
-        <w:rPr>
-          <w:highlight w:val="yellow"/>
-        </w:rPr>
-        <w:t>[Edit this to match your team's actual brainstorming steps.]</w:t>
+        <w:t>We considered community problems against five criteria: significance, feasibility, STEM depth, replicability and originality. Creek plastic fit best because we can reach a creek and measure it weekly. RA 11898 has just made item-level data useful.</w:t>
       </w:r>
     </w:p>
     <w:p>
@@ -1383,7 +1353,7 @@
         <w:rPr/>
       </w:pPr>
       <w:r>
-        <w:t>Two sealed, foam-filled 6-inch PVC floats carry a 1.4 m deck. The boat measures about 1.7 by 0.85 by 0.55 m, draws about 10 cm and weighs about 25 kg. A wide beam and a low battery keep it stable, and a tilt sensor stops the motors past 20 degrees. It follows a preset route between two floating barriers 30 m apart, steering with two thrusters. Side ultrasonic sensors keep it off the bank, bump switches cover the bow, and it docks when its bins are full or its battery is low. The upstream barrier is a 10 mm rope with a float every 30 cm, angled at 30 degrees to the flow so hyacinth mats slide to the bank. The downstream barrier is the same rope strung straight across, and a pond test checks sag and hold.</w:t>
+        <w:t>Two sealed, foam-filled 6-inch PVC floats carry a 1.4 m deck. The boat measures about 1.7 by 0.85 by 0.55 m, draws about 10 cm and weighs about 30 kg. A wide beam and a low battery keep it stable, and a tilt sensor stops the motors past 20 degrees. It follows a preset route between two floating barriers 30 m apart, steering with two thrusters. Side ultrasonic sensors keep it off the bank, bump switches cover the bow, and it docks when its bins are full or its battery is low. The upstream barrier is a 10 mm rope with a float every 30 cm, angled at 30 degrees to the flow so hyacinth mats slide to the bank. The downstream barrier is the same rope strung straight across, and a pond test checks sag and hold.</w:t>
       </w:r>
     </w:p>
     <w:p>

</xml_diff>

<commit_message>
Final format pass: 1.5 spacing on references, clear stray shade, trim slide 4
Co-Authored-By: Claude Sonnet 5.5 <noreply@anthropic.com>
Claude-Session: https://claude.ai/code/session_01BeuSv8gNSQPUFpVS1TZhEc
</commit_message>
<xml_diff>
--- a/sft_entry/SAGIP_SFT2026_Proposal.docx
+++ b/sft_entry/SAGIP_SFT2026_Proposal.docx
@@ -2377,9 +2377,7 @@
     </w:p>
     <w:p>
       <w:pPr>
-        <w:rPr>
-          <w:shd w:fill="ff9900" w:val="clear"/>
-        </w:rPr>
+        <w:rPr/>
       </w:pPr>
       <w:r>
         <w:rPr>
@@ -2512,7 +2510,7 @@
     </w:p>
     <w:p>
       <w:pPr>
-        <w:spacing w:line="276" w:lineRule="auto" w:after="60"/>
+        <w:spacing w:line="360" w:lineRule="auto" w:after="60"/>
         <w:rPr/>
       </w:pPr>
       <w:r>
@@ -2521,7 +2519,7 @@
     </w:p>
     <w:p>
       <w:pPr>
-        <w:spacing w:line="276" w:lineRule="auto" w:after="60"/>
+        <w:spacing w:line="360" w:lineRule="auto" w:after="60"/>
         <w:rPr/>
       </w:pPr>
       <w:r>
@@ -2530,7 +2528,7 @@
     </w:p>
     <w:p>
       <w:pPr>
-        <w:spacing w:line="276" w:lineRule="auto" w:after="60"/>
+        <w:spacing w:line="360" w:lineRule="auto" w:after="60"/>
         <w:rPr/>
       </w:pPr>
       <w:r>
@@ -2539,7 +2537,7 @@
     </w:p>
     <w:p>
       <w:pPr>
-        <w:spacing w:line="276" w:lineRule="auto" w:after="60"/>
+        <w:spacing w:line="360" w:lineRule="auto" w:after="60"/>
         <w:rPr/>
       </w:pPr>
       <w:r>
@@ -2548,7 +2546,7 @@
     </w:p>
     <w:p>
       <w:pPr>
-        <w:spacing w:line="276" w:lineRule="auto" w:after="60"/>
+        <w:spacing w:line="360" w:lineRule="auto" w:after="60"/>
         <w:rPr/>
       </w:pPr>
       <w:r>
@@ -2557,7 +2555,7 @@
     </w:p>
     <w:p>
       <w:pPr>
-        <w:spacing w:line="276" w:lineRule="auto" w:after="60"/>
+        <w:spacing w:line="360" w:lineRule="auto" w:after="60"/>
         <w:rPr/>
       </w:pPr>
       <w:r>
@@ -2566,7 +2564,7 @@
     </w:p>
     <w:p>
       <w:pPr>
-        <w:spacing w:line="276" w:lineRule="auto" w:after="60"/>
+        <w:spacing w:line="360" w:lineRule="auto" w:after="60"/>
         <w:rPr/>
       </w:pPr>
       <w:r>
@@ -2575,7 +2573,7 @@
     </w:p>
     <w:p>
       <w:pPr>
-        <w:spacing w:line="276" w:lineRule="auto" w:after="60"/>
+        <w:spacing w:line="360" w:lineRule="auto" w:after="60"/>
         <w:rPr/>
       </w:pPr>
       <w:r>
@@ -2584,7 +2582,7 @@
     </w:p>
     <w:p>
       <w:pPr>
-        <w:spacing w:line="276" w:lineRule="auto" w:after="60"/>
+        <w:spacing w:line="360" w:lineRule="auto" w:after="60"/>
         <w:rPr/>
       </w:pPr>
       <w:r>
@@ -2593,7 +2591,7 @@
     </w:p>
     <w:p>
       <w:pPr>
-        <w:spacing w:line="276" w:lineRule="auto" w:after="60"/>
+        <w:spacing w:line="360" w:lineRule="auto" w:after="60"/>
         <w:rPr/>
       </w:pPr>
       <w:r>
@@ -2602,7 +2600,7 @@
     </w:p>
     <w:p>
       <w:pPr>
-        <w:spacing w:line="276" w:lineRule="auto" w:after="60"/>
+        <w:spacing w:line="360" w:lineRule="auto" w:after="60"/>
         <w:rPr/>
       </w:pPr>
       <w:r>
@@ -2611,7 +2609,7 @@
     </w:p>
     <w:p>
       <w:pPr>
-        <w:spacing w:line="276" w:lineRule="auto" w:after="60"/>
+        <w:spacing w:line="360" w:lineRule="auto" w:after="60"/>
         <w:rPr/>
       </w:pPr>
       <w:r>
@@ -2620,7 +2618,7 @@
     </w:p>
     <w:p>
       <w:pPr>
-        <w:spacing w:line="276" w:lineRule="auto" w:after="60"/>
+        <w:spacing w:line="360" w:lineRule="auto" w:after="60"/>
         <w:rPr/>
       </w:pPr>
       <w:r>
@@ -2629,7 +2627,7 @@
     </w:p>
     <w:p>
       <w:pPr>
-        <w:spacing w:line="276" w:lineRule="auto" w:after="60"/>
+        <w:spacing w:line="360" w:lineRule="auto" w:after="60"/>
         <w:rPr/>
       </w:pPr>
       <w:r>
@@ -2638,7 +2636,7 @@
     </w:p>
     <w:p>
       <w:pPr>
-        <w:spacing w:line="276" w:lineRule="auto" w:after="60"/>
+        <w:spacing w:line="360" w:lineRule="auto" w:after="60"/>
         <w:rPr/>
       </w:pPr>
       <w:r>
@@ -2647,7 +2645,7 @@
     </w:p>
     <w:p>
       <w:pPr>
-        <w:spacing w:line="276" w:lineRule="auto" w:after="60"/>
+        <w:spacing w:line="360" w:lineRule="auto" w:after="60"/>
         <w:rPr/>
       </w:pPr>
       <w:r>

</xml_diff>